<commit_message>
added ieee csl with clickable citation
</commit_message>
<xml_diff>
--- a/_includes/projects/motor/output/motor.docx
+++ b/_includes/projects/motor/output/motor.docx
@@ -77,7 +77,18 @@
         <w:t xml:space="preserve"> </w:t>
       </w:r>
       <w:r>
-        <w:t xml:space="preserve">(Kalouche 2016)</w:t>
+        <w:t xml:space="preserve">[</w:t>
+      </w:r>
+      <w:hyperlink w:anchor="ref-kalouche_design_2016">
+        <w:r>
+          <w:rPr>
+            <w:rStyle w:val="Hyperlink"/>
+          </w:rPr>
+          <w:t xml:space="preserve">1</w:t>
+        </w:r>
+      </w:hyperlink>
+      <w:r>
+        <w:t xml:space="preserve">]</w:t>
       </w:r>
     </w:p>
     <w:p>
@@ -98,7 +109,18 @@
         <w:t xml:space="preserve">His work was based on coltion.</w:t>
       </w:r>
       <w:r>
-        <w:t xml:space="preserve">(Colton 2010)</w:t>
+        <w:t xml:space="preserve">[</w:t>
+      </w:r>
+      <w:hyperlink w:anchor="ref-colton_design_2010">
+        <w:r>
+          <w:rPr>
+            <w:rStyle w:val="Hyperlink"/>
+          </w:rPr>
+          <w:t xml:space="preserve">2</w:t>
+        </w:r>
+      </w:hyperlink>
+      <w:r>
+        <w:t xml:space="preserve">]</w:t>
       </w:r>
     </w:p>
     <w:p>
@@ -321,18 +343,31 @@
       <w:bookmarkEnd w:id="22"/>
     </w:p>
     <w:bookmarkStart w:id="26" w:name="refs"/>
-    <w:bookmarkStart w:id="24" w:name="ref-colton_design_2010"/>
+    <w:bookmarkStart w:id="23" w:name="ref-kalouche_design_2016"/>
     <w:p>
       <w:pPr>
         <w:pStyle w:val="Bibliography"/>
       </w:pPr>
       <w:r>
-        <w:t xml:space="preserve">Colton, Shane W. (Shane William). 2010. “Design and Prototyping Methods for Brushless Motors and Motor Control.” Thesis, Massachusetts Institute of Technology.</w:t>
+        <w:t xml:space="preserve">[1] S. Kalouche, “DESIGN FOR 3D AGILITY AND VIRTUAL COMPLIANCE USING PROPRIOCEPTIVE FORCE CONTROL IN DYNAMIC LEGGED ROBOTS,” PhD thesis, CARNEGIE MELLON UNIVERSITY, 2016.</w:t>
       </w:r>
       <w:r>
         <w:t xml:space="preserve"> </w:t>
       </w:r>
-      <w:hyperlink r:id="rId23">
+    </w:p>
+    <w:bookmarkEnd w:id="23"/>
+    <w:bookmarkStart w:id="25" w:name="ref-colton_design_2010"/>
+    <w:p>
+      <w:pPr>
+        <w:pStyle w:val="Bibliography"/>
+      </w:pPr>
+      <w:r>
+        <w:t xml:space="preserve">[2] S. W. (. W. Colton, “Design and prototyping methods for brushless motors and motor control,” Thesis, Massachusetts Institute of Technology, 2010 [Online]. Available:</w:t>
+      </w:r>
+      <w:r>
+        <w:t xml:space="preserve"> </w:t>
+      </w:r>
+      <w:hyperlink r:id="rId24">
         <w:r>
           <w:rPr>
             <w:rStyle w:val="Hyperlink"/>
@@ -341,17 +376,7 @@
         </w:r>
       </w:hyperlink>
       <w:r>
-        <w:t xml:space="preserve">.</w:t>
-      </w:r>
-    </w:p>
-    <w:bookmarkEnd w:id="24"/>
-    <w:bookmarkStart w:id="25" w:name="ref-kalouche_design_2016"/>
-    <w:p>
-      <w:pPr>
-        <w:pStyle w:val="Bibliography"/>
-      </w:pPr>
-      <w:r>
-        <w:t xml:space="preserve">Kalouche, Simon. 2016. “DESIGN FOR 3D AGILITY AND VIRTUAL COMPLIANCE USING PROPRIOCEPTIVE FORCE CONTROL IN DYNAMIC LEGGED ROBOTS.” PhD thesis, CARNEGIE MELLON UNIVERSITY.</w:t>
+        <w:t xml:space="preserve">. [Accessed: 23-Aug-2018]</w:t>
       </w:r>
     </w:p>
     <w:bookmarkEnd w:id="25"/>

</xml_diff>

<commit_message>
arg! what you want
</commit_message>
<xml_diff>
--- a/_includes/projects/motor/output/motor.docx
+++ b/_includes/projects/motor/output/motor.docx
@@ -116,7 +116,7 @@
     </w:p>
     <w:p>
       <w:pPr>
-        <w:pStyle w:val="Heading3"/>
+        <w:pStyle w:val="Heading4"/>
       </w:pPr>
       <w:bookmarkStart w:id="22" w:name="basic-terminology"/>
       <w:r>
@@ -284,7 +284,7 @@
     </w:p>
     <w:p>
       <w:pPr>
-        <w:pStyle w:val="Heading3"/>
+        <w:pStyle w:val="Heading4"/>
       </w:pPr>
       <w:bookmarkStart w:id="27" w:name="winding-configuration"/>
       <w:r>

</xml_diff>

<commit_message>
added h2 css for left aligh
</commit_message>
<xml_diff>
--- a/_includes/projects/motor/output/motor.docx
+++ b/_includes/projects/motor/output/motor.docx
@@ -39,6 +39,12 @@
       <w:r>
         <w:t xml:space="preserve">Motor</w:t>
       </w:r>
+      <w:r>
+        <w:t xml:space="preserve"> </w:t>
+      </w:r>
+      <w:r>
+        <w:t xml:space="preserve">%</w:t>
+      </w:r>
     </w:p>
     <w:p>
       <w:pPr>
@@ -53,6 +59,12 @@
       <w:r>
         <w:t xml:space="preserve">G</w:t>
       </w:r>
+      <w:r>
+        <w:t xml:space="preserve"> </w:t>
+      </w:r>
+      <w:r>
+        <w:t xml:space="preserve">%</w:t>
+      </w:r>
     </w:p>
     <w:p>
       <w:pPr>
@@ -72,6 +84,12 @@
       </w:r>
       <w:r>
         <w:t xml:space="preserve">2018</w:t>
+      </w:r>
+      <w:r>
+        <w:t xml:space="preserve"> </w:t>
+      </w:r>
+      <w:r>
+        <w:t xml:space="preserve">%</w:t>
       </w:r>
     </w:p>
     <w:p>

</xml_diff>

<commit_message>
website template almost complete
</commit_message>
<xml_diff>
--- a/_includes/projects/motor/output/motor.docx
+++ b/_includes/projects/motor/output/motor.docx
@@ -38,40 +38,6 @@
       </w:r>
       <w:r>
         <w:t xml:space="preserve">Motor</w:t>
-      </w:r>
-    </w:p>
-    <w:p>
-      <w:pPr>
-        <w:pStyle w:val="Author"/>
-      </w:pPr>
-      <w:r>
-        <w:t xml:space="preserve">Ajay</w:t>
-      </w:r>
-      <w:r>
-        <w:t xml:space="preserve"> </w:t>
-      </w:r>
-      <w:r>
-        <w:t xml:space="preserve">G</w:t>
-      </w:r>
-    </w:p>
-    <w:p>
-      <w:pPr>
-        <w:pStyle w:val="Date"/>
-      </w:pPr>
-      <w:r>
-        <w:t xml:space="preserve">August</w:t>
-      </w:r>
-      <w:r>
-        <w:t xml:space="preserve"> </w:t>
-      </w:r>
-      <w:r>
-        <w:t xml:space="preserve">24,</w:t>
-      </w:r>
-      <w:r>
-        <w:t xml:space="preserve"> </w:t>
-      </w:r>
-      <w:r>
-        <w:t xml:space="preserve">2018</w:t>
       </w:r>
     </w:p>
     <w:p>

</xml_diff>

<commit_message>
motor 50% of rough drfat compelete
</commit_message>
<xml_diff>
--- a/_includes/projects/motor/output/motor.docx
+++ b/_includes/projects/motor/output/motor.docx
@@ -4,45 +4,7 @@
   <w:body>
     <w:p>
       <w:pPr>
-        <w:pStyle w:val="Title"/>
-      </w:pPr>
-      <w:r>
-        <w:t xml:space="preserve">Design,</w:t>
-      </w:r>
-      <w:r>
-        <w:t xml:space="preserve"> </w:t>
-      </w:r>
-      <w:r>
-        <w:t xml:space="preserve">Dynamics,</w:t>
-      </w:r>
-      <w:r>
-        <w:t xml:space="preserve"> </w:t>
-      </w:r>
-      <w:r>
-        <w:t xml:space="preserve">Drive</w:t>
-      </w:r>
-      <w:r>
-        <w:t xml:space="preserve"> </w:t>
-      </w:r>
-      <w:r>
-        <w:t xml:space="preserve">of</w:t>
-      </w:r>
-      <w:r>
-        <w:t xml:space="preserve"> </w:t>
-      </w:r>
-      <w:r>
-        <w:t xml:space="preserve">BLDC</w:t>
-      </w:r>
-      <w:r>
-        <w:t xml:space="preserve"> </w:t>
-      </w:r>
-      <w:r>
-        <w:t xml:space="preserve">Motor</w:t>
-      </w:r>
-    </w:p>
-    <w:p>
-      <w:pPr>
-        <w:pStyle w:val="Heading2"/>
+        <w:pStyle w:val="Heading3"/>
       </w:pPr>
       <w:bookmarkStart w:id="20" w:name="why-bldc"/>
       <w:r>
@@ -55,33 +17,692 @@
         <w:pStyle w:val="FirstParagraph"/>
       </w:pPr>
       <w:r>
-        <w:t xml:space="preserve">Reduced noise, wear, and friction caused by brushes. [Direct-drive robots: theory and practice]</w:t>
-      </w:r>
-    </w:p>
-    <w:p>
-      <w:pPr>
-        <w:pStyle w:val="BodyText"/>
-      </w:pPr>
-      <w:r>
-        <w:t xml:space="preserve">Torque -Speed characteristics is linear.</w:t>
-      </w:r>
-    </w:p>
-    <w:p>
-      <w:pPr>
-        <w:pStyle w:val="Heading2"/>
-      </w:pPr>
-      <w:bookmarkStart w:id="21" w:name="thermal-specific-torque-density"/>
-      <w:r>
-        <w:t xml:space="preserve">Thermal Specific Torque Density</w:t>
+        <w:t xml:space="preserve">Reduced noise, wear, and friction caused by brushes and Torque-Speed characteristics is linear.[Direct-drive robots: theory and practice]</w:t>
+      </w:r>
+    </w:p>
+    <w:p>
+      <w:pPr>
+        <w:pStyle w:val="Heading3"/>
+      </w:pPr>
+      <w:bookmarkStart w:id="21" w:name="design"/>
+      <w:r>
+        <w:t xml:space="preserve">Design</w:t>
       </w:r>
       <w:bookmarkEnd w:id="21"/>
     </w:p>
     <w:p>
       <w:pPr>
+        <w:pStyle w:val="Heading5"/>
+      </w:pPr>
+      <w:bookmarkStart w:id="22" w:name="basic-terminology"/>
+      <w:r>
+        <w:t xml:space="preserve">Basic Terminology</w:t>
+      </w:r>
+      <w:bookmarkEnd w:id="22"/>
+    </w:p>
+    <w:p>
+      <w:pPr>
         <w:pStyle w:val="FirstParagraph"/>
       </w:pPr>
       <w:r>
-        <w:t xml:space="preserve">Form, [Design Principles for a Family of Direct-Drive Legged Robots], we have</w:t>
+        <w:rPr>
+          <w:b/>
+        </w:rPr>
+        <w:t xml:space="preserve">Stator &amp; Rotor</w:t>
+      </w:r>
+    </w:p>
+    <w:p>
+      <w:pPr>
+        <w:pStyle w:val="BodyText"/>
+      </w:pPr>
+      <w:r>
+        <w:t xml:space="preserve">Stator, the stationary part, which carries the winding.Rotor, the rotating part, which carries the magnet.</w:t>
+      </w:r>
+    </w:p>
+    <w:p>
+      <w:pPr>
+        <w:pStyle w:val="CaptionedFigure"/>
+      </w:pPr>
+      <w:r>
+        <w:drawing>
+          <wp:inline>
+            <wp:extent cx="5334000" cy="2739360"/>
+            <wp:effectExtent b="0" l="0" r="0" t="0"/>
+            <wp:docPr descr="Stator &amp; Rotor, Source:[1]" title="" id="1" name="Picture"/>
+            <a:graphic>
+              <a:graphicData uri="http://schemas.openxmlformats.org/drawingml/2006/picture">
+                <pic:pic>
+                  <pic:nvPicPr>
+                    <pic:cNvPr descr="https://ajaygunalan.github.io/projects/asset/motor/motor_1.png" id="0" name="Picture"/>
+                    <pic:cNvPicPr>
+                      <a:picLocks noChangeArrowheads="1" noChangeAspect="1"/>
+                    </pic:cNvPicPr>
+                  </pic:nvPicPr>
+                  <pic:blipFill>
+                    <a:blip r:embed="rId23"/>
+                    <a:stretch>
+                      <a:fillRect/>
+                    </a:stretch>
+                  </pic:blipFill>
+                  <pic:spPr bwMode="auto">
+                    <a:xfrm>
+                      <a:off x="0" y="0"/>
+                      <a:ext cx="5334000" cy="2739360"/>
+                    </a:xfrm>
+                    <a:prstGeom prst="rect">
+                      <a:avLst/>
+                    </a:prstGeom>
+                    <a:noFill/>
+                    <a:ln w="9525">
+                      <a:noFill/>
+                      <a:headEnd/>
+                      <a:tailEnd/>
+                    </a:ln>
+                  </pic:spPr>
+                </pic:pic>
+              </a:graphicData>
+            </a:graphic>
+          </wp:inline>
+        </w:drawing>
+      </w:r>
+    </w:p>
+    <w:p>
+      <w:pPr>
+        <w:pStyle w:val="ImageCaption"/>
+      </w:pPr>
+      <w:r>
+        <w:t xml:space="preserve">Stator &amp; Rotor, Source:</w:t>
+      </w:r>
+      <w:r>
+        <w:t xml:space="preserve">[</w:t>
+      </w:r>
+      <w:hyperlink w:anchor="ref-colton_design_2010">
+        <w:r>
+          <w:rPr>
+            <w:rStyle w:val="Hyperlink"/>
+          </w:rPr>
+          <w:t xml:space="preserve">1</w:t>
+        </w:r>
+      </w:hyperlink>
+      <w:r>
+        <w:t xml:space="preserve">]</w:t>
+      </w:r>
+    </w:p>
+    <w:p>
+      <w:pPr>
+        <w:pStyle w:val="BodyText"/>
+      </w:pPr>
+      <w:r>
+        <w:rPr>
+          <w:b/>
+        </w:rPr>
+        <w:t xml:space="preserve">Air Gap</w:t>
+      </w:r>
+    </w:p>
+    <w:p>
+      <w:pPr>
+        <w:pStyle w:val="BodyText"/>
+      </w:pPr>
+      <w:r>
+        <w:t xml:space="preserve">Air gap is the distance between stator and rotor.</w:t>
+      </w:r>
+    </w:p>
+    <w:p>
+      <w:pPr>
+        <w:pStyle w:val="BodyText"/>
+      </w:pPr>
+      <w:r>
+        <w:rPr>
+          <w:b/>
+        </w:rPr>
+        <w:t xml:space="preserve">Tooth &amp; Slot</w:t>
+      </w:r>
+    </w:p>
+    <w:p>
+      <w:pPr>
+        <w:pStyle w:val="BodyText"/>
+      </w:pPr>
+      <w:r>
+        <w:t xml:space="preserve">Winding are wounded around the laminated steel structure called tooth which channels more magnetic flux through them. Slot is the section between two tooth. Three phase motor have slots (and teeth) that is evenly divisible by three.</w:t>
+      </w:r>
+    </w:p>
+    <w:p>
+      <w:pPr>
+        <w:pStyle w:val="CaptionedFigure"/>
+      </w:pPr>
+      <w:r>
+        <w:drawing>
+          <wp:inline>
+            <wp:extent cx="5334000" cy="3871033"/>
+            <wp:effectExtent b="0" l="0" r="0" t="0"/>
+            <wp:docPr descr="Tooth &amp; Slot, Source:[1]" title="" id="1" name="Picture"/>
+            <a:graphic>
+              <a:graphicData uri="http://schemas.openxmlformats.org/drawingml/2006/picture">
+                <pic:pic>
+                  <pic:nvPicPr>
+                    <pic:cNvPr descr="https://ajaygunalan.github.io/projects/asset/motor/motor_2.png" id="0" name="Picture"/>
+                    <pic:cNvPicPr>
+                      <a:picLocks noChangeArrowheads="1" noChangeAspect="1"/>
+                    </pic:cNvPicPr>
+                  </pic:nvPicPr>
+                  <pic:blipFill>
+                    <a:blip r:embed="rId24"/>
+                    <a:stretch>
+                      <a:fillRect/>
+                    </a:stretch>
+                  </pic:blipFill>
+                  <pic:spPr bwMode="auto">
+                    <a:xfrm>
+                      <a:off x="0" y="0"/>
+                      <a:ext cx="5334000" cy="3871033"/>
+                    </a:xfrm>
+                    <a:prstGeom prst="rect">
+                      <a:avLst/>
+                    </a:prstGeom>
+                    <a:noFill/>
+                    <a:ln w="9525">
+                      <a:noFill/>
+                      <a:headEnd/>
+                      <a:tailEnd/>
+                    </a:ln>
+                  </pic:spPr>
+                </pic:pic>
+              </a:graphicData>
+            </a:graphic>
+          </wp:inline>
+        </w:drawing>
+      </w:r>
+    </w:p>
+    <w:p>
+      <w:pPr>
+        <w:pStyle w:val="ImageCaption"/>
+      </w:pPr>
+      <w:r>
+        <w:t xml:space="preserve">Tooth &amp; Slot, Source:</w:t>
+      </w:r>
+      <w:r>
+        <w:t xml:space="preserve">[</w:t>
+      </w:r>
+      <w:hyperlink w:anchor="ref-colton_design_2010">
+        <w:r>
+          <w:rPr>
+            <w:rStyle w:val="Hyperlink"/>
+          </w:rPr>
+          <w:t xml:space="preserve">1</w:t>
+        </w:r>
+      </w:hyperlink>
+      <w:r>
+        <w:t xml:space="preserve">]</w:t>
+      </w:r>
+    </w:p>
+    <w:p>
+      <w:pPr>
+        <w:pStyle w:val="BodyText"/>
+      </w:pPr>
+      <w:r>
+        <w:rPr>
+          <w:b/>
+        </w:rPr>
+        <w:t xml:space="preserve">Phase</w:t>
+      </w:r>
+    </w:p>
+    <w:p>
+      <w:pPr>
+        <w:pStyle w:val="BodyText"/>
+      </w:pPr>
+      <w:r>
+        <w:t xml:space="preserve">A phase is an individual group of windings with a single terminal accessible from outside the motor. Most brushless motors are three-phase.</w:t>
+      </w:r>
+    </w:p>
+    <w:p>
+      <w:pPr>
+        <w:pStyle w:val="BodyText"/>
+      </w:pPr>
+      <w:r>
+        <w:rPr>
+          <w:b/>
+        </w:rPr>
+        <w:t xml:space="preserve">Turns</w:t>
+      </w:r>
+    </w:p>
+    <w:p>
+      <w:pPr>
+        <w:pStyle w:val="BodyText"/>
+      </w:pPr>
+      <w:r>
+        <w:rPr>
+          <w:b/>
+        </w:rPr>
+        <w:t xml:space="preserve">Pole</w:t>
+      </w:r>
+      <w:r>
+        <w:rPr>
+          <w:b/>
+        </w:rPr>
+        <w:t xml:space="preserve"> </w:t>
+      </w:r>
+      <m:oMath>
+        <m:r>
+          <m:t>(</m:t>
+        </m:r>
+        <m:sSub>
+          <m:e>
+            <m:r>
+              <m:t>N</m:t>
+            </m:r>
+          </m:e>
+          <m:sub>
+            <m:r>
+              <m:t>m</m:t>
+            </m:r>
+          </m:sub>
+        </m:sSub>
+        <m:r>
+          <m:t>)</m:t>
+        </m:r>
+      </m:oMath>
+    </w:p>
+    <w:p>
+      <w:pPr>
+        <w:pStyle w:val="BodyText"/>
+      </w:pPr>
+      <w:r>
+        <w:t xml:space="preserve">A pole is a single permanent magnet pole, north or south. The minimum number of poles is two, but motors can have any even number of poles.The number of poles is not directly related to the number of slots, although there are common combinations of slot and pole counts that work well [6].</w:t>
+      </w:r>
+    </w:p>
+    <w:p>
+      <w:pPr>
+        <w:pStyle w:val="BodyText"/>
+      </w:pPr>
+      <w:r>
+        <w:rPr>
+          <w:b/>
+        </w:rPr>
+        <w:t xml:space="preserve">Electrical Angle</w:t>
+      </w:r>
+      <w:r>
+        <w:rPr>
+          <w:b/>
+        </w:rPr>
+        <w:t xml:space="preserve"> </w:t>
+      </w:r>
+      <m:oMath>
+        <m:r>
+          <m:t>(</m:t>
+        </m:r>
+        <m:sSub>
+          <m:e>
+            <m:r>
+              <m:t>θ</m:t>
+            </m:r>
+          </m:e>
+          <m:sub>
+            <m:r>
+              <m:t>e</m:t>
+            </m:r>
+          </m:sub>
+        </m:sSub>
+        <m:r>
+          <m:t>)</m:t>
+        </m:r>
+      </m:oMath>
+      <w:r>
+        <w:rPr>
+          <w:b/>
+        </w:rPr>
+        <w:t xml:space="preserve"> </w:t>
+      </w:r>
+      <w:r>
+        <w:rPr>
+          <w:b/>
+        </w:rPr>
+        <w:t xml:space="preserve">vs Mechanical Angle</w:t>
+      </w:r>
+      <w:r>
+        <w:rPr>
+          <w:b/>
+        </w:rPr>
+        <w:t xml:space="preserve"> </w:t>
+      </w:r>
+      <m:oMath>
+        <m:r>
+          <m:t>(</m:t>
+        </m:r>
+        <m:sSub>
+          <m:e>
+            <m:r>
+              <m:t>θ</m:t>
+            </m:r>
+          </m:e>
+          <m:sub>
+            <m:r>
+              <m:t>m</m:t>
+            </m:r>
+          </m:sub>
+        </m:sSub>
+        <m:r>
+          <m:t>)</m:t>
+        </m:r>
+      </m:oMath>
+    </w:p>
+    <w:p>
+      <w:pPr>
+        <w:pStyle w:val="BodyText"/>
+      </w:pPr>
+      <w:r>
+        <w:t xml:space="preserve">Mechanical degrees in a motor refers to the rotation of the shaft.</w:t>
+      </w:r>
+      <w:r>
+        <w:t xml:space="preserve"> </w:t>
+      </w:r>
+      <m:oMath>
+        <m:r>
+          <m:t>1</m:t>
+        </m:r>
+      </m:oMath>
+      <w:r>
+        <w:t xml:space="preserve"> </w:t>
+      </w:r>
+      <w:r>
+        <w:t xml:space="preserve">revolution of the shaft equals</w:t>
+      </w:r>
+      <w:r>
+        <w:t xml:space="preserve"> </w:t>
+      </w:r>
+      <m:oMath>
+        <m:r>
+          <m:t>360</m:t>
+        </m:r>
+        <m:r>
+          <m:rPr>
+            <m:sty m:val="p"/>
+          </m:rPr>
+          <m:t>deg</m:t>
+        </m:r>
+      </m:oMath>
+      <w:r>
+        <w:t xml:space="preserve"> </w:t>
+      </w:r>
+      <w:r>
+        <w:t xml:space="preserve">mechanical degrees.</w:t>
+      </w:r>
+    </w:p>
+    <w:p>
+      <w:pPr>
+        <w:pStyle w:val="BodyText"/>
+      </w:pPr>
+      <w:r>
+        <w:t xml:space="preserve">When an electrical machine is operating as a motor, the idea is to create a traveling, rotating magnetic field, via the stator so that this moving flux attracts the rotor. Electrical degree is the angle through which magnetic field has rotated, i.e.,</w:t>
+      </w:r>
+      <w:r>
+        <w:t xml:space="preserve"> </w:t>
+      </w:r>
+      <m:oMath>
+        <m:r>
+          <m:t>360</m:t>
+        </m:r>
+      </m:oMath>
+      <w:r>
+        <w:t xml:space="preserve"> </w:t>
+      </w:r>
+      <w:r>
+        <w:t xml:space="preserve">electrical degree equals transistion form</w:t>
+      </w:r>
+      <w:r>
+        <w:t xml:space="preserve"> </w:t>
+      </w:r>
+      <w:r>
+        <w:t xml:space="preserve">“</w:t>
+      </w:r>
+      <w:r>
+        <w:t xml:space="preserve">North</w:t>
+      </w:r>
+      <w:r>
+        <w:t xml:space="preserve">”</w:t>
+      </w:r>
+      <w:r>
+        <w:t xml:space="preserve"> </w:t>
+      </w:r>
+      <w:r>
+        <w:t xml:space="preserve">to</w:t>
+      </w:r>
+      <w:r>
+        <w:t xml:space="preserve"> </w:t>
+      </w:r>
+      <w:r>
+        <w:t xml:space="preserve">“</w:t>
+      </w:r>
+      <w:r>
+        <w:t xml:space="preserve">South</w:t>
+      </w:r>
+      <w:r>
+        <w:t xml:space="preserve">”</w:t>
+      </w:r>
+      <w:r>
+        <w:t xml:space="preserve"> </w:t>
+      </w:r>
+      <w:r>
+        <w:t xml:space="preserve">to</w:t>
+      </w:r>
+      <w:r>
+        <w:t xml:space="preserve"> </w:t>
+      </w:r>
+      <w:r>
+        <w:t xml:space="preserve">“</w:t>
+      </w:r>
+      <w:r>
+        <w:t xml:space="preserve">North</w:t>
+      </w:r>
+      <w:r>
+        <w:t xml:space="preserve">”</w:t>
+      </w:r>
+    </w:p>
+    <w:p>
+      <w:pPr>
+        <w:pStyle w:val="BodyText"/>
+      </w:pPr>
+      <w:r>
+        <w:t xml:space="preserve">A 2 pole motor has 1</w:t>
+      </w:r>
+      <w:r>
+        <w:t xml:space="preserve"> </w:t>
+      </w:r>
+      <w:r>
+        <w:t xml:space="preserve">“</w:t>
+      </w:r>
+      <w:r>
+        <w:t xml:space="preserve">North</w:t>
+      </w:r>
+      <w:r>
+        <w:t xml:space="preserve">”</w:t>
+      </w:r>
+      <w:r>
+        <w:t xml:space="preserve"> </w:t>
+      </w:r>
+      <w:r>
+        <w:t xml:space="preserve">pole and 1</w:t>
+      </w:r>
+      <w:r>
+        <w:t xml:space="preserve"> </w:t>
+      </w:r>
+      <w:r>
+        <w:t xml:space="preserve">“</w:t>
+      </w:r>
+      <w:r>
+        <w:t xml:space="preserve">South</w:t>
+      </w:r>
+      <w:r>
+        <w:t xml:space="preserve">”</w:t>
+      </w:r>
+      <w:r>
+        <w:t xml:space="preserve"> </w:t>
+      </w:r>
+      <w:r>
+        <w:t xml:space="preserve">pole on the rotor. So in order for it to turn</w:t>
+      </w:r>
+      <w:r>
+        <w:t xml:space="preserve"> </w:t>
+      </w:r>
+      <m:oMath>
+        <m:r>
+          <m:t>360</m:t>
+        </m:r>
+      </m:oMath>
+      <w:r>
+        <w:t xml:space="preserve"> </w:t>
+      </w:r>
+      <w:r>
+        <w:t xml:space="preserve">electrical degrees (</w:t>
+      </w:r>
+      <w:r>
+        <w:t xml:space="preserve">“</w:t>
+      </w:r>
+      <w:r>
+        <w:t xml:space="preserve">North</w:t>
+      </w:r>
+      <w:r>
+        <w:t xml:space="preserve">”</w:t>
+      </w:r>
+      <w:r>
+        <w:t xml:space="preserve"> </w:t>
+      </w:r>
+      <w:r>
+        <w:t xml:space="preserve">to</w:t>
+      </w:r>
+      <w:r>
+        <w:t xml:space="preserve"> </w:t>
+      </w:r>
+      <w:r>
+        <w:t xml:space="preserve">“</w:t>
+      </w:r>
+      <w:r>
+        <w:t xml:space="preserve">South</w:t>
+      </w:r>
+      <w:r>
+        <w:t xml:space="preserve">”</w:t>
+      </w:r>
+      <w:r>
+        <w:t xml:space="preserve"> </w:t>
+      </w:r>
+      <w:r>
+        <w:t xml:space="preserve">to</w:t>
+      </w:r>
+      <w:r>
+        <w:t xml:space="preserve"> </w:t>
+      </w:r>
+      <w:r>
+        <w:t xml:space="preserve">“</w:t>
+      </w:r>
+      <w:r>
+        <w:t xml:space="preserve">North</w:t>
+      </w:r>
+      <w:r>
+        <w:t xml:space="preserve">”</w:t>
+      </w:r>
+      <w:r>
+        <w:t xml:space="preserve">), it needs to rotate 360 (360) mechanical degrees. A 4 pole motor has 2</w:t>
+      </w:r>
+      <w:r>
+        <w:t xml:space="preserve"> </w:t>
+      </w:r>
+      <w:r>
+        <w:t xml:space="preserve">“</w:t>
+      </w:r>
+      <w:r>
+        <w:t xml:space="preserve">North</w:t>
+      </w:r>
+      <w:r>
+        <w:t xml:space="preserve">”</w:t>
+      </w:r>
+      <w:r>
+        <w:t xml:space="preserve"> </w:t>
+      </w:r>
+      <w:r>
+        <w:t xml:space="preserve">poles and 2</w:t>
+      </w:r>
+      <w:r>
+        <w:t xml:space="preserve"> </w:t>
+      </w:r>
+      <w:r>
+        <w:t xml:space="preserve">“</w:t>
+      </w:r>
+      <w:r>
+        <w:t xml:space="preserve">South</w:t>
+      </w:r>
+      <w:r>
+        <w:t xml:space="preserve">”</w:t>
+      </w:r>
+      <w:r>
+        <w:t xml:space="preserve"> </w:t>
+      </w:r>
+      <w:r>
+        <w:t xml:space="preserve">poles. That means that</w:t>
+      </w:r>
+      <w:r>
+        <w:t xml:space="preserve"> </w:t>
+      </w:r>
+      <m:oMath>
+        <m:r>
+          <m:t>360</m:t>
+        </m:r>
+      </m:oMath>
+      <w:r>
+        <w:t xml:space="preserve"> </w:t>
+      </w:r>
+      <w:r>
+        <w:t xml:space="preserve">electrical degrees will occur when the shaft has rotated only</w:t>
+      </w:r>
+      <w:r>
+        <w:t xml:space="preserve"> </w:t>
+      </w:r>
+      <m:oMath>
+        <m:r>
+          <m:t>180</m:t>
+        </m:r>
+        <m:r>
+          <m:t>(</m:t>
+        </m:r>
+        <m:r>
+          <m:t>360</m:t>
+        </m:r>
+        <m:r>
+          <m:t>/</m:t>
+        </m:r>
+        <m:r>
+          <m:t>2</m:t>
+        </m:r>
+        <m:r>
+          <m:t>)</m:t>
+        </m:r>
+      </m:oMath>
+      <w:r>
+        <w:t xml:space="preserve"> </w:t>
+      </w:r>
+      <w:r>
+        <w:t xml:space="preserve">mechanical degrees. Thus for</w:t>
+      </w:r>
+      <w:r>
+        <w:t xml:space="preserve"> </w:t>
+      </w:r>
+      <m:oMath>
+        <m:sSub>
+          <m:e>
+            <m:r>
+              <m:t>N</m:t>
+            </m:r>
+          </m:e>
+          <m:sub>
+            <m:r>
+              <m:t>m</m:t>
+            </m:r>
+          </m:sub>
+        </m:sSub>
+      </m:oMath>
+      <w:r>
+        <w:t xml:space="preserve"> </w:t>
+      </w:r>
+      <w:r>
+        <w:t xml:space="preserve">Poles we have,</w:t>
       </w:r>
     </w:p>
     <w:p>
@@ -96,28 +717,18 @@
           <m:sSub>
             <m:e>
               <m:r>
-                <m:t>K</m:t>
+                <m:t>θ</m:t>
               </m:r>
             </m:e>
             <m:sub>
               <m:r>
-                <m:t>t</m:t>
-              </m:r>
-              <m:r>
-                <m:t>s</m:t>
+                <m:t>e</m:t>
               </m:r>
             </m:sub>
           </m:sSub>
-          <m:box>
-            <m:boxPr>
-              <m:opEmu m:val="1"/>
-            </m:boxPr>
-            <m:e>
-              <m:r>
-                <m:t>:=</m:t>
-              </m:r>
-            </m:e>
-          </m:box>
+          <m:r>
+            <m:t>=</m:t>
+          </m:r>
           <m:f>
             <m:fPr>
               <m:type m:val="bar"/>
@@ -126,453 +737,31 @@
               <m:sSub>
                 <m:e>
                   <m:r>
-                    <m:t>K</m:t>
+                    <m:t>N</m:t>
                   </m:r>
                 </m:e>
                 <m:sub>
                   <m:r>
-                    <m:t>t</m:t>
+                    <m:t>m</m:t>
                   </m:r>
                 </m:sub>
               </m:sSub>
             </m:num>
             <m:den>
               <m:r>
-                <m:t>m</m:t>
+                <m:t>2</m:t>
               </m:r>
             </m:den>
           </m:f>
-          <m:rad>
-            <m:radPr>
-              <m:degHide m:val="1"/>
-            </m:radPr>
-            <m:deg/>
-            <m:e>
-              <m:f>
-                <m:fPr>
-                  <m:type m:val="bar"/>
-                </m:fPr>
-                <m:num>
-                  <m:r>
-                    <m:t>1</m:t>
-                  </m:r>
-                </m:num>
-                <m:den>
-                  <m:sSub>
-                    <m:e>
-                      <m:r>
-                        <m:t>R</m:t>
-                      </m:r>
-                    </m:e>
-                    <m:sub>
-                      <m:r>
-                        <m:t>t</m:t>
-                      </m:r>
-                      <m:r>
-                        <m:t>h</m:t>
-                      </m:r>
-                    </m:sub>
-                  </m:sSub>
-                  <m:r>
-                    <m:t>R</m:t>
-                  </m:r>
-                </m:den>
-              </m:f>
-            </m:e>
-          </m:rad>
-        </m:oMath>
-      </m:oMathPara>
-    </w:p>
-    <w:p>
-      <w:pPr>
-        <w:pStyle w:val="FirstParagraph"/>
-      </w:pPr>
-      <w:r>
-        <w:t xml:space="preserve">outrunners (rotor on the outside) will be preferrable to inrunners (rotor on the inside), and this measure is tied favorably to a motor’s radius to depth ratio [Direct-drive robots: theory and practice] as well as a large gap radius [Actuator design for high force proprioceptive control in fast legged locomotion]. The measure is fundamentally winding invariant [Leg Design for Energy Management in an Electromechanical Robot], but in practice other details of the motor’s construction (especially relating to the stator core and volume of copper) are critical.</w:t>
-      </w:r>
-    </w:p>
-    <w:p>
-      <w:pPr>
-        <w:pStyle w:val="BodyText"/>
-      </w:pPr>
-      <w:r>
-        <w:rPr>
-          <w:b/>
-        </w:rPr>
-        <w:t xml:space="preserve">[Direct-drive robots: theory and practice]</w:t>
-      </w:r>
-      <w:r>
-        <w:t xml:space="preserve"> </w:t>
-      </w:r>
-      <w:r>
-        <w:t xml:space="preserve">Direct Drive has no damping.</w:t>
-      </w:r>
-      <w:r>
-        <w:t xml:space="preserve"> </w:t>
-      </w:r>
-      <m:oMath>
-        <m:r>
-          <m:t>M</m:t>
-        </m:r>
-        <m:r>
-          <m:t>e</m:t>
-        </m:r>
-        <m:r>
-          <m:t>c</m:t>
-        </m:r>
-        <m:r>
-          <m:t>h</m:t>
-        </m:r>
-        <m:r>
-          <m:t>a</m:t>
-        </m:r>
-        <m:r>
-          <m:t>n</m:t>
-        </m:r>
-        <m:r>
-          <m:t>i</m:t>
-        </m:r>
-        <m:r>
-          <m:t>c</m:t>
-        </m:r>
-        <m:r>
-          <m:t>a</m:t>
-        </m:r>
-        <m:r>
-          <m:t>l</m:t>
-        </m:r>
-        <m:r>
-          <m:t> </m:t>
-        </m:r>
-        <m:r>
-          <m:t>T</m:t>
-        </m:r>
-        <m:r>
-          <m:t>i</m:t>
-        </m:r>
-        <m:r>
-          <m:t>m</m:t>
-        </m:r>
-        <m:r>
-          <m:t>e</m:t>
-        </m:r>
-        <m:r>
-          <m:t> </m:t>
-        </m:r>
-        <m:r>
-          <m:t>C</m:t>
-        </m:r>
-        <m:r>
-          <m:t>o</m:t>
-        </m:r>
-        <m:r>
-          <m:t>n</m:t>
-        </m:r>
-        <m:r>
-          <m:t>s</m:t>
-        </m:r>
-        <m:r>
-          <m:t>t</m:t>
-        </m:r>
-        <m:r>
-          <m:t>a</m:t>
-        </m:r>
-        <m:r>
-          <m:t>n</m:t>
-        </m:r>
-        <m:r>
-          <m:t>t</m:t>
-        </m:r>
-        <m:r>
-          <m:t> </m:t>
-        </m:r>
-        <m:sSub>
-          <m:e>
-            <m:r>
-              <m:t>τ</m:t>
-            </m:r>
-          </m:e>
-          <m:sub>
-            <m:r>
-              <m:t>m</m:t>
-            </m:r>
-            <m:r>
-              <m:t>e</m:t>
-            </m:r>
-            <m:r>
-              <m:t>c</m:t>
-            </m:r>
-            <m:r>
-              <m:t>h</m:t>
-            </m:r>
-          </m:sub>
-        </m:sSub>
-        <m:r>
-          <m:t>=</m:t>
-        </m:r>
-        <m:f>
-          <m:fPr>
-            <m:type m:val="bar"/>
-          </m:fPr>
-          <m:num>
-            <m:r>
-              <m:t>i</m:t>
-            </m:r>
-            <m:r>
-              <m:t>n</m:t>
-            </m:r>
-            <m:r>
-              <m:t>e</m:t>
-            </m:r>
-            <m:r>
-              <m:t>r</m:t>
-            </m:r>
-            <m:r>
-              <m:t>t</m:t>
-            </m:r>
-            <m:r>
-              <m:t>i</m:t>
-            </m:r>
-            <m:r>
-              <m:t>a</m:t>
-            </m:r>
-            <m:r>
-              <m:t> </m:t>
-            </m:r>
-            <m:r>
-              <m:t>l</m:t>
-            </m:r>
-            <m:r>
-              <m:t>o</m:t>
-            </m:r>
-            <m:r>
-              <m:t>a</m:t>
-            </m:r>
-            <m:r>
-              <m:t>d</m:t>
-            </m:r>
-          </m:num>
-          <m:den>
-            <m:r>
-              <m:t>m</m:t>
-            </m:r>
-            <m:r>
-              <m:t>e</m:t>
-            </m:r>
-            <m:r>
-              <m:t>c</m:t>
-            </m:r>
-            <m:r>
-              <m:t>h</m:t>
-            </m:r>
-            <m:r>
-              <m:t>a</m:t>
-            </m:r>
-            <m:r>
-              <m:t>n</m:t>
-            </m:r>
-            <m:r>
-              <m:t>i</m:t>
-            </m:r>
-            <m:r>
-              <m:t>c</m:t>
-            </m:r>
-            <m:r>
-              <m:t>a</m:t>
-            </m:r>
-            <m:r>
-              <m:t>l</m:t>
-            </m:r>
-            <m:r>
-              <m:t> </m:t>
-            </m:r>
-            <m:r>
-              <m:t>d</m:t>
-            </m:r>
-            <m:r>
-              <m:t>a</m:t>
-            </m:r>
-            <m:r>
-              <m:t>m</m:t>
-            </m:r>
-            <m:r>
-              <m:t>p</m:t>
-            </m:r>
-            <m:r>
-              <m:t>i</m:t>
-            </m:r>
-            <m:r>
-              <m:t>n</m:t>
-            </m:r>
-            <m:r>
-              <m:t>g</m:t>
-            </m:r>
-            <m:r>
-              <m:t> </m:t>
-            </m:r>
-            <m:r>
-              <m:t>c</m:t>
-            </m:r>
-            <m:r>
-              <m:t>o</m:t>
-            </m:r>
-            <m:r>
-              <m:t>e</m:t>
-            </m:r>
-            <m:r>
-              <m:t>f</m:t>
-            </m:r>
-            <m:r>
-              <m:t>f</m:t>
-            </m:r>
-            <m:r>
-              <m:t>i</m:t>
-            </m:r>
-            <m:r>
-              <m:t>c</m:t>
-            </m:r>
-            <m:r>
-              <m:t>i</m:t>
-            </m:r>
-            <m:r>
-              <m:t>e</m:t>
-            </m:r>
-            <m:r>
-              <m:t>n</m:t>
-            </m:r>
-            <m:r>
-              <m:t>t</m:t>
-            </m:r>
-          </m:den>
-        </m:f>
-      </m:oMath>
-      <w:r>
-        <w:t xml:space="preserve"> </w:t>
-      </w:r>
-      <w:r>
-        <w:t xml:space="preserve">is large comapred to geared drive.</w:t>
-      </w:r>
-    </w:p>
-    <w:p>
-      <w:pPr>
-        <w:pStyle w:val="BodyText"/>
-      </w:pPr>
-      <w:r>
-        <w:rPr>
-          <w:b/>
-        </w:rPr>
-        <w:t xml:space="preserve">Motor Inductance Effects</w:t>
-      </w:r>
-      <w:r>
-        <w:t xml:space="preserve"> </w:t>
-      </w:r>
-      <w:r>
-        <w:t xml:space="preserve">Direct-drive motors for robotics applications arc generally designed for maximum output torques. To eliminate a mechanical gearing. the large output torque is the most important specification in the motor design.</w:t>
-      </w:r>
-    </w:p>
-    <w:p>
-      <w:pPr>
-        <w:pStyle w:val="BodyText"/>
-      </w:pPr>
-      <w:r>
-        <w:t xml:space="preserve">However, this requirement leads to the use of large windings, which have significantly large inductances.</w:t>
-      </w:r>
-    </w:p>
-    <w:p>
-      <w:pPr>
-        <w:pStyle w:val="BodyText"/>
-      </w:pPr>
-      <w:r>
-        <w:t xml:space="preserve">The electric time constant, which is determined by the motor inductance, becomes particularly slow for a large direct-drive motor having as large inductance.</w:t>
-      </w:r>
-    </w:p>
-    <w:p>
-      <w:pPr>
-        <w:pStyle w:val="BodyText"/>
-      </w:pPr>
-      <w:r>
-        <w:t xml:space="preserve">The slow time constant may cause a stability problem.</w:t>
-      </w:r>
-    </w:p>
-    <w:p>
-      <w:pPr>
-        <w:pStyle w:val="BodyText"/>
-      </w:pPr>
-      <w:r>
-        <w:t xml:space="preserve">For traditional servomotors used in the gear-drive robot, the motor inductance is negligibly small. Hence, the effect of th e electric time constant is negligible, and the drive system can be treated as a second-order system, unless other higher-order delays are prominant.</w:t>
-      </w:r>
-    </w:p>
-    <w:p>
-      <w:pPr>
-        <w:pStyle w:val="BodyText"/>
-      </w:pPr>
-      <w:r>
-        <w:t xml:space="preserve">Thus, the drive system is inherently stable with an appropriate damping. By contrast, often the direct-drive system can be unstable due to the motor inductance effect. To cope with this problem, the amplifier of the direct-drive motor must have fast dynamic responses to drive motor currents quickly in spite of the large inductance. Also, the control system must be designed carefully so that the stability margin can be sufficiently large.</w:t>
-      </w:r>
-    </w:p>
-    <w:p>
-      <w:pPr>
-        <w:pStyle w:val="BodyText"/>
-      </w:pPr>
-      <w:r>
-        <w:rPr>
-          <w:b/>
-        </w:rPr>
-        <w:t xml:space="preserve">Gap radius ?</w:t>
-      </w:r>
-      <w:r>
-        <w:t xml:space="preserve"> </w:t>
-      </w:r>
-      <w:r>
-        <w:t xml:space="preserve">[Actuator design for high force proprioceptive control in fast legged locomotion]</w:t>
-      </w:r>
-    </w:p>
-    <w:p>
-      <w:pPr>
-        <w:pStyle w:val="BodyText"/>
-      </w:pPr>
-      <w:r>
-        <w:t xml:space="preserve">The gap radius is the distance from the rotating axis to the center of the gap between permanent magnets and the stator.</w:t>
-      </w:r>
-    </w:p>
-    <w:p>
-      <w:pPr>
-        <w:pStyle w:val="BodyText"/>
-      </w:pPr>
-      <w:r>
-        <w:t xml:space="preserve">The area inside of the gap increase proportionally.</w:t>
-      </w:r>
-    </w:p>
-    <w:p>
-      <w:pPr>
-        <w:pStyle w:val="BodyText"/>
-      </w:pPr>
-      <m:oMathPara>
-        <m:oMathParaPr>
-          <m:jc m:val="center"/>
-        </m:oMathParaPr>
-        <m:oMath>
-          <m:r>
-            <m:t>M</m:t>
-          </m:r>
-          <m:r>
-            <m:t>∝</m:t>
-          </m:r>
           <m:sSub>
             <m:e>
               <m:r>
-                <m:t>r</m:t>
+                <m:t>θ</m:t>
               </m:r>
             </m:e>
             <m:sub>
               <m:r>
-                <m:t>g</m:t>
-              </m:r>
-              <m:r>
-                <m:t>a</m:t>
-              </m:r>
-              <m:r>
-                <m:t>p</m:t>
+                <m:t>m</m:t>
               </m:r>
             </m:sub>
           </m:sSub>
@@ -581,197 +770,122 @@
     </w:p>
     <w:p>
       <w:pPr>
+        <w:pStyle w:val="Heading5"/>
+      </w:pPr>
+      <w:bookmarkStart w:id="25" w:name="motor-parameters"/>
+      <w:r>
+        <w:t xml:space="preserve">Motor Parameters</w:t>
+      </w:r>
+      <w:bookmarkEnd w:id="25"/>
+    </w:p>
+    <w:p>
+      <w:pPr>
         <w:pStyle w:val="FirstParagraph"/>
       </w:pPr>
-      <m:oMathPara>
-        <m:oMathParaPr>
-          <m:jc m:val="center"/>
-        </m:oMathParaPr>
-        <m:oMath>
-          <m:r>
-            <m:t>τ</m:t>
-          </m:r>
-          <m:r>
-            <m:t>∝</m:t>
-          </m:r>
-          <m:sSubSup>
-            <m:e>
-              <m:r>
-                <m:t>r</m:t>
-              </m:r>
-            </m:e>
-            <m:sub>
-              <m:r>
-                <m:t>g</m:t>
-              </m:r>
-              <m:r>
-                <m:t>a</m:t>
-              </m:r>
-              <m:r>
-                <m:t>p</m:t>
-              </m:r>
-            </m:sub>
-            <m:sup>
-              <m:r>
-                <m:t>2</m:t>
-              </m:r>
-            </m:sup>
-          </m:sSubSup>
-        </m:oMath>
-      </m:oMathPara>
-    </w:p>
-    <w:p>
-      <w:pPr>
-        <w:pStyle w:val="FirstParagraph"/>
-      </w:pPr>
-      <m:oMathPara>
-        <m:oMathParaPr>
-          <m:jc m:val="center"/>
-        </m:oMathParaPr>
-        <m:oMath>
-          <m:r>
-            <m:t>J</m:t>
-          </m:r>
-          <m:r>
-            <m:t>∝</m:t>
-          </m:r>
-          <m:sSubSup>
-            <m:e>
-              <m:r>
-                <m:t>r</m:t>
-              </m:r>
-            </m:e>
-            <m:sub>
-              <m:r>
-                <m:t>g</m:t>
-              </m:r>
-              <m:r>
-                <m:t>a</m:t>
-              </m:r>
-              <m:r>
-                <m:t>p</m:t>
-              </m:r>
-            </m:sub>
-            <m:sup>
-              <m:r>
-                <m:t>3</m:t>
-              </m:r>
-            </m:sup>
-          </m:sSubSup>
-        </m:oMath>
-      </m:oMathPara>
-    </w:p>
-    <w:p>
-      <w:pPr>
-        <w:pStyle w:val="FirstParagraph"/>
-      </w:pPr>
-      <m:oMathPara>
-        <m:oMathParaPr>
-          <m:jc m:val="center"/>
-        </m:oMathParaPr>
-        <m:oMath>
-          <m:f>
-            <m:fPr>
-              <m:type m:val="bar"/>
-            </m:fPr>
-            <m:num>
-              <m:r>
-                <m:t>τ</m:t>
-              </m:r>
-            </m:num>
-            <m:den>
-              <m:r>
-                <m:t>M</m:t>
-              </m:r>
-            </m:den>
-          </m:f>
-          <m:r>
-            <m:t>∝</m:t>
-          </m:r>
-          <m:sSub>
-            <m:e>
-              <m:r>
-                <m:t>r</m:t>
-              </m:r>
-            </m:e>
-            <m:sub>
-              <m:r>
-                <m:t>g</m:t>
-              </m:r>
-              <m:r>
-                <m:t>a</m:t>
-              </m:r>
-              <m:r>
-                <m:t>p</m:t>
-              </m:r>
-            </m:sub>
-          </m:sSub>
-        </m:oMath>
-      </m:oMathPara>
-    </w:p>
-    <w:p>
-      <w:pPr>
-        <w:pStyle w:val="FirstParagraph"/>
-      </w:pPr>
-      <m:oMathPara>
-        <m:oMathParaPr>
-          <m:jc m:val="center"/>
-        </m:oMathParaPr>
-        <m:oMath>
-          <m:f>
-            <m:fPr>
-              <m:type m:val="bar"/>
-            </m:fPr>
-            <m:num>
-              <m:r>
-                <m:t>τ</m:t>
-              </m:r>
-            </m:num>
-            <m:den>
-              <m:r>
-                <m:t>J</m:t>
-              </m:r>
-            </m:den>
-          </m:f>
-          <m:r>
-            <m:t>∝</m:t>
-          </m:r>
-          <m:f>
-            <m:fPr>
-              <m:type m:val="bar"/>
-            </m:fPr>
-            <m:num>
-              <m:r>
-                <m:t>1</m:t>
-              </m:r>
-            </m:num>
-            <m:den>
-              <m:sSub>
-                <m:e>
-                  <m:r>
-                    <m:t>r</m:t>
-                  </m:r>
-                </m:e>
-                <m:sub>
-                  <m:r>
-                    <m:t>g</m:t>
-                  </m:r>
-                  <m:r>
-                    <m:t>a</m:t>
-                  </m:r>
-                  <m:r>
-                    <m:t>p</m:t>
-                  </m:r>
-                </m:sub>
-              </m:sSub>
-            </m:den>
-          </m:f>
-        </m:oMath>
-      </m:oMathPara>
-    </w:p>
-    <w:p>
-      <w:pPr>
-        <w:pStyle w:val="FirstParagraph"/>
+      <w:r>
+        <w:rPr>
+          <w:b/>
+        </w:rPr>
+        <w:t xml:space="preserve">Torque/Back EMF constant</w:t>
+      </w:r>
+      <w:r>
+        <w:rPr>
+          <w:b/>
+        </w:rPr>
+        <w:t xml:space="preserve"> </w:t>
+      </w:r>
+      <m:oMath>
+        <m:sSub>
+          <m:e>
+            <m:r>
+              <m:t>k</m:t>
+            </m:r>
+          </m:e>
+          <m:sub>
+            <m:r>
+              <m:t>t</m:t>
+            </m:r>
+          </m:sub>
+        </m:sSub>
+      </m:oMath>
+    </w:p>
+    <w:p>
+      <w:pPr>
+        <w:pStyle w:val="BodyText"/>
+      </w:pPr>
+      <m:oMath>
+        <m:sSub>
+          <m:e>
+            <m:r>
+              <m:t>k</m:t>
+            </m:r>
+          </m:e>
+          <m:sub>
+            <m:r>
+              <m:t>t</m:t>
+            </m:r>
+          </m:sub>
+        </m:sSub>
+        <m:r>
+          <m:t>=</m:t>
+        </m:r>
+        <m:r>
+          <m:t>f</m:t>
+        </m:r>
+        <m:r>
+          <m:t>(</m:t>
+        </m:r>
+        <m:sSub>
+          <m:e>
+            <m:r>
+              <m:t>θ</m:t>
+            </m:r>
+          </m:e>
+          <m:sub>
+            <m:r>
+              <m:t>e</m:t>
+            </m:r>
+          </m:sub>
+        </m:sSub>
+        <m:r>
+          <m:t>)</m:t>
+        </m:r>
+      </m:oMath>
+      <w:r>
+        <w:t xml:space="preserve">, for a BLDC Motor and for DC Motor $ k_{t} = c $</w:t>
+      </w:r>
+    </w:p>
+    <w:p>
+      <w:pPr>
+        <w:pStyle w:val="BodyText"/>
+      </w:pPr>
+      <w:r>
+        <w:rPr>
+          <w:b/>
+        </w:rPr>
+        <w:t xml:space="preserve">Motor Constant</w:t>
+      </w:r>
+    </w:p>
+    <w:p>
+      <w:pPr>
+        <w:pStyle w:val="BodyText"/>
+      </w:pPr>
+      <w:r>
+        <w:rPr>
+          <w:b/>
+        </w:rPr>
+        <w:t xml:space="preserve">Electric Time Constant</w:t>
+      </w:r>
+      <w:r>
+        <w:t xml:space="preserve"> </w:t>
+      </w:r>
+      <w:r>
+        <w:t xml:space="preserve">[Direct-drive robots: theory and practice]</w:t>
+      </w:r>
+    </w:p>
+    <w:p>
+      <w:pPr>
+        <w:pStyle w:val="BodyText"/>
       </w:pPr>
       <w:r>
         <w:t xml:space="preserve">Motor Constant</w:t>
@@ -1024,6 +1138,1200 @@
         <w:rPr>
           <w:b/>
         </w:rPr>
+        <w:t xml:space="preserve">Thermal Specific Torque Density</w:t>
+      </w:r>
+      <w:r>
+        <w:rPr>
+          <w:b/>
+        </w:rPr>
+        <w:t xml:space="preserve"> </w:t>
+      </w:r>
+      <m:oMath>
+        <m:sSub>
+          <m:e>
+            <m:r>
+              <m:t>K</m:t>
+            </m:r>
+          </m:e>
+          <m:sub>
+            <m:r>
+              <m:t>t</m:t>
+            </m:r>
+            <m:r>
+              <m:t>s</m:t>
+            </m:r>
+          </m:sub>
+        </m:sSub>
+      </m:oMath>
+    </w:p>
+    <w:p>
+      <w:pPr>
+        <w:pStyle w:val="BodyText"/>
+      </w:pPr>
+      <w:r>
+        <w:t xml:space="preserve">Form, [Design Principles for a Family of Direct-Drive Legged Robots], we have</w:t>
+      </w:r>
+    </w:p>
+    <w:p>
+      <w:pPr>
+        <w:pStyle w:val="BodyText"/>
+      </w:pPr>
+      <m:oMathPara>
+        <m:oMathParaPr>
+          <m:jc m:val="center"/>
+        </m:oMathParaPr>
+        <m:oMath>
+          <m:sSub>
+            <m:e>
+              <m:r>
+                <m:t>K</m:t>
+              </m:r>
+            </m:e>
+            <m:sub>
+              <m:r>
+                <m:t>t</m:t>
+              </m:r>
+              <m:r>
+                <m:t>s</m:t>
+              </m:r>
+            </m:sub>
+          </m:sSub>
+          <m:box>
+            <m:boxPr>
+              <m:opEmu m:val="1"/>
+            </m:boxPr>
+            <m:e>
+              <m:r>
+                <m:t>:=</m:t>
+              </m:r>
+            </m:e>
+          </m:box>
+          <m:f>
+            <m:fPr>
+              <m:type m:val="bar"/>
+            </m:fPr>
+            <m:num>
+              <m:sSub>
+                <m:e>
+                  <m:r>
+                    <m:t>K</m:t>
+                  </m:r>
+                </m:e>
+                <m:sub>
+                  <m:r>
+                    <m:t>t</m:t>
+                  </m:r>
+                </m:sub>
+              </m:sSub>
+            </m:num>
+            <m:den>
+              <m:r>
+                <m:t>m</m:t>
+              </m:r>
+            </m:den>
+          </m:f>
+          <m:rad>
+            <m:radPr>
+              <m:degHide m:val="1"/>
+            </m:radPr>
+            <m:deg/>
+            <m:e>
+              <m:f>
+                <m:fPr>
+                  <m:type m:val="bar"/>
+                </m:fPr>
+                <m:num>
+                  <m:r>
+                    <m:t>1</m:t>
+                  </m:r>
+                </m:num>
+                <m:den>
+                  <m:sSub>
+                    <m:e>
+                      <m:r>
+                        <m:t>R</m:t>
+                      </m:r>
+                    </m:e>
+                    <m:sub>
+                      <m:r>
+                        <m:t>t</m:t>
+                      </m:r>
+                      <m:r>
+                        <m:t>h</m:t>
+                      </m:r>
+                    </m:sub>
+                  </m:sSub>
+                  <m:r>
+                    <m:t>R</m:t>
+                  </m:r>
+                </m:den>
+              </m:f>
+            </m:e>
+          </m:rad>
+        </m:oMath>
+      </m:oMathPara>
+    </w:p>
+    <w:p>
+      <w:pPr>
+        <w:pStyle w:val="FirstParagraph"/>
+      </w:pPr>
+      <w:r>
+        <w:rPr>
+          <w:b/>
+        </w:rPr>
+        <w:t xml:space="preserve">Resistance</w:t>
+      </w:r>
+    </w:p>
+    <w:p>
+      <w:pPr>
+        <w:pStyle w:val="BodyText"/>
+      </w:pPr>
+      <w:r>
+        <w:rPr>
+          <w:b/>
+        </w:rPr>
+        <w:t xml:space="preserve">Inductance</w:t>
+      </w:r>
+    </w:p>
+    <w:p>
+      <w:pPr>
+        <w:pStyle w:val="BodyText"/>
+      </w:pPr>
+      <w:r>
+        <w:t xml:space="preserve">It will resist the rapid change in current by producing a voltage across it but its not the Back EMF.</w:t>
+      </w:r>
+      <w:r>
+        <w:t xml:space="preserve"> </w:t>
+      </w:r>
+      <w:r>
+        <w:t xml:space="preserve">Back EMF is the only component that is generate by the permanent magnet flux</w:t>
+      </w:r>
+    </w:p>
+    <w:p>
+      <w:pPr>
+        <w:pStyle w:val="BodyText"/>
+      </w:pPr>
+      <w:r>
+        <w:t xml:space="preserve">inductance, to accommodate for this. The value of the synchronous inductance</w:t>
+      </w:r>
+      <w:r>
+        <w:t xml:space="preserve"> </w:t>
+      </w:r>
+      <m:oMath>
+        <m:sSub>
+          <m:e>
+            <m:r>
+              <m:t>L</m:t>
+            </m:r>
+          </m:e>
+          <m:sub>
+            <m:r>
+              <m:t>s</m:t>
+            </m:r>
+          </m:sub>
+        </m:sSub>
+      </m:oMath>
+      <w:r>
+        <w:t xml:space="preserve"> </w:t>
+      </w:r>
+      <w:r>
+        <w:t xml:space="preserve">is:</w:t>
+      </w:r>
+    </w:p>
+    <w:p>
+      <w:pPr>
+        <w:pStyle w:val="BodyText"/>
+      </w:pPr>
+      <m:oMath>
+        <m:sSub>
+          <m:e>
+            <m:r>
+              <m:t>L</m:t>
+            </m:r>
+          </m:e>
+          <m:sub>
+            <m:r>
+              <m:t>a</m:t>
+            </m:r>
+          </m:sub>
+        </m:sSub>
+      </m:oMath>
+      <w:r>
+        <w:t xml:space="preserve"> </w:t>
+      </w:r>
+      <w:r>
+        <w:t xml:space="preserve">is ?</w:t>
+      </w:r>
+    </w:p>
+    <w:p>
+      <w:pPr>
+        <w:pStyle w:val="BodyText"/>
+      </w:pPr>
+      <w:r>
+        <w:t xml:space="preserve">The winding inductance has many theoretical and practical effects on the motor. It stores energy in the form of a magnetic field any time there is current in the winding. When a winding is switched off, this energy must go somewhere. For this reason, controllers contain</w:t>
+      </w:r>
+      <w:r>
+        <w:t xml:space="preserve"> </w:t>
+      </w:r>
+      <w:r>
+        <w:t xml:space="preserve">“</w:t>
+      </w:r>
+      <w:r>
+        <w:t xml:space="preserve">flyback diodes</w:t>
+      </w:r>
+      <w:r>
+        <w:t xml:space="preserve">”</w:t>
+      </w:r>
+      <w:r>
+        <w:t xml:space="preserve"> </w:t>
+      </w:r>
+      <w:r>
+        <w:t xml:space="preserve">that allow this current to circulate even when all the switches are open. Under highfrequency pulse-width modulated (PWM) control, the winding inductance also filters out current ripple. However, as a low-pass filter on current it also creates phase lag which is the motivation for the use of field-oriented control</w:t>
+      </w:r>
+    </w:p>
+    <w:p>
+      <w:pPr>
+        <w:pStyle w:val="BodyText"/>
+      </w:pPr>
+      <w:r>
+        <w:t xml:space="preserve">The winding inductance is a function of motor geometry and the number of turns in the winding.</w:t>
+      </w:r>
+    </w:p>
+    <w:p>
+      <w:pPr>
+        <w:pStyle w:val="BodyText"/>
+      </w:pPr>
+      <w:r>
+        <w:rPr>
+          <w:b/>
+        </w:rPr>
+        <w:t xml:space="preserve">Winding Configuration</w:t>
+      </w:r>
+    </w:p>
+    <w:p>
+      <w:pPr>
+        <w:pStyle w:val="BodyText"/>
+      </w:pPr>
+      <w:r>
+        <w:t xml:space="preserve">They have three phase windings and can be connected to each other in wye or delta configuration. Wye has higher torque (theoretically torque constant is greater by a factor</w:t>
+      </w:r>
+      <w:r>
+        <w:t xml:space="preserve"> </w:t>
+      </w:r>
+      <m:oMath>
+        <m:rad>
+          <m:radPr>
+            <m:degHide m:val="1"/>
+          </m:radPr>
+          <m:deg/>
+          <m:e>
+            <m:r>
+              <m:t>3</m:t>
+            </m:r>
+          </m:e>
+        </m:rad>
+      </m:oMath>
+      <w:r>
+        <w:t xml:space="preserve"> </w:t>
+      </w:r>
+      <w:r>
+        <w:t xml:space="preserve">[</w:t>
+      </w:r>
+      <w:hyperlink w:anchor="ref-kalouche_design_2016">
+        <w:r>
+          <w:rPr>
+            <w:rStyle w:val="Hyperlink"/>
+          </w:rPr>
+          <w:t xml:space="preserve">2</w:t>
+        </w:r>
+      </w:hyperlink>
+      <w:r>
+        <w:t xml:space="preserve">, p. 25]</w:t>
+      </w:r>
+      <w:r>
+        <w:t xml:space="preserve">) because in the wye configuration, at any time one of phase is open and other two-phase are in series thus equal current flows through them whereas in delta it gets divided into two phases. Thus more current in each phase causes more torque, one will push and another phase will pull in the wye configuration.</w:t>
+      </w:r>
+    </w:p>
+    <w:p>
+      <w:pPr>
+        <w:pStyle w:val="BodyText"/>
+      </w:pPr>
+      <w:r>
+        <w:rPr>
+          <w:b/>
+        </w:rPr>
+        <w:t xml:space="preserve">Saliency</w:t>
+      </w:r>
+    </w:p>
+    <w:p>
+      <w:pPr>
+        <w:pStyle w:val="BodyText"/>
+      </w:pPr>
+      <w:r>
+        <w:t xml:space="preserve">Saliency means the inductance varies with rotor position. [Design of Brushless Permanent-Magnet Machines, p. 68]</w:t>
+      </w:r>
+    </w:p>
+    <w:p>
+      <w:pPr>
+        <w:pStyle w:val="BodyText"/>
+      </w:pPr>
+      <w:r>
+        <w:rPr>
+          <w:b/>
+        </w:rPr>
+        <w:t xml:space="preserve">Non-Salient</w:t>
+      </w:r>
+    </w:p>
+    <w:p>
+      <w:pPr>
+        <w:pStyle w:val="BodyText"/>
+      </w:pPr>
+      <w:r>
+        <w:t xml:space="preserve">Rotor is rotationally symmetric. No tendency to align with stator if magnets in rotor are removed. i.e., No</w:t>
+      </w:r>
+      <w:r>
+        <w:t xml:space="preserve"> </w:t>
+      </w:r>
+      <w:r>
+        <w:rPr>
+          <w:b/>
+        </w:rPr>
+        <w:t xml:space="preserve">Reluctance Torque</w:t>
+      </w:r>
+      <w:r>
+        <w:t xml:space="preserve">, and winding inductance does not vary with rotor position.</w:t>
+      </w:r>
+    </w:p>
+    <w:p>
+      <w:pPr>
+        <w:pStyle w:val="BodyText"/>
+      </w:pPr>
+      <w:r>
+        <w:t xml:space="preserve">Non-salient poles exhibit both attractive &amp; repulsive gap forces -Why ? (lec1)</w:t>
+      </w:r>
+    </w:p>
+    <w:p>
+      <w:pPr>
+        <w:pStyle w:val="BodyText"/>
+      </w:pPr>
+      <w:r>
+        <w:rPr>
+          <w:b/>
+        </w:rPr>
+        <w:t xml:space="preserve">Field windings &amp; Armature winding ?</w:t>
+      </w:r>
+    </w:p>
+    <w:p>
+      <w:pPr>
+        <w:pStyle w:val="BodyText"/>
+      </w:pPr>
+      <w:r>
+        <w:rPr>
+          <w:b/>
+        </w:rPr>
+        <w:t xml:space="preserve">Proximity effect</w:t>
+      </w:r>
+    </w:p>
+    <w:p>
+      <w:pPr>
+        <w:pStyle w:val="BodyText"/>
+      </w:pPr>
+      <w:r>
+        <w:rPr>
+          <w:b/>
+        </w:rPr>
+        <w:t xml:space="preserve">what is reluctance torque?</w:t>
+      </w:r>
+    </w:p>
+    <w:p>
+      <w:pPr>
+        <w:pStyle w:val="BodyText"/>
+      </w:pPr>
+      <w:r>
+        <w:t xml:space="preserve">Electrical Loading [Design of Brushless Permanent-Magnet Machines, p. 68]</w:t>
+      </w:r>
+      <w:r>
+        <w:t xml:space="preserve"> </w:t>
+      </w:r>
+      <w:r>
+        <w:t xml:space="preserve">Magnetic Loading [Design of Brushless Permanent-Magnet Machines, p. 68]</w:t>
+      </w:r>
+    </w:p>
+    <w:p>
+      <w:pPr>
+        <w:pStyle w:val="BodyText"/>
+      </w:pPr>
+      <w:r>
+        <w:t xml:space="preserve">outrunners (rotor on the outside) will be preferrable to inrunners (rotor on the inside), and this measure is tied favorably to a motor’s radius to depth ratio [Direct-drive robots: theory and practice] as well as a large gap radius [Actuator design for high force proprioceptive control in fast legged locomotion]. The measure is fundamentally winding invariant [Leg Design for Energy Management in an Electromechanical Robot], but in practice other details of the motor’s construction (especially relating to the stator core and volume of copper) are critical.</w:t>
+      </w:r>
+    </w:p>
+    <w:p>
+      <w:pPr>
+        <w:pStyle w:val="BodyText"/>
+      </w:pPr>
+      <w:r>
+        <w:rPr>
+          <w:b/>
+        </w:rPr>
+        <w:t xml:space="preserve">[Direct-drive robots: theory and practice]</w:t>
+      </w:r>
+      <w:r>
+        <w:t xml:space="preserve"> </w:t>
+      </w:r>
+      <w:r>
+        <w:t xml:space="preserve">Direct Drive has no damping.</w:t>
+      </w:r>
+      <w:r>
+        <w:t xml:space="preserve"> </w:t>
+      </w:r>
+      <m:oMath>
+        <m:r>
+          <m:t>M</m:t>
+        </m:r>
+        <m:r>
+          <m:t>e</m:t>
+        </m:r>
+        <m:r>
+          <m:t>c</m:t>
+        </m:r>
+        <m:r>
+          <m:t>h</m:t>
+        </m:r>
+        <m:r>
+          <m:t>a</m:t>
+        </m:r>
+        <m:r>
+          <m:t>n</m:t>
+        </m:r>
+        <m:r>
+          <m:t>i</m:t>
+        </m:r>
+        <m:r>
+          <m:t>c</m:t>
+        </m:r>
+        <m:r>
+          <m:t>a</m:t>
+        </m:r>
+        <m:r>
+          <m:t>l</m:t>
+        </m:r>
+        <m:r>
+          <m:t> </m:t>
+        </m:r>
+        <m:r>
+          <m:t>T</m:t>
+        </m:r>
+        <m:r>
+          <m:t>i</m:t>
+        </m:r>
+        <m:r>
+          <m:t>m</m:t>
+        </m:r>
+        <m:r>
+          <m:t>e</m:t>
+        </m:r>
+        <m:r>
+          <m:t> </m:t>
+        </m:r>
+        <m:r>
+          <m:t>C</m:t>
+        </m:r>
+        <m:r>
+          <m:t>o</m:t>
+        </m:r>
+        <m:r>
+          <m:t>n</m:t>
+        </m:r>
+        <m:r>
+          <m:t>s</m:t>
+        </m:r>
+        <m:r>
+          <m:t>t</m:t>
+        </m:r>
+        <m:r>
+          <m:t>a</m:t>
+        </m:r>
+        <m:r>
+          <m:t>n</m:t>
+        </m:r>
+        <m:r>
+          <m:t>t</m:t>
+        </m:r>
+        <m:r>
+          <m:t> </m:t>
+        </m:r>
+        <m:sSub>
+          <m:e>
+            <m:r>
+              <m:t>τ</m:t>
+            </m:r>
+          </m:e>
+          <m:sub>
+            <m:r>
+              <m:t>m</m:t>
+            </m:r>
+            <m:r>
+              <m:t>e</m:t>
+            </m:r>
+            <m:r>
+              <m:t>c</m:t>
+            </m:r>
+            <m:r>
+              <m:t>h</m:t>
+            </m:r>
+          </m:sub>
+        </m:sSub>
+        <m:r>
+          <m:t>=</m:t>
+        </m:r>
+        <m:f>
+          <m:fPr>
+            <m:type m:val="bar"/>
+          </m:fPr>
+          <m:num>
+            <m:r>
+              <m:t>i</m:t>
+            </m:r>
+            <m:r>
+              <m:t>n</m:t>
+            </m:r>
+            <m:r>
+              <m:t>e</m:t>
+            </m:r>
+            <m:r>
+              <m:t>r</m:t>
+            </m:r>
+            <m:r>
+              <m:t>t</m:t>
+            </m:r>
+            <m:r>
+              <m:t>i</m:t>
+            </m:r>
+            <m:r>
+              <m:t>a</m:t>
+            </m:r>
+            <m:r>
+              <m:t> </m:t>
+            </m:r>
+            <m:r>
+              <m:t>l</m:t>
+            </m:r>
+            <m:r>
+              <m:t>o</m:t>
+            </m:r>
+            <m:r>
+              <m:t>a</m:t>
+            </m:r>
+            <m:r>
+              <m:t>d</m:t>
+            </m:r>
+          </m:num>
+          <m:den>
+            <m:r>
+              <m:t>m</m:t>
+            </m:r>
+            <m:r>
+              <m:t>e</m:t>
+            </m:r>
+            <m:r>
+              <m:t>c</m:t>
+            </m:r>
+            <m:r>
+              <m:t>h</m:t>
+            </m:r>
+            <m:r>
+              <m:t>a</m:t>
+            </m:r>
+            <m:r>
+              <m:t>n</m:t>
+            </m:r>
+            <m:r>
+              <m:t>i</m:t>
+            </m:r>
+            <m:r>
+              <m:t>c</m:t>
+            </m:r>
+            <m:r>
+              <m:t>a</m:t>
+            </m:r>
+            <m:r>
+              <m:t>l</m:t>
+            </m:r>
+            <m:r>
+              <m:t> </m:t>
+            </m:r>
+            <m:r>
+              <m:t>d</m:t>
+            </m:r>
+            <m:r>
+              <m:t>a</m:t>
+            </m:r>
+            <m:r>
+              <m:t>m</m:t>
+            </m:r>
+            <m:r>
+              <m:t>p</m:t>
+            </m:r>
+            <m:r>
+              <m:t>i</m:t>
+            </m:r>
+            <m:r>
+              <m:t>n</m:t>
+            </m:r>
+            <m:r>
+              <m:t>g</m:t>
+            </m:r>
+            <m:r>
+              <m:t> </m:t>
+            </m:r>
+            <m:r>
+              <m:t>c</m:t>
+            </m:r>
+            <m:r>
+              <m:t>o</m:t>
+            </m:r>
+            <m:r>
+              <m:t>e</m:t>
+            </m:r>
+            <m:r>
+              <m:t>f</m:t>
+            </m:r>
+            <m:r>
+              <m:t>f</m:t>
+            </m:r>
+            <m:r>
+              <m:t>i</m:t>
+            </m:r>
+            <m:r>
+              <m:t>c</m:t>
+            </m:r>
+            <m:r>
+              <m:t>i</m:t>
+            </m:r>
+            <m:r>
+              <m:t>e</m:t>
+            </m:r>
+            <m:r>
+              <m:t>n</m:t>
+            </m:r>
+            <m:r>
+              <m:t>t</m:t>
+            </m:r>
+          </m:den>
+        </m:f>
+      </m:oMath>
+      <w:r>
+        <w:t xml:space="preserve"> </w:t>
+      </w:r>
+      <w:r>
+        <w:t xml:space="preserve">is large comapred to geared drive.</w:t>
+      </w:r>
+    </w:p>
+    <w:p>
+      <w:pPr>
+        <w:pStyle w:val="BodyText"/>
+      </w:pPr>
+      <w:r>
+        <w:t xml:space="preserve">[Actuator design for high force proprioceptive control in fast legged locomotion]</w:t>
+      </w:r>
+    </w:p>
+    <w:p>
+      <w:pPr>
+        <w:pStyle w:val="BodyText"/>
+      </w:pPr>
+      <w:r>
+        <w:t xml:space="preserve">The gap radius is the distance from the rotating axis to the center of the gap between permanent magnets and the stator.</w:t>
+      </w:r>
+    </w:p>
+    <w:p>
+      <w:pPr>
+        <w:pStyle w:val="BodyText"/>
+      </w:pPr>
+      <w:r>
+        <w:t xml:space="preserve">The area inside of the gap increase proportionally.</w:t>
+      </w:r>
+    </w:p>
+    <w:p>
+      <w:pPr>
+        <w:pStyle w:val="BodyText"/>
+      </w:pPr>
+      <m:oMathPara>
+        <m:oMathParaPr>
+          <m:jc m:val="center"/>
+        </m:oMathParaPr>
+        <m:oMath>
+          <m:r>
+            <m:t>M</m:t>
+          </m:r>
+          <m:r>
+            <m:t>∝</m:t>
+          </m:r>
+          <m:sSub>
+            <m:e>
+              <m:r>
+                <m:t>r</m:t>
+              </m:r>
+            </m:e>
+            <m:sub>
+              <m:r>
+                <m:t>g</m:t>
+              </m:r>
+              <m:r>
+                <m:t>a</m:t>
+              </m:r>
+              <m:r>
+                <m:t>p</m:t>
+              </m:r>
+            </m:sub>
+          </m:sSub>
+        </m:oMath>
+      </m:oMathPara>
+    </w:p>
+    <w:p>
+      <w:pPr>
+        <w:pStyle w:val="FirstParagraph"/>
+      </w:pPr>
+      <m:oMathPara>
+        <m:oMathParaPr>
+          <m:jc m:val="center"/>
+        </m:oMathParaPr>
+        <m:oMath>
+          <m:r>
+            <m:t>τ</m:t>
+          </m:r>
+          <m:r>
+            <m:t>∝</m:t>
+          </m:r>
+          <m:sSubSup>
+            <m:e>
+              <m:r>
+                <m:t>r</m:t>
+              </m:r>
+            </m:e>
+            <m:sub>
+              <m:r>
+                <m:t>g</m:t>
+              </m:r>
+              <m:r>
+                <m:t>a</m:t>
+              </m:r>
+              <m:r>
+                <m:t>p</m:t>
+              </m:r>
+            </m:sub>
+            <m:sup>
+              <m:r>
+                <m:t>2</m:t>
+              </m:r>
+            </m:sup>
+          </m:sSubSup>
+        </m:oMath>
+      </m:oMathPara>
+    </w:p>
+    <w:p>
+      <w:pPr>
+        <w:pStyle w:val="FirstParagraph"/>
+      </w:pPr>
+      <m:oMathPara>
+        <m:oMathParaPr>
+          <m:jc m:val="center"/>
+        </m:oMathParaPr>
+        <m:oMath>
+          <m:r>
+            <m:t>J</m:t>
+          </m:r>
+          <m:r>
+            <m:t>∝</m:t>
+          </m:r>
+          <m:sSubSup>
+            <m:e>
+              <m:r>
+                <m:t>r</m:t>
+              </m:r>
+            </m:e>
+            <m:sub>
+              <m:r>
+                <m:t>g</m:t>
+              </m:r>
+              <m:r>
+                <m:t>a</m:t>
+              </m:r>
+              <m:r>
+                <m:t>p</m:t>
+              </m:r>
+            </m:sub>
+            <m:sup>
+              <m:r>
+                <m:t>3</m:t>
+              </m:r>
+            </m:sup>
+          </m:sSubSup>
+        </m:oMath>
+      </m:oMathPara>
+    </w:p>
+    <w:p>
+      <w:pPr>
+        <w:pStyle w:val="FirstParagraph"/>
+      </w:pPr>
+      <m:oMathPara>
+        <m:oMathParaPr>
+          <m:jc m:val="center"/>
+        </m:oMathParaPr>
+        <m:oMath>
+          <m:f>
+            <m:fPr>
+              <m:type m:val="bar"/>
+            </m:fPr>
+            <m:num>
+              <m:r>
+                <m:t>τ</m:t>
+              </m:r>
+            </m:num>
+            <m:den>
+              <m:r>
+                <m:t>M</m:t>
+              </m:r>
+            </m:den>
+          </m:f>
+          <m:r>
+            <m:t>∝</m:t>
+          </m:r>
+          <m:sSub>
+            <m:e>
+              <m:r>
+                <m:t>r</m:t>
+              </m:r>
+            </m:e>
+            <m:sub>
+              <m:r>
+                <m:t>g</m:t>
+              </m:r>
+              <m:r>
+                <m:t>a</m:t>
+              </m:r>
+              <m:r>
+                <m:t>p</m:t>
+              </m:r>
+            </m:sub>
+          </m:sSub>
+        </m:oMath>
+      </m:oMathPara>
+    </w:p>
+    <w:p>
+      <w:pPr>
+        <w:pStyle w:val="FirstParagraph"/>
+      </w:pPr>
+      <m:oMathPara>
+        <m:oMathParaPr>
+          <m:jc m:val="center"/>
+        </m:oMathParaPr>
+        <m:oMath>
+          <m:f>
+            <m:fPr>
+              <m:type m:val="bar"/>
+            </m:fPr>
+            <m:num>
+              <m:r>
+                <m:t>τ</m:t>
+              </m:r>
+            </m:num>
+            <m:den>
+              <m:r>
+                <m:t>J</m:t>
+              </m:r>
+            </m:den>
+          </m:f>
+          <m:r>
+            <m:t>∝</m:t>
+          </m:r>
+          <m:f>
+            <m:fPr>
+              <m:type m:val="bar"/>
+            </m:fPr>
+            <m:num>
+              <m:r>
+                <m:t>1</m:t>
+              </m:r>
+            </m:num>
+            <m:den>
+              <m:sSub>
+                <m:e>
+                  <m:r>
+                    <m:t>r</m:t>
+                  </m:r>
+                </m:e>
+                <m:sub>
+                  <m:r>
+                    <m:t>g</m:t>
+                  </m:r>
+                  <m:r>
+                    <m:t>a</m:t>
+                  </m:r>
+                  <m:r>
+                    <m:t>p</m:t>
+                  </m:r>
+                </m:sub>
+              </m:sSub>
+            </m:den>
+          </m:f>
+        </m:oMath>
+      </m:oMathPara>
+    </w:p>
+    <w:p>
+      <w:pPr>
+        <w:pStyle w:val="FirstParagraph"/>
+      </w:pPr>
+      <w:r>
+        <w:t xml:space="preserve">Motor Constant</w:t>
+      </w:r>
+      <w:r>
+        <w:t xml:space="preserve"> </w:t>
+      </w:r>
+      <m:oMath>
+        <m:sSub>
+          <m:e>
+            <m:r>
+              <m:t>K</m:t>
+            </m:r>
+          </m:e>
+          <m:sub>
+            <m:r>
+              <m:t>m</m:t>
+            </m:r>
+          </m:sub>
+        </m:sSub>
+      </m:oMath>
+      <w:r>
+        <w:t xml:space="preserve"> </w:t>
+      </w:r>
+      <w:r>
+        <w:t xml:space="preserve">is the ability to produce Toqrue for a given heating power loss. It is winding invariant (as long as same conductimg wires used) but why? (Leanr about turns and wires thickness) (a)[https://ipfs.io/ipfs/QmXoypizjW3WknFiJnKLwHCnL72vedxjQkDDP1mXWo6uco/wiki/Motor_constants.html]</w:t>
+      </w:r>
+    </w:p>
+    <w:p>
+      <w:pPr>
+        <w:pStyle w:val="BodyText"/>
+      </w:pPr>
+      <m:oMathPara>
+        <m:oMathParaPr>
+          <m:jc m:val="center"/>
+        </m:oMathParaPr>
+        <m:oMath>
+          <m:sSub>
+            <m:e>
+              <m:r>
+                <m:t>K</m:t>
+              </m:r>
+            </m:e>
+            <m:sub>
+              <m:r>
+                <m:t>m</m:t>
+              </m:r>
+            </m:sub>
+          </m:sSub>
+          <m:r>
+            <m:t>=</m:t>
+          </m:r>
+          <m:f>
+            <m:fPr>
+              <m:type m:val="bar"/>
+            </m:fPr>
+            <m:num>
+              <m:r>
+                <m:t>τ</m:t>
+              </m:r>
+            </m:num>
+            <m:den>
+              <m:rad>
+                <m:radPr>
+                  <m:degHide m:val="1"/>
+                </m:radPr>
+                <m:deg/>
+                <m:e>
+                  <m:sSub>
+                    <m:e>
+                      <m:r>
+                        <m:t>P</m:t>
+                      </m:r>
+                    </m:e>
+                    <m:sub>
+                      <m:r>
+                        <m:t>l</m:t>
+                      </m:r>
+                      <m:r>
+                        <m:t>o</m:t>
+                      </m:r>
+                      <m:r>
+                        <m:t>s</m:t>
+                      </m:r>
+                      <m:r>
+                        <m:t>s</m:t>
+                      </m:r>
+                    </m:sub>
+                  </m:sSub>
+                </m:e>
+              </m:rad>
+            </m:den>
+          </m:f>
+          <m:r>
+            <m:t>=</m:t>
+          </m:r>
+          <m:f>
+            <m:fPr>
+              <m:type m:val="bar"/>
+            </m:fPr>
+            <m:num>
+              <m:r>
+                <m:t>I</m:t>
+              </m:r>
+              <m:sSub>
+                <m:e>
+                  <m:r>
+                    <m:t>K</m:t>
+                  </m:r>
+                </m:e>
+                <m:sub>
+                  <m:r>
+                    <m:t>T</m:t>
+                  </m:r>
+                </m:sub>
+              </m:sSub>
+            </m:num>
+            <m:den>
+              <m:rad>
+                <m:radPr>
+                  <m:degHide m:val="1"/>
+                </m:radPr>
+                <m:deg/>
+                <m:e>
+                  <m:sSup>
+                    <m:e>
+                      <m:r>
+                        <m:t>I</m:t>
+                      </m:r>
+                    </m:e>
+                    <m:sup>
+                      <m:r>
+                        <m:t>2</m:t>
+                      </m:r>
+                    </m:sup>
+                  </m:sSup>
+                  <m:r>
+                    <m:t>R</m:t>
+                  </m:r>
+                </m:e>
+              </m:rad>
+            </m:den>
+          </m:f>
+          <m:r>
+            <m:t>=</m:t>
+          </m:r>
+          <m:f>
+            <m:fPr>
+              <m:type m:val="bar"/>
+            </m:fPr>
+            <m:num>
+              <m:sSub>
+                <m:e>
+                  <m:r>
+                    <m:t>K</m:t>
+                  </m:r>
+                </m:e>
+                <m:sub>
+                  <m:r>
+                    <m:t>T</m:t>
+                  </m:r>
+                </m:sub>
+              </m:sSub>
+            </m:num>
+            <m:den>
+              <m:rad>
+                <m:radPr>
+                  <m:degHide m:val="1"/>
+                </m:radPr>
+                <m:deg/>
+                <m:e>
+                  <m:r>
+                    <m:t>R</m:t>
+                  </m:r>
+                </m:e>
+              </m:rad>
+            </m:den>
+          </m:f>
+        </m:oMath>
+      </m:oMathPara>
+    </w:p>
+    <w:p>
+      <w:pPr>
+        <w:pStyle w:val="FirstParagraph"/>
+      </w:pPr>
+      <m:oMathPara>
+        <m:oMathParaPr>
+          <m:jc m:val="center"/>
+        </m:oMathParaPr>
+        <m:oMath>
+          <m:sSubSup>
+            <m:e>
+              <m:r>
+                <m:t>K</m:t>
+              </m:r>
+            </m:e>
+            <m:sub>
+              <m:r>
+                <m:t>m</m:t>
+              </m:r>
+            </m:sub>
+            <m:sup>
+              <m:r>
+                <m:t>2</m:t>
+              </m:r>
+            </m:sup>
+          </m:sSubSup>
+          <m:r>
+            <m:t>∝</m:t>
+          </m:r>
+          <m:sSubSup>
+            <m:e>
+              <m:r>
+                <m:t>r</m:t>
+              </m:r>
+            </m:e>
+            <m:sub>
+              <m:r>
+                <m:t>g</m:t>
+              </m:r>
+              <m:r>
+                <m:t>a</m:t>
+              </m:r>
+              <m:r>
+                <m:t>p</m:t>
+              </m:r>
+            </m:sub>
+            <m:sup>
+              <m:r>
+                <m:t>3</m:t>
+              </m:r>
+            </m:sup>
+          </m:sSubSup>
+        </m:oMath>
+      </m:oMathPara>
+    </w:p>
+    <w:p>
+      <w:pPr>
+        <w:pStyle w:val="FirstParagraph"/>
+      </w:pPr>
+      <w:r>
+        <w:t xml:space="preserve">[Actuator design for high force proprioceptive control in fast legged locomotion]</w:t>
+      </w:r>
+    </w:p>
+    <w:p>
+      <w:pPr>
+        <w:pStyle w:val="BodyText"/>
+      </w:pPr>
+      <w:r>
+        <w:rPr>
+          <w:b/>
+        </w:rPr>
         <w:t xml:space="preserve">winding Invarainat?</w:t>
       </w:r>
       <w:r>
@@ -1481,714 +2789,13 @@
     </w:p>
     <w:p>
       <w:pPr>
-        <w:pStyle w:val="Heading2"/>
-      </w:pPr>
-      <w:bookmarkStart w:id="22" w:name="design"/>
-      <w:r>
-        <w:t xml:space="preserve">Design</w:t>
-      </w:r>
-      <w:bookmarkEnd w:id="22"/>
-    </w:p>
-    <w:p>
-      <w:pPr>
         <w:pStyle w:val="Heading4"/>
       </w:pPr>
-      <w:bookmarkStart w:id="23" w:name="basic-terminology"/>
-      <w:r>
-        <w:t xml:space="preserve">Basic Terminology</w:t>
-      </w:r>
-      <w:bookmarkEnd w:id="23"/>
-    </w:p>
-    <w:p>
-      <w:pPr>
-        <w:pStyle w:val="CaptionedFigure"/>
-      </w:pPr>
-      <w:r>
-        <w:drawing>
-          <wp:inline>
-            <wp:extent cx="5334000" cy="2739360"/>
-            <wp:effectExtent b="0" l="0" r="0" t="0"/>
-            <wp:docPr descr="Stator &amp; Rotor, Source:[1]" title="" id="1" name="Picture"/>
-            <a:graphic>
-              <a:graphicData uri="http://schemas.openxmlformats.org/drawingml/2006/picture">
-                <pic:pic>
-                  <pic:nvPicPr>
-                    <pic:cNvPr descr="https://ajaygunalan.github.io/projects/asset/motor/motor_1.png" id="0" name="Picture"/>
-                    <pic:cNvPicPr>
-                      <a:picLocks noChangeArrowheads="1" noChangeAspect="1"/>
-                    </pic:cNvPicPr>
-                  </pic:nvPicPr>
-                  <pic:blipFill>
-                    <a:blip r:embed="rId24"/>
-                    <a:stretch>
-                      <a:fillRect/>
-                    </a:stretch>
-                  </pic:blipFill>
-                  <pic:spPr bwMode="auto">
-                    <a:xfrm>
-                      <a:off x="0" y="0"/>
-                      <a:ext cx="5334000" cy="2739360"/>
-                    </a:xfrm>
-                    <a:prstGeom prst="rect">
-                      <a:avLst/>
-                    </a:prstGeom>
-                    <a:noFill/>
-                    <a:ln w="9525">
-                      <a:noFill/>
-                      <a:headEnd/>
-                      <a:tailEnd/>
-                    </a:ln>
-                  </pic:spPr>
-                </pic:pic>
-              </a:graphicData>
-            </a:graphic>
-          </wp:inline>
-        </w:drawing>
-      </w:r>
-    </w:p>
-    <w:p>
-      <w:pPr>
-        <w:pStyle w:val="ImageCaption"/>
-      </w:pPr>
-      <w:r>
-        <w:t xml:space="preserve">Stator &amp; Rotor, Source:</w:t>
-      </w:r>
-      <w:r>
-        <w:t xml:space="preserve">[</w:t>
-      </w:r>
-      <w:hyperlink w:anchor="ref-colton_design_2010">
-        <w:r>
-          <w:rPr>
-            <w:rStyle w:val="Hyperlink"/>
-          </w:rPr>
-          <w:t xml:space="preserve">1</w:t>
-        </w:r>
-      </w:hyperlink>
-      <w:r>
-        <w:t xml:space="preserve">]</w:t>
-      </w:r>
-    </w:p>
-    <w:p>
-      <w:pPr>
-        <w:pStyle w:val="CaptionedFigure"/>
-      </w:pPr>
-      <w:r>
-        <w:drawing>
-          <wp:inline>
-            <wp:extent cx="5334000" cy="3871033"/>
-            <wp:effectExtent b="0" l="0" r="0" t="0"/>
-            <wp:docPr descr="Tooth &amp; Slot, Source:[1]" title="" id="1" name="Picture"/>
-            <a:graphic>
-              <a:graphicData uri="http://schemas.openxmlformats.org/drawingml/2006/picture">
-                <pic:pic>
-                  <pic:nvPicPr>
-                    <pic:cNvPr descr="https://ajaygunalan.github.io/projects/asset/motor/motor_2.png" id="0" name="Picture"/>
-                    <pic:cNvPicPr>
-                      <a:picLocks noChangeArrowheads="1" noChangeAspect="1"/>
-                    </pic:cNvPicPr>
-                  </pic:nvPicPr>
-                  <pic:blipFill>
-                    <a:blip r:embed="rId25"/>
-                    <a:stretch>
-                      <a:fillRect/>
-                    </a:stretch>
-                  </pic:blipFill>
-                  <pic:spPr bwMode="auto">
-                    <a:xfrm>
-                      <a:off x="0" y="0"/>
-                      <a:ext cx="5334000" cy="3871033"/>
-                    </a:xfrm>
-                    <a:prstGeom prst="rect">
-                      <a:avLst/>
-                    </a:prstGeom>
-                    <a:noFill/>
-                    <a:ln w="9525">
-                      <a:noFill/>
-                      <a:headEnd/>
-                      <a:tailEnd/>
-                    </a:ln>
-                  </pic:spPr>
-                </pic:pic>
-              </a:graphicData>
-            </a:graphic>
-          </wp:inline>
-        </w:drawing>
-      </w:r>
-    </w:p>
-    <w:p>
-      <w:pPr>
-        <w:pStyle w:val="ImageCaption"/>
-      </w:pPr>
-      <w:r>
-        <w:t xml:space="preserve">Tooth &amp; Slot, Source:</w:t>
-      </w:r>
-      <w:r>
-        <w:t xml:space="preserve">[</w:t>
-      </w:r>
-      <w:hyperlink w:anchor="ref-colton_design_2010">
-        <w:r>
-          <w:rPr>
-            <w:rStyle w:val="Hyperlink"/>
-          </w:rPr>
-          <w:t xml:space="preserve">1</w:t>
-        </w:r>
-      </w:hyperlink>
-      <w:r>
-        <w:t xml:space="preserve">]</w:t>
-      </w:r>
-    </w:p>
-    <w:p>
-      <w:pPr>
-        <w:pStyle w:val="BodyText"/>
-      </w:pPr>
-      <w:r>
-        <w:t xml:space="preserve">Turns</w:t>
-      </w:r>
-    </w:p>
-    <w:p>
-      <w:pPr>
-        <w:pStyle w:val="BodyText"/>
-      </w:pPr>
-      <w:r>
-        <w:t xml:space="preserve">Poles</w:t>
-      </w:r>
-    </w:p>
-    <w:p>
-      <w:pPr>
-        <w:pStyle w:val="BodyText"/>
-      </w:pPr>
-      <w:r>
-        <w:t xml:space="preserve">Motor Torque constant is not a constant</w:t>
-      </w:r>
-    </w:p>
-    <w:p>
-      <w:pPr>
-        <w:pStyle w:val="BodyText"/>
-      </w:pPr>
-      <m:oMathPara>
-        <m:oMathParaPr>
-          <m:jc m:val="center"/>
-        </m:oMathParaPr>
-        <m:oMath>
-          <m:sSub>
-            <m:e>
-              <m:r>
-                <m:t>k</m:t>
-              </m:r>
-            </m:e>
-            <m:sub>
-              <m:r>
-                <m:t>t</m:t>
-              </m:r>
-            </m:sub>
-          </m:sSub>
-          <m:r>
-            <m:t>=</m:t>
-          </m:r>
-          <m:r>
-            <m:t>f</m:t>
-          </m:r>
-          <m:r>
-            <m:t>(</m:t>
-          </m:r>
-          <m:sSub>
-            <m:e>
-              <m:r>
-                <m:t>θ</m:t>
-              </m:r>
-            </m:e>
-            <m:sub>
-              <m:r>
-                <m:t>e</m:t>
-              </m:r>
-            </m:sub>
-          </m:sSub>
-          <m:r>
-            <m:t>)</m:t>
-          </m:r>
-        </m:oMath>
-      </m:oMathPara>
-    </w:p>
-    <w:p>
-      <w:pPr>
-        <w:pStyle w:val="FirstParagraph"/>
-      </w:pPr>
-      <w:r>
-        <w:t xml:space="preserve">, where</w:t>
-      </w:r>
-      <w:r>
-        <w:t xml:space="preserve"> </w:t>
-      </w:r>
-      <m:oMath>
-        <m:sSub>
-          <m:e>
-            <m:r>
-              <m:t>θ</m:t>
-            </m:r>
-          </m:e>
-          <m:sub>
-            <m:r>
-              <m:t>e</m:t>
-            </m:r>
-          </m:sub>
-        </m:sSub>
-      </m:oMath>
-      <w:r>
-        <w:t xml:space="preserve"> </w:t>
-      </w:r>
-      <w:r>
-        <w:t xml:space="preserve">is the electrical angle for BLDC Motor</w:t>
-      </w:r>
-    </w:p>
-    <w:p>
-      <w:pPr>
-        <w:pStyle w:val="BodyText"/>
-      </w:pPr>
-      <m:oMathPara>
-        <m:oMathParaPr>
-          <m:jc m:val="center"/>
-        </m:oMathParaPr>
-        <m:oMath>
-          <m:sSub>
-            <m:e>
-              <m:r>
-                <m:t>k</m:t>
-              </m:r>
-            </m:e>
-            <m:sub>
-              <m:r>
-                <m:t>t</m:t>
-              </m:r>
-            </m:sub>
-          </m:sSub>
-          <m:r>
-            <m:t>=</m:t>
-          </m:r>
-          <m:r>
-            <m:t>c</m:t>
-          </m:r>
-        </m:oMath>
-      </m:oMathPara>
-    </w:p>
-    <w:p>
-      <w:pPr>
-        <w:pStyle w:val="FirstParagraph"/>
-      </w:pPr>
-      <w:r>
-        <w:t xml:space="preserve">, where</w:t>
-      </w:r>
-      <w:r>
-        <w:t xml:space="preserve"> </w:t>
-      </w:r>
-      <m:oMath>
-        <m:r>
-          <m:t>c</m:t>
-        </m:r>
-      </m:oMath>
-      <w:r>
-        <w:t xml:space="preserve"> </w:t>
-      </w:r>
-      <w:r>
-        <w:t xml:space="preserve">is conatant for DC motor</w:t>
-      </w:r>
-    </w:p>
-    <w:p>
-      <w:pPr>
-        <w:pStyle w:val="BodyText"/>
-      </w:pPr>
-      <w:r>
-        <w:t xml:space="preserve">Resistance</w:t>
-      </w:r>
-    </w:p>
-    <w:p>
-      <w:pPr>
-        <w:pStyle w:val="Heading4"/>
-      </w:pPr>
-      <w:bookmarkStart w:id="26" w:name="inductance"/>
-      <w:r>
-        <w:t xml:space="preserve">Inductance</w:t>
+      <w:bookmarkStart w:id="26" w:name="losses"/>
+      <w:r>
+        <w:t xml:space="preserve">Losses</w:t>
       </w:r>
       <w:bookmarkEnd w:id="26"/>
-    </w:p>
-    <w:p>
-      <w:pPr>
-        <w:pStyle w:val="FirstParagraph"/>
-      </w:pPr>
-      <w:r>
-        <w:t xml:space="preserve">It will resist the rapid change in current by producing a voltage across it but its not the Back EMF.</w:t>
-      </w:r>
-    </w:p>
-    <w:p>
-      <w:pPr>
-        <w:pStyle w:val="BodyText"/>
-      </w:pPr>
-      <w:r>
-        <w:t xml:space="preserve">Back EMF is the only component that is generate by the permanent magnet flux</w:t>
-      </w:r>
-    </w:p>
-    <w:p>
-      <w:pPr>
-        <w:pStyle w:val="BodyText"/>
-      </w:pPr>
-      <w:r>
-        <w:t xml:space="preserve">The value of inductance is less straightforward to calculate because the phases are not</w:t>
-      </w:r>
-      <w:r>
-        <w:t xml:space="preserve"> </w:t>
-      </w:r>
-      <w:r>
-        <w:t xml:space="preserve">magnetically independent. That is, current in one phase can induce flux in another. Under</w:t>
-      </w:r>
-      <w:r>
-        <w:t xml:space="preserve"> </w:t>
-      </w:r>
-      <w:r>
-        <w:t xml:space="preserve">sinusoidal drive currents, it is possible to use a lumped inductance, called the synchronous</w:t>
-      </w:r>
-      <w:r>
-        <w:t xml:space="preserve"> </w:t>
-      </w:r>
-      <w:r>
-        <w:t xml:space="preserve">inductance, to accommodate for this. The value of the synchronous inductance</w:t>
-      </w:r>
-      <w:r>
-        <w:t xml:space="preserve"> </w:t>
-      </w:r>
-      <m:oMath>
-        <m:sSub>
-          <m:e>
-            <m:r>
-              <m:t>L</m:t>
-            </m:r>
-          </m:e>
-          <m:sub>
-            <m:r>
-              <m:t>s</m:t>
-            </m:r>
-          </m:sub>
-        </m:sSub>
-      </m:oMath>
-      <w:r>
-        <w:t xml:space="preserve"> </w:t>
-      </w:r>
-      <w:r>
-        <w:t xml:space="preserve">is:</w:t>
-      </w:r>
-    </w:p>
-    <w:p>
-      <w:pPr>
-        <w:pStyle w:val="BodyText"/>
-      </w:pPr>
-      <m:oMathPara>
-        <m:oMathParaPr>
-          <m:jc m:val="center"/>
-        </m:oMathParaPr>
-        <m:oMath>
-          <m:sSub>
-            <m:e>
-              <m:r>
-                <m:t>L</m:t>
-              </m:r>
-            </m:e>
-            <m:sub>
-              <m:r>
-                <m:t>s</m:t>
-              </m:r>
-            </m:sub>
-          </m:sSub>
-          <m:r>
-            <m:t>=</m:t>
-          </m:r>
-          <m:f>
-            <m:fPr>
-              <m:type m:val="bar"/>
-            </m:fPr>
-            <m:num>
-              <m:r>
-                <m:t>3</m:t>
-              </m:r>
-            </m:num>
-            <m:den>
-              <m:r>
-                <m:t>2</m:t>
-              </m:r>
-            </m:den>
-          </m:f>
-          <m:sSub>
-            <m:e>
-              <m:r>
-                <m:t>L</m:t>
-              </m:r>
-            </m:e>
-            <m:sub>
-              <m:r>
-                <m:t>a</m:t>
-              </m:r>
-            </m:sub>
-          </m:sSub>
-        </m:oMath>
-      </m:oMathPara>
-    </w:p>
-    <w:p>
-      <w:pPr>
-        <w:pStyle w:val="FirstParagraph"/>
-      </w:pPr>
-      <m:oMath>
-        <m:sSub>
-          <m:e>
-            <m:r>
-              <m:t>L</m:t>
-            </m:r>
-          </m:e>
-          <m:sub>
-            <m:r>
-              <m:t>a</m:t>
-            </m:r>
-          </m:sub>
-        </m:sSub>
-      </m:oMath>
-      <w:r>
-        <w:t xml:space="preserve"> </w:t>
-      </w:r>
-      <w:r>
-        <w:t xml:space="preserve">is ?</w:t>
-      </w:r>
-    </w:p>
-    <w:p>
-      <w:pPr>
-        <w:pStyle w:val="BodyText"/>
-      </w:pPr>
-      <w:r>
-        <w:t xml:space="preserve">The winding inductance has many theoretical and practical effects on the motor. It stores energy in the form of a magnetic field any time there is current in the winding. When a winding is switched off, this energy must go somewhere. For this reason, controllers contain</w:t>
-      </w:r>
-      <w:r>
-        <w:t xml:space="preserve"> </w:t>
-      </w:r>
-      <w:r>
-        <w:t xml:space="preserve">“</w:t>
-      </w:r>
-      <w:r>
-        <w:t xml:space="preserve">flyback diodes</w:t>
-      </w:r>
-      <w:r>
-        <w:t xml:space="preserve">”</w:t>
-      </w:r>
-      <w:r>
-        <w:t xml:space="preserve"> </w:t>
-      </w:r>
-      <w:r>
-        <w:t xml:space="preserve">that allow this current to circulate even when all the switches are open. Under highfrequency pulse-width modulated (PWM) control, the winding inductance also filters out current ripple. However, as a low-pass filter on current it also creates phase lag which is the motivation for the use of field-oriented control</w:t>
-      </w:r>
-    </w:p>
-    <w:p>
-      <w:pPr>
-        <w:pStyle w:val="BodyText"/>
-      </w:pPr>
-      <w:r>
-        <w:t xml:space="preserve">The winding inductance is a function of motor geometry and the number of turns in the winding.</w:t>
-      </w:r>
-    </w:p>
-    <w:p>
-      <w:pPr>
-        <w:pStyle w:val="Heading4"/>
-      </w:pPr>
-      <w:bookmarkStart w:id="27" w:name="saliency"/>
-      <w:r>
-        <w:t xml:space="preserve">Saliency</w:t>
-      </w:r>
-      <w:bookmarkEnd w:id="27"/>
-    </w:p>
-    <w:p>
-      <w:pPr>
-        <w:pStyle w:val="FirstParagraph"/>
-      </w:pPr>
-      <w:r>
-        <w:t xml:space="preserve">In non-salient motors, also called round rotor,the inductance is not a function of electrical angle. This is the case for motors with complete radial symmetry of the rotor’s steel backing at any angle. (The magnets themselves don’t matter, since they have nearly the same permeability as air.) Motors with magnets mounted to the surface of the rotor steel, called surface permanent manget (SPM), fall into this category.</w:t>
-      </w:r>
-    </w:p>
-    <w:p>
-      <w:pPr>
-        <w:pStyle w:val="BodyText"/>
-      </w:pPr>
-      <w:r>
-        <w:t xml:space="preserve">Salient motors have an inductance that varies periodically with electrical angle. This is the case if the rotor’s steel backing is different at the poles than in between them. Motors with magnets embedded in the steel backing, called interior permanent magnet (IPM), fall into this category. This report will focus exclusively on non-salient, SPM motors. Torque production for salient motors requires a slightly more complicated analysis.</w:t>
-      </w:r>
-    </w:p>
-    <w:p>
-      <w:pPr>
-        <w:pStyle w:val="BodyText"/>
-      </w:pPr>
-      <w:r>
-        <w:t xml:space="preserve">Saliency</w:t>
-      </w:r>
-    </w:p>
-    <w:p>
-      <w:pPr>
-        <w:pStyle w:val="BodyText"/>
-      </w:pPr>
-      <w:r>
-        <w:t xml:space="preserve">Salient poles exhibit mainly attractive tangential gap forces -Why ?</w:t>
-      </w:r>
-      <w:r>
-        <w:t xml:space="preserve"> </w:t>
-      </w:r>
-      <w:r>
-        <w:t xml:space="preserve">Non-salient poles exhibit both attractive &amp; repulsive gap forces -Why ? (lec1)</w:t>
-      </w:r>
-    </w:p>
-    <w:p>
-      <w:pPr>
-        <w:pStyle w:val="BodyText"/>
-      </w:pPr>
-      <w:r>
-        <w:rPr>
-          <w:b/>
-        </w:rPr>
-        <w:t xml:space="preserve">what are field windings and armature winding ?</w:t>
-      </w:r>
-    </w:p>
-    <w:p>
-      <w:pPr>
-        <w:pStyle w:val="BodyText"/>
-      </w:pPr>
-      <w:r>
-        <w:t xml:space="preserve">No. of Stator slot = 3 * No. of Poles</w:t>
-      </w:r>
-    </w:p>
-    <w:p>
-      <w:pPr>
-        <w:pStyle w:val="BodyText"/>
-      </w:pPr>
-      <w:r>
-        <w:t xml:space="preserve">No. of Stator slot/pole =</w:t>
-      </w:r>
-    </w:p>
-    <w:p>
-      <w:pPr>
-        <w:pStyle w:val="BodyText"/>
-      </w:pPr>
-      <w:r>
-        <w:rPr>
-          <w:b/>
-        </w:rPr>
-        <w:t xml:space="preserve">Skin effect causes current eveneness</w:t>
-      </w:r>
-    </w:p>
-    <w:p>
-      <w:pPr>
-        <w:pStyle w:val="BodyText"/>
-      </w:pPr>
-      <w:r>
-        <w:rPr>
-          <w:b/>
-        </w:rPr>
-        <w:t xml:space="preserve">Proximity effect</w:t>
-      </w:r>
-    </w:p>
-    <w:p>
-      <w:pPr>
-        <w:pStyle w:val="BodyText"/>
-      </w:pPr>
-      <w:r>
-        <w:rPr>
-          <w:b/>
-        </w:rPr>
-        <w:t xml:space="preserve">what is reluctance torque?</w:t>
-      </w:r>
-    </w:p>
-    <w:p>
-      <w:pPr>
-        <w:pStyle w:val="Heading4"/>
-      </w:pPr>
-      <w:bookmarkStart w:id="28" w:name="air-gap"/>
-      <w:r>
-        <w:t xml:space="preserve">Air Gap</w:t>
-      </w:r>
-      <w:bookmarkEnd w:id="28"/>
-    </w:p>
-    <w:p>
-      <w:pPr>
-        <w:pStyle w:val="Heading4"/>
-      </w:pPr>
-      <w:bookmarkStart w:id="29" w:name="slot"/>
-      <w:r>
-        <w:t xml:space="preserve">Slot</w:t>
-      </w:r>
-      <w:bookmarkEnd w:id="29"/>
-    </w:p>
-    <w:p>
-      <w:pPr>
-        <w:pStyle w:val="Heading4"/>
-      </w:pPr>
-      <w:bookmarkStart w:id="30" w:name="winding-configuration"/>
-      <w:r>
-        <w:t xml:space="preserve">Winding Configuration</w:t>
-      </w:r>
-      <w:bookmarkEnd w:id="30"/>
-    </w:p>
-    <w:p>
-      <w:pPr>
-        <w:pStyle w:val="FirstParagraph"/>
-      </w:pPr>
-      <w:r>
-        <w:t xml:space="preserve">They have three phase windings and can be connected to each other in wye or delta configuration. Wye has higher torque (theoretically torque constant is greater by a factor</w:t>
-      </w:r>
-      <w:r>
-        <w:t xml:space="preserve"> </w:t>
-      </w:r>
-      <m:oMath>
-        <m:rad>
-          <m:radPr>
-            <m:degHide m:val="1"/>
-          </m:radPr>
-          <m:deg/>
-          <m:e>
-            <m:r>
-              <m:t>3</m:t>
-            </m:r>
-          </m:e>
-        </m:rad>
-      </m:oMath>
-      <w:r>
-        <w:t xml:space="preserve"> </w:t>
-      </w:r>
-      <w:r>
-        <w:t xml:space="preserve">[</w:t>
-      </w:r>
-      <w:hyperlink w:anchor="ref-kalouche_design_2016">
-        <w:r>
-          <w:rPr>
-            <w:rStyle w:val="Hyperlink"/>
-          </w:rPr>
-          <w:t xml:space="preserve">2</w:t>
-        </w:r>
-      </w:hyperlink>
-      <w:r>
-        <w:t xml:space="preserve">, p. 25]</w:t>
-      </w:r>
-      <w:r>
-        <w:t xml:space="preserve">) because in the wye configuration, at any time one of phase is open and other two-phase are in series thus equal current flows through them whereas in delta it gets divided into two phases. Thus more current in each phase causes more torque, one will push and another phase will pull in the wye configuration.</w:t>
-      </w:r>
-    </w:p>
-    <w:p>
-      <w:pPr>
-        <w:pStyle w:val="Heading2"/>
-      </w:pPr>
-      <w:bookmarkStart w:id="31" w:name="dynamics"/>
-      <w:r>
-        <w:t xml:space="preserve">Dynamics</w:t>
-      </w:r>
-      <w:bookmarkEnd w:id="31"/>
-    </w:p>
-    <w:p>
-      <w:pPr>
-        <w:pStyle w:val="Heading4"/>
-      </w:pPr>
-      <w:bookmarkStart w:id="32" w:name="losses"/>
-      <w:r>
-        <w:t xml:space="preserve">Losses</w:t>
-      </w:r>
-      <w:bookmarkEnd w:id="32"/>
     </w:p>
     <w:p>
       <w:pPr>
@@ -2364,11 +2971,11 @@
       <w:pPr>
         <w:pStyle w:val="Heading2"/>
       </w:pPr>
-      <w:bookmarkStart w:id="33" w:name="selection-criteria"/>
+      <w:bookmarkStart w:id="27" w:name="selection-criteria"/>
       <w:r>
         <w:t xml:space="preserve">Selection Criteria</w:t>
       </w:r>
-      <w:bookmarkEnd w:id="33"/>
+      <w:bookmarkEnd w:id="27"/>
     </w:p>
     <w:p>
       <w:pPr>
@@ -2422,24 +3029,24 @@
       <w:pPr>
         <w:pStyle w:val="Heading2"/>
       </w:pPr>
-      <w:bookmarkStart w:id="34" w:name="drive"/>
+      <w:bookmarkStart w:id="28" w:name="drive"/>
       <w:r>
         <w:t xml:space="preserve">Drive</w:t>
       </w:r>
-      <w:bookmarkEnd w:id="34"/>
+      <w:bookmarkEnd w:id="28"/>
     </w:p>
     <w:p>
       <w:pPr>
         <w:pStyle w:val="Heading2"/>
       </w:pPr>
-      <w:bookmarkStart w:id="35" w:name="references"/>
+      <w:bookmarkStart w:id="29" w:name="references"/>
       <w:r>
         <w:t xml:space="preserve">References</w:t>
       </w:r>
-      <w:bookmarkEnd w:id="35"/>
-    </w:p>
-    <w:bookmarkStart w:id="39" w:name="refs"/>
-    <w:bookmarkStart w:id="37" w:name="ref-colton_design_2010"/>
+      <w:bookmarkEnd w:id="29"/>
+    </w:p>
+    <w:bookmarkStart w:id="33" w:name="refs"/>
+    <w:bookmarkStart w:id="31" w:name="ref-colton_design_2010"/>
     <w:p>
       <w:pPr>
         <w:pStyle w:val="Bibliography"/>
@@ -2450,7 +3057,7 @@
       <w:r>
         <w:t xml:space="preserve"> </w:t>
       </w:r>
-      <w:hyperlink r:id="rId36">
+      <w:hyperlink r:id="rId30">
         <w:r>
           <w:rPr>
             <w:rStyle w:val="Hyperlink"/>
@@ -2459,8 +3066,8 @@
         </w:r>
       </w:hyperlink>
     </w:p>
-    <w:bookmarkEnd w:id="37"/>
-    <w:bookmarkStart w:id="38" w:name="ref-kalouche_design_2016"/>
+    <w:bookmarkEnd w:id="31"/>
+    <w:bookmarkStart w:id="32" w:name="ref-kalouche_design_2016"/>
     <w:p>
       <w:pPr>
         <w:pStyle w:val="Bibliography"/>
@@ -2472,8 +3079,8 @@
         <w:t xml:space="preserve"> </w:t>
       </w:r>
     </w:p>
-    <w:bookmarkEnd w:id="38"/>
-    <w:bookmarkEnd w:id="39"/>
+    <w:bookmarkEnd w:id="32"/>
+    <w:bookmarkEnd w:id="33"/>
     <w:sectPr/>
   </w:body>
 </w:document>

</xml_diff>

<commit_message>
rought draft from ubuntu 16
</commit_message>
<xml_diff>
--- a/_includes/projects/motor/output/motor.docx
+++ b/_includes/projects/motor/output/motor.docx
@@ -9,6 +9,20 @@
       <w:r>
         <w:t xml:space="preserve">BLDC</w:t>
       </w:r>
+    </w:p>
+    <w:p>
+      <w:pPr>
+        <w:pStyle w:val="Author"/>
+      </w:pPr>
+      <w:r>
+        <w:t xml:space="preserve">Ajay</w:t>
+      </w:r>
+      <w:r>
+        <w:t xml:space="preserve"> </w:t>
+      </w:r>
+      <w:r>
+        <w:t xml:space="preserve">G</w:t>
+      </w:r>
       <w:r>
         <w:t xml:space="preserve"> </w:t>
       </w:r>
@@ -18,26 +32,6 @@
     </w:p>
     <w:p>
       <w:pPr>
-        <w:pStyle w:val="Author"/>
-      </w:pPr>
-      <w:r>
-        <w:t xml:space="preserve">Ajay</w:t>
-      </w:r>
-      <w:r>
-        <w:t xml:space="preserve"> </w:t>
-      </w:r>
-      <w:r>
-        <w:t xml:space="preserve">G</w:t>
-      </w:r>
-      <w:r>
-        <w:t xml:space="preserve"> </w:t>
-      </w:r>
-      <w:r>
-        <w:t xml:space="preserve">%</w:t>
-      </w:r>
-    </w:p>
-    <w:p>
-      <w:pPr>
         <w:pStyle w:val="Heading3"/>
       </w:pPr>
       <w:bookmarkStart w:id="20" w:name="why-bldc"/>
@@ -66,7 +60,6 @@
     </w:p>
     <w:p>
       <w:pPr>
-        <w:pStyle w:val="Compact"/>
         <w:numPr>
           <w:numId w:val="1001"/>
           <w:ilvl w:val="0"/>
@@ -81,7 +74,10 @@
     </w:p>
     <w:p>
       <w:pPr>
-        <w:pStyle w:val="FirstParagraph"/>
+        <w:numPr>
+          <w:numId w:val="1000"/>
+          <w:ilvl w:val="0"/>
+        </w:numPr>
       </w:pPr>
       <w:r>
         <w:t xml:space="preserve">Stator, the stationary part, which carries the winding.Rotor, the rotating part, which carries the magnet.</w:t>
@@ -90,6 +86,10 @@
     <w:p>
       <w:pPr>
         <w:pStyle w:val="CaptionedFigure"/>
+        <w:numPr>
+          <w:numId w:val="1000"/>
+          <w:ilvl w:val="0"/>
+        </w:numPr>
       </w:pPr>
       <w:r>
         <w:drawing>
@@ -137,6 +137,10 @@
     <w:p>
       <w:pPr>
         <w:pStyle w:val="ImageCaption"/>
+        <w:numPr>
+          <w:numId w:val="1000"/>
+          <w:ilvl w:val="0"/>
+        </w:numPr>
       </w:pPr>
       <w:r>
         <w:t xml:space="preserve">Stator &amp; Rotor, Source:</w:t>
@@ -158,9 +162,8 @@
     </w:p>
     <w:p>
       <w:pPr>
-        <w:pStyle w:val="Compact"/>
-        <w:numPr>
-          <w:numId w:val="1002"/>
+        <w:numPr>
+          <w:numId w:val="1001"/>
           <w:ilvl w:val="0"/>
         </w:numPr>
       </w:pPr>
@@ -173,7 +176,10 @@
     </w:p>
     <w:p>
       <w:pPr>
-        <w:pStyle w:val="FirstParagraph"/>
+        <w:numPr>
+          <w:numId w:val="1000"/>
+          <w:ilvl w:val="0"/>
+        </w:numPr>
       </w:pPr>
       <w:r>
         <w:t xml:space="preserve">Air gap is the distance between stator and rotor.</w:t>
@@ -181,9 +187,8 @@
     </w:p>
     <w:p>
       <w:pPr>
-        <w:pStyle w:val="Compact"/>
-        <w:numPr>
-          <w:numId w:val="1003"/>
+        <w:numPr>
+          <w:numId w:val="1001"/>
           <w:ilvl w:val="0"/>
         </w:numPr>
       </w:pPr>
@@ -196,7 +201,10 @@
     </w:p>
     <w:p>
       <w:pPr>
-        <w:pStyle w:val="FirstParagraph"/>
+        <w:numPr>
+          <w:numId w:val="1000"/>
+          <w:ilvl w:val="0"/>
+        </w:numPr>
       </w:pPr>
       <w:r>
         <w:t xml:space="preserve">Winding are wounded around the laminated steel structure called tooth which channels more magnetic flux through them. Slot is the section between two tooth. Three phase motor have slots (and teeth) that is evenly divisible by three.</w:t>
@@ -205,6 +213,10 @@
     <w:p>
       <w:pPr>
         <w:pStyle w:val="CaptionedFigure"/>
+        <w:numPr>
+          <w:numId w:val="1000"/>
+          <w:ilvl w:val="0"/>
+        </w:numPr>
       </w:pPr>
       <w:r>
         <w:drawing>
@@ -252,6 +264,10 @@
     <w:p>
       <w:pPr>
         <w:pStyle w:val="ImageCaption"/>
+        <w:numPr>
+          <w:numId w:val="1000"/>
+          <w:ilvl w:val="0"/>
+        </w:numPr>
       </w:pPr>
       <w:r>
         <w:t xml:space="preserve">Tooth &amp; Slot, Source:</w:t>
@@ -273,9 +289,8 @@
     </w:p>
     <w:p>
       <w:pPr>
-        <w:pStyle w:val="Compact"/>
-        <w:numPr>
-          <w:numId w:val="1004"/>
+        <w:numPr>
+          <w:numId w:val="1001"/>
           <w:ilvl w:val="0"/>
         </w:numPr>
       </w:pPr>
@@ -288,7 +303,10 @@
     </w:p>
     <w:p>
       <w:pPr>
-        <w:pStyle w:val="FirstParagraph"/>
+        <w:numPr>
+          <w:numId w:val="1000"/>
+          <w:ilvl w:val="0"/>
+        </w:numPr>
       </w:pPr>
       <w:r>
         <w:t xml:space="preserve">A phase is an individual group of windings with a single terminal accessible from outside the motor. Most brushless motors are three-phase.</w:t>
@@ -297,7 +315,7 @@
     <w:p>
       <w:pPr>
         <w:numPr>
-          <w:numId w:val="1005"/>
+          <w:numId w:val="1001"/>
           <w:ilvl w:val="0"/>
         </w:numPr>
       </w:pPr>
@@ -311,7 +329,18 @@
     <w:p>
       <w:pPr>
         <w:numPr>
-          <w:numId w:val="1005"/>
+          <w:numId w:val="1000"/>
+          <w:ilvl w:val="0"/>
+        </w:numPr>
+      </w:pPr>
+      <w:r>
+        <w:t xml:space="preserve">Each individual loop of wire making up phase winding.</w:t>
+      </w:r>
+    </w:p>
+    <w:p>
+      <w:pPr>
+        <w:numPr>
+          <w:numId w:val="1001"/>
           <w:ilvl w:val="0"/>
         </w:numPr>
       </w:pPr>
@@ -350,7 +379,10 @@
     </w:p>
     <w:p>
       <w:pPr>
-        <w:pStyle w:val="FirstParagraph"/>
+        <w:numPr>
+          <w:numId w:val="1000"/>
+          <w:ilvl w:val="0"/>
+        </w:numPr>
       </w:pPr>
       <w:r>
         <w:t xml:space="preserve">A pole is a single permanent magnet pole, north or south. The minimum number of poles is two, but motors can have any even number of poles.The number of poles is not directly related to the number of slots, although there are common combinations of slot and pole counts that work well [6].</w:t>
@@ -359,7 +391,7 @@
     <w:p>
       <w:pPr>
         <w:numPr>
-          <w:numId w:val="1006"/>
+          <w:numId w:val="1001"/>
           <w:ilvl w:val="0"/>
         </w:numPr>
       </w:pPr>
@@ -373,7 +405,7 @@
     <w:p>
       <w:pPr>
         <w:numPr>
-          <w:numId w:val="1006"/>
+          <w:numId w:val="1001"/>
           <w:ilvl w:val="0"/>
         </w:numPr>
       </w:pPr>
@@ -450,7 +482,10 @@
     </w:p>
     <w:p>
       <w:pPr>
-        <w:pStyle w:val="FirstParagraph"/>
+        <w:numPr>
+          <w:numId w:val="1000"/>
+          <w:ilvl w:val="0"/>
+        </w:numPr>
       </w:pPr>
       <w:r>
         <w:t xml:space="preserve">Mechanical degrees in a motor refers to the rotation of the shaft. 1 revolution of the shaft equals 360 mechanical degrees.</w:t>
@@ -458,7 +493,10 @@
     </w:p>
     <w:p>
       <w:pPr>
-        <w:pStyle w:val="BodyText"/>
+        <w:numPr>
+          <w:numId w:val="1000"/>
+          <w:ilvl w:val="0"/>
+        </w:numPr>
       </w:pPr>
       <w:r>
         <w:t xml:space="preserve">When an electrical machine is operating as a motor, the idea is to create a traveling, rotating magnetic field, via the stator so that this moving flux attracts the rotor. Electrical degree is the angle through which magnetic field has rotated, i.e., 360 electrical degree equals transistion form</w:t>
@@ -514,7 +552,10 @@
     </w:p>
     <w:p>
       <w:pPr>
-        <w:pStyle w:val="BodyText"/>
+        <w:numPr>
+          <w:numId w:val="1000"/>
+          <w:ilvl w:val="0"/>
+        </w:numPr>
       </w:pPr>
       <w:r>
         <w:t xml:space="preserve">A 2 pole motor has 1</w:t>
@@ -738,9 +779,8 @@
     </w:p>
     <w:p>
       <w:pPr>
-        <w:pStyle w:val="Compact"/>
-        <w:numPr>
-          <w:numId w:val="1007"/>
+        <w:numPr>
+          <w:numId w:val="1002"/>
           <w:ilvl w:val="0"/>
         </w:numPr>
       </w:pPr>
@@ -779,15 +819,10 @@
     </w:p>
     <w:p>
       <w:pPr>
-        <w:pStyle w:val="FirstParagraph"/>
-      </w:pPr>
-      <w:r>
-        <w:t xml:space="preserve">electrical input power = rate of production of heat in conductor + mechanical output power</w:t>
-      </w:r>
-    </w:p>
-    <w:p>
-      <w:pPr>
-        <w:pStyle w:val="BodyText"/>
+        <w:numPr>
+          <w:numId w:val="1000"/>
+          <w:ilvl w:val="0"/>
+        </w:numPr>
       </w:pPr>
       <w:r>
         <w:t xml:space="preserve">Under</w:t>
@@ -806,6 +841,17 @@
       </w:r>
       <w:r>
         <w:t xml:space="preserve">(accelration is zero), we have :</w:t>
+      </w:r>
+    </w:p>
+    <w:p>
+      <w:pPr>
+        <w:numPr>
+          <w:numId w:val="1000"/>
+          <w:ilvl w:val="0"/>
+        </w:numPr>
+      </w:pPr>
+      <w:r>
+        <w:t xml:space="preserve">electrical input power = rate of production of heat in conductor + mechanical output power</w:t>
       </w:r>
     </w:p>
     <w:p>
@@ -876,7 +922,10 @@
     </w:p>
     <w:p>
       <w:pPr>
-        <w:pStyle w:val="FirstParagraph"/>
+        <w:numPr>
+          <w:numId w:val="1000"/>
+          <w:ilvl w:val="0"/>
+        </w:numPr>
       </w:pPr>
       <w:r>
         <w:t xml:space="preserve">When</w:t>
@@ -949,7 +998,10 @@
     </w:p>
     <w:p>
       <w:pPr>
-        <w:pStyle w:val="FirstParagraph"/>
+        <w:numPr>
+          <w:numId w:val="1000"/>
+          <w:ilvl w:val="0"/>
+        </w:numPr>
       </w:pPr>
       <w:r>
         <w:t xml:space="preserve">(assuming same load with</w:t>
@@ -1204,7 +1256,10 @@
     </w:p>
     <w:p>
       <w:pPr>
-        <w:pStyle w:val="FirstParagraph"/>
+        <w:numPr>
+          <w:numId w:val="1000"/>
+          <w:ilvl w:val="0"/>
+        </w:numPr>
       </w:pPr>
       <w:r>
         <w:t xml:space="preserve">where</w:t>
@@ -1235,7 +1290,10 @@
     </w:p>
     <w:p>
       <w:pPr>
-        <w:pStyle w:val="BodyText"/>
+        <w:numPr>
+          <w:numId w:val="1000"/>
+          <w:ilvl w:val="0"/>
+        </w:numPr>
       </w:pPr>
       <w:r>
         <w:t xml:space="preserve">thus, we get</w:t>
@@ -1333,7 +1391,10 @@
     </w:p>
     <w:p>
       <w:pPr>
-        <w:pStyle w:val="FirstParagraph"/>
+        <w:numPr>
+          <w:numId w:val="1000"/>
+          <w:ilvl w:val="0"/>
+        </w:numPr>
       </w:pPr>
       <w:r>
         <w:t xml:space="preserve">where</w:t>
@@ -1568,7 +1629,10 @@
     </w:p>
     <w:p>
       <w:pPr>
-        <w:pStyle w:val="FirstParagraph"/>
+        <w:numPr>
+          <w:numId w:val="1000"/>
+          <w:ilvl w:val="0"/>
+        </w:numPr>
       </w:pPr>
       <w:r>
         <w:t xml:space="preserve">where</w:t>
@@ -1608,7 +1672,10 @@
     </w:p>
     <w:p>
       <w:pPr>
-        <w:pStyle w:val="BodyText"/>
+        <w:numPr>
+          <w:numId w:val="1000"/>
+          <w:ilvl w:val="0"/>
+        </w:numPr>
       </w:pPr>
       <w:r>
         <w:t xml:space="preserve">In reality,</w:t>
@@ -1677,7 +1744,10 @@
     </w:p>
     <w:p>
       <w:pPr>
-        <w:pStyle w:val="BodyText"/>
+        <w:numPr>
+          <w:numId w:val="1000"/>
+          <w:ilvl w:val="0"/>
+        </w:numPr>
       </w:pPr>
       <w:r>
         <w:t xml:space="preserve">To avoid the torque ripple, we can:</w:t>
@@ -1687,8 +1757,8 @@
       <w:pPr>
         <w:pStyle w:val="Compact"/>
         <w:numPr>
-          <w:numId w:val="1008"/>
-          <w:ilvl w:val="0"/>
+          <w:numId w:val="1003"/>
+          <w:ilvl w:val="1"/>
         </w:numPr>
       </w:pPr>
       <w:r>
@@ -1699,8 +1769,8 @@
       <w:pPr>
         <w:pStyle w:val="Compact"/>
         <w:numPr>
-          <w:numId w:val="1008"/>
-          <w:ilvl w:val="0"/>
+          <w:numId w:val="1003"/>
+          <w:ilvl w:val="1"/>
         </w:numPr>
       </w:pPr>
       <w:r>
@@ -1711,8 +1781,8 @@
       <w:pPr>
         <w:pStyle w:val="Compact"/>
         <w:numPr>
-          <w:numId w:val="1008"/>
-          <w:ilvl w:val="0"/>
+          <w:numId w:val="1003"/>
+          <w:ilvl w:val="1"/>
         </w:numPr>
       </w:pPr>
       <w:r>
@@ -1769,9 +1839,8 @@
     </w:p>
     <w:p>
       <w:pPr>
-        <w:pStyle w:val="Compact"/>
-        <w:numPr>
-          <w:numId w:val="1009"/>
+        <w:numPr>
+          <w:numId w:val="1002"/>
           <w:ilvl w:val="0"/>
         </w:numPr>
       </w:pPr>
@@ -1798,16 +1867,21 @@
           </m:sub>
         </m:sSub>
       </m:oMath>
-      <w:r>
-        <w:t xml:space="preserve"> </w:t>
-      </w:r>
-      <w:r>
-        <w:t xml:space="preserve">is the ability to produce Toqrue for a given input power. It is winding invariant (as long as same conductimg wires used) but why? (Leanr about turns and wires thickness) (a)[https://ipfs.io/ipfs/QmXoypizjW3WknFiJnKLwHCnL72vedxjQkDDP1mXWo6uco/wiki/Motor_constants.html]</w:t>
-      </w:r>
-    </w:p>
-    <w:p>
-      <w:pPr>
-        <w:pStyle w:val="FirstParagraph"/>
+    </w:p>
+    <w:p>
+      <w:pPr>
+        <w:numPr>
+          <w:numId w:val="1000"/>
+          <w:ilvl w:val="0"/>
+        </w:numPr>
+      </w:pPr>
+      <w:r>
+        <w:t xml:space="preserve">It is the ability to produce Toqrue for a given input power. It is winding invariant [Leg Design for Energy Management in an Electromechanical Robot] as long as same conductimg wires used:</w:t>
+      </w:r>
+    </w:p>
+    <w:p>
+      <w:pPr>
+        <w:pStyle w:val="BodyText"/>
       </w:pPr>
       <m:oMathPara>
         <m:oMathParaPr>
@@ -2250,16 +2324,628 @@
     </w:p>
     <w:p>
       <w:pPr>
+        <w:numPr>
+          <w:numId w:val="1000"/>
+          <w:ilvl w:val="0"/>
+        </w:numPr>
+      </w:pPr>
+      <w:r>
+        <w:t xml:space="preserve">[Actuator design for high force proprioceptive control in fast legged locomotion]</w:t>
+      </w:r>
+    </w:p>
+    <w:p>
+      <w:pPr>
+        <w:numPr>
+          <w:numId w:val="1000"/>
+          <w:ilvl w:val="0"/>
+        </w:numPr>
+      </w:pPr>
+      <w:r>
+        <w:t xml:space="preserve">For given winding volume,</w:t>
+      </w:r>
+    </w:p>
+    <w:p>
+      <w:pPr>
+        <w:pStyle w:val="BodyText"/>
+      </w:pPr>
+      <m:oMathPara>
+        <m:oMathParaPr>
+          <m:jc m:val="center"/>
+        </m:oMathParaPr>
+        <m:oMath>
+          <m:r>
+            <m:t>V</m:t>
+          </m:r>
+          <m:r>
+            <m:t>=</m:t>
+          </m:r>
+          <m:r>
+            <m:t>π</m:t>
+          </m:r>
+          <m:sSubSup>
+            <m:e>
+              <m:r>
+                <m:t>r</m:t>
+              </m:r>
+            </m:e>
+            <m:sub>
+              <m:r>
+                <m:t>w</m:t>
+              </m:r>
+              <m:r>
+                <m:t>i</m:t>
+              </m:r>
+              <m:r>
+                <m:t>r</m:t>
+              </m:r>
+              <m:r>
+                <m:t>e</m:t>
+              </m:r>
+            </m:sub>
+            <m:sup>
+              <m:r>
+                <m:t>2</m:t>
+              </m:r>
+            </m:sup>
+          </m:sSubSup>
+          <m:r>
+            <m:t>L</m:t>
+          </m:r>
+          <m:r>
+            <m:t>=</m:t>
+          </m:r>
+          <m:r>
+            <m:t>c</m:t>
+          </m:r>
+          <m:r>
+            <m:t>⟹</m:t>
+          </m:r>
+          <m:r>
+            <m:t>L</m:t>
+          </m:r>
+          <m:r>
+            <m:t>∝</m:t>
+          </m:r>
+          <m:f>
+            <m:fPr>
+              <m:type m:val="bar"/>
+            </m:fPr>
+            <m:num>
+              <m:r>
+                <m:t>1</m:t>
+              </m:r>
+            </m:num>
+            <m:den>
+              <m:sSubSup>
+                <m:e>
+                  <m:r>
+                    <m:t>r</m:t>
+                  </m:r>
+                </m:e>
+                <m:sub>
+                  <m:r>
+                    <m:t>w</m:t>
+                  </m:r>
+                  <m:r>
+                    <m:t>i</m:t>
+                  </m:r>
+                  <m:r>
+                    <m:t>r</m:t>
+                  </m:r>
+                  <m:r>
+                    <m:t>e</m:t>
+                  </m:r>
+                </m:sub>
+                <m:sup>
+                  <m:r>
+                    <m:t>2</m:t>
+                  </m:r>
+                </m:sup>
+              </m:sSubSup>
+            </m:den>
+          </m:f>
+        </m:oMath>
+      </m:oMathPara>
+    </w:p>
+    <w:p>
+      <w:pPr>
+        <w:numPr>
+          <w:numId w:val="1000"/>
+          <w:ilvl w:val="0"/>
+        </w:numPr>
+      </w:pPr>
+      <w:r>
+        <w:t xml:space="preserve">.</w:t>
+      </w:r>
+    </w:p>
+    <w:p>
+      <w:pPr>
+        <w:numPr>
+          <w:numId w:val="1000"/>
+          <w:ilvl w:val="0"/>
+        </w:numPr>
+      </w:pPr>
+      <w:r>
+        <w:t xml:space="preserve">The resistance of the winding,</w:t>
+      </w:r>
+    </w:p>
+    <w:p>
+      <w:pPr>
+        <w:pStyle w:val="BodyText"/>
+      </w:pPr>
+      <m:oMathPara>
+        <m:oMathParaPr>
+          <m:jc m:val="center"/>
+        </m:oMathParaPr>
+        <m:oMath>
+          <m:r>
+            <m:t>R</m:t>
+          </m:r>
+          <m:r>
+            <m:t>∝</m:t>
+          </m:r>
+          <m:f>
+            <m:fPr>
+              <m:type m:val="bar"/>
+            </m:fPr>
+            <m:num>
+              <m:r>
+                <m:t>L</m:t>
+              </m:r>
+            </m:num>
+            <m:den>
+              <m:r>
+                <m:t>A</m:t>
+              </m:r>
+            </m:den>
+          </m:f>
+          <m:r>
+            <m:t>∝</m:t>
+          </m:r>
+          <m:f>
+            <m:fPr>
+              <m:type m:val="bar"/>
+            </m:fPr>
+            <m:num>
+              <m:r>
+                <m:t>L</m:t>
+              </m:r>
+            </m:num>
+            <m:den>
+              <m:sSubSup>
+                <m:e>
+                  <m:r>
+                    <m:t>r</m:t>
+                  </m:r>
+                </m:e>
+                <m:sub>
+                  <m:r>
+                    <m:t>w</m:t>
+                  </m:r>
+                  <m:r>
+                    <m:t>i</m:t>
+                  </m:r>
+                  <m:r>
+                    <m:t>r</m:t>
+                  </m:r>
+                  <m:r>
+                    <m:t>e</m:t>
+                  </m:r>
+                </m:sub>
+                <m:sup>
+                  <m:r>
+                    <m:t>2</m:t>
+                  </m:r>
+                </m:sup>
+              </m:sSubSup>
+            </m:den>
+          </m:f>
+          <m:r>
+            <m:t>∝</m:t>
+          </m:r>
+          <m:f>
+            <m:fPr>
+              <m:type m:val="bar"/>
+            </m:fPr>
+            <m:num>
+              <m:r>
+                <m:t>1</m:t>
+              </m:r>
+            </m:num>
+            <m:den>
+              <m:sSubSup>
+                <m:e>
+                  <m:r>
+                    <m:t>r</m:t>
+                  </m:r>
+                </m:e>
+                <m:sub>
+                  <m:r>
+                    <m:t>w</m:t>
+                  </m:r>
+                  <m:r>
+                    <m:t>i</m:t>
+                  </m:r>
+                  <m:r>
+                    <m:t>r</m:t>
+                  </m:r>
+                  <m:r>
+                    <m:t>e</m:t>
+                  </m:r>
+                </m:sub>
+                <m:sup>
+                  <m:r>
+                    <m:t>4</m:t>
+                  </m:r>
+                </m:sup>
+              </m:sSubSup>
+            </m:den>
+          </m:f>
+        </m:oMath>
+      </m:oMathPara>
+    </w:p>
+    <w:p>
+      <w:pPr>
+        <w:numPr>
+          <w:numId w:val="1000"/>
+          <w:ilvl w:val="0"/>
+        </w:numPr>
+      </w:pPr>
+      <w:r>
+        <w:t xml:space="preserve">The Torque constant</w:t>
+      </w:r>
+      <w:r>
+        <w:t xml:space="preserve"> </w:t>
+      </w:r>
+      <m:oMath>
+        <m:sSub>
+          <m:e>
+            <m:r>
+              <m:t>K</m:t>
+            </m:r>
+          </m:e>
+          <m:sub>
+            <m:r>
+              <m:t>t</m:t>
+            </m:r>
+          </m:sub>
+        </m:sSub>
+      </m:oMath>
+      <w:r>
+        <w:t xml:space="preserve"> </w:t>
+      </w:r>
+      <w:r>
+        <w:t xml:space="preserve">depends linearly on the number of turns around the core,</w:t>
+      </w:r>
+    </w:p>
+    <w:p>
+      <w:pPr>
+        <w:pStyle w:val="BodyText"/>
+      </w:pPr>
+      <m:oMathPara>
+        <m:oMathParaPr>
+          <m:jc m:val="center"/>
+        </m:oMathParaPr>
+        <m:oMath>
+          <m:sSub>
+            <m:e>
+              <m:r>
+                <m:t>K</m:t>
+              </m:r>
+            </m:e>
+            <m:sub>
+              <m:r>
+                <m:t>t</m:t>
+              </m:r>
+            </m:sub>
+          </m:sSub>
+          <m:r>
+            <m:t>∝</m:t>
+          </m:r>
+          <m:r>
+            <m:t>L</m:t>
+          </m:r>
+          <m:r>
+            <m:t>∝</m:t>
+          </m:r>
+          <m:f>
+            <m:fPr>
+              <m:type m:val="bar"/>
+            </m:fPr>
+            <m:num>
+              <m:r>
+                <m:t>1</m:t>
+              </m:r>
+            </m:num>
+            <m:den>
+              <m:sSubSup>
+                <m:e>
+                  <m:r>
+                    <m:t>r</m:t>
+                  </m:r>
+                </m:e>
+                <m:sub>
+                  <m:r>
+                    <m:t>w</m:t>
+                  </m:r>
+                  <m:r>
+                    <m:t>i</m:t>
+                  </m:r>
+                  <m:r>
+                    <m:t>r</m:t>
+                  </m:r>
+                  <m:r>
+                    <m:t>e</m:t>
+                  </m:r>
+                </m:sub>
+                <m:sup>
+                  <m:r>
+                    <m:t>2</m:t>
+                  </m:r>
+                </m:sup>
+              </m:sSubSup>
+            </m:den>
+          </m:f>
+        </m:oMath>
+      </m:oMathPara>
+    </w:p>
+    <w:p>
+      <w:pPr>
         <w:pStyle w:val="FirstParagraph"/>
       </w:pPr>
-      <w:r>
-        <w:t xml:space="preserve">[Actuator design for high force proprioceptive control in fast legged locomotion]</w:t>
-      </w:r>
-    </w:p>
-    <w:p>
-      <w:pPr>
-        <w:numPr>
-          <w:numId w:val="1010"/>
+      <m:oMathPara>
+        <m:oMathParaPr>
+          <m:jc m:val="center"/>
+        </m:oMathParaPr>
+        <m:oMath>
+          <m:r>
+            <m:t>τ</m:t>
+          </m:r>
+          <m:r>
+            <m:t>=</m:t>
+          </m:r>
+          <m:sSub>
+            <m:e>
+              <m:r>
+                <m:t>K</m:t>
+              </m:r>
+            </m:e>
+            <m:sub>
+              <m:r>
+                <m:t>t</m:t>
+              </m:r>
+            </m:sub>
+          </m:sSub>
+          <m:r>
+            <m:t>i</m:t>
+          </m:r>
+          <m:r>
+            <m:t>⟹</m:t>
+          </m:r>
+          <m:r>
+            <m:t>τ</m:t>
+          </m:r>
+          <m:r>
+            <m:t>∝</m:t>
+          </m:r>
+          <m:f>
+            <m:fPr>
+              <m:type m:val="bar"/>
+            </m:fPr>
+            <m:num>
+              <m:r>
+                <m:t>i</m:t>
+              </m:r>
+            </m:num>
+            <m:den>
+              <m:sSubSup>
+                <m:e>
+                  <m:r>
+                    <m:t>r</m:t>
+                  </m:r>
+                </m:e>
+                <m:sub>
+                  <m:r>
+                    <m:t>w</m:t>
+                  </m:r>
+                  <m:r>
+                    <m:t>i</m:t>
+                  </m:r>
+                  <m:r>
+                    <m:t>r</m:t>
+                  </m:r>
+                  <m:r>
+                    <m:t>e</m:t>
+                  </m:r>
+                </m:sub>
+                <m:sup>
+                  <m:r>
+                    <m:t>2</m:t>
+                  </m:r>
+                </m:sup>
+              </m:sSubSup>
+            </m:den>
+          </m:f>
+        </m:oMath>
+      </m:oMathPara>
+    </w:p>
+    <w:p>
+      <w:pPr>
+        <w:pStyle w:val="FirstParagraph"/>
+      </w:pPr>
+      <m:oMathPara>
+        <m:oMathParaPr>
+          <m:jc m:val="center"/>
+        </m:oMathParaPr>
+        <m:oMath>
+          <m:r>
+            <m:t>P</m:t>
+          </m:r>
+          <m:r>
+            <m:t>=</m:t>
+          </m:r>
+          <m:sSup>
+            <m:e>
+              <m:r>
+                <m:t>i</m:t>
+              </m:r>
+            </m:e>
+            <m:sup>
+              <m:r>
+                <m:t>2</m:t>
+              </m:r>
+            </m:sup>
+          </m:sSup>
+          <m:r>
+            <m:t>R</m:t>
+          </m:r>
+          <m:r>
+            <m:t>∝</m:t>
+          </m:r>
+          <m:f>
+            <m:fPr>
+              <m:type m:val="bar"/>
+            </m:fPr>
+            <m:num>
+              <m:sSup>
+                <m:e>
+                  <m:r>
+                    <m:t>i</m:t>
+                  </m:r>
+                </m:e>
+                <m:sup>
+                  <m:r>
+                    <m:t>2</m:t>
+                  </m:r>
+                </m:sup>
+              </m:sSup>
+            </m:num>
+            <m:den>
+              <m:sSubSup>
+                <m:e>
+                  <m:r>
+                    <m:t>r</m:t>
+                  </m:r>
+                </m:e>
+                <m:sub>
+                  <m:r>
+                    <m:t>w</m:t>
+                  </m:r>
+                  <m:r>
+                    <m:t>i</m:t>
+                  </m:r>
+                  <m:r>
+                    <m:t>r</m:t>
+                  </m:r>
+                  <m:r>
+                    <m:t>e</m:t>
+                  </m:r>
+                </m:sub>
+                <m:sup>
+                  <m:r>
+                    <m:t>4</m:t>
+                  </m:r>
+                </m:sup>
+              </m:sSubSup>
+            </m:den>
+          </m:f>
+        </m:oMath>
+      </m:oMathPara>
+    </w:p>
+    <w:p>
+      <w:pPr>
+        <w:numPr>
+          <w:numId w:val="1000"/>
+          <w:ilvl w:val="0"/>
+        </w:numPr>
+      </w:pPr>
+      <w:r>
+        <w:t xml:space="preserve">thus</w:t>
+      </w:r>
+    </w:p>
+    <w:p>
+      <w:pPr>
+        <w:pStyle w:val="BodyText"/>
+      </w:pPr>
+      <m:oMathPara>
+        <m:oMathParaPr>
+          <m:jc m:val="center"/>
+        </m:oMathParaPr>
+        <m:oMath>
+          <m:sSub>
+            <m:e>
+              <m:r>
+                <m:t>K</m:t>
+              </m:r>
+            </m:e>
+            <m:sub>
+              <m:r>
+                <m:t>m</m:t>
+              </m:r>
+            </m:sub>
+          </m:sSub>
+          <m:r>
+            <m:t>=</m:t>
+          </m:r>
+          <m:f>
+            <m:fPr>
+              <m:type m:val="bar"/>
+            </m:fPr>
+            <m:num>
+              <m:r>
+                <m:t>τ</m:t>
+              </m:r>
+            </m:num>
+            <m:den>
+              <m:rad>
+                <m:radPr>
+                  <m:degHide m:val="1"/>
+                </m:radPr>
+                <m:deg/>
+                <m:e>
+                  <m:r>
+                    <m:t>P</m:t>
+                  </m:r>
+                </m:e>
+              </m:rad>
+            </m:den>
+          </m:f>
+          <m:r>
+            <m:t>∝</m:t>
+          </m:r>
+          <m:sSubSup>
+            <m:e>
+              <m:r>
+                <m:t>r</m:t>
+              </m:r>
+            </m:e>
+            <m:sub>
+              <m:r>
+                <m:t>w</m:t>
+              </m:r>
+              <m:r>
+                <m:t>i</m:t>
+              </m:r>
+              <m:r>
+                <m:t>r</m:t>
+              </m:r>
+              <m:r>
+                <m:t>e</m:t>
+              </m:r>
+            </m:sub>
+            <m:sup>
+              <m:r>
+                <m:t>0</m:t>
+              </m:r>
+            </m:sup>
+          </m:sSubSup>
+        </m:oMath>
+      </m:oMathPara>
+    </w:p>
+    <w:p>
+      <w:pPr>
+        <w:numPr>
+          <w:numId w:val="1002"/>
           <w:ilvl w:val="0"/>
         </w:numPr>
       </w:pPr>
@@ -2269,17 +2955,64 @@
         </w:rPr>
         <w:t xml:space="preserve">Electric Time Constant</w:t>
       </w:r>
-      <w:r>
-        <w:t xml:space="preserve"> </w:t>
-      </w:r>
-      <w:r>
-        <w:t xml:space="preserve">[Direct-drive robots: theory and practice]</w:t>
-      </w:r>
-    </w:p>
-    <w:p>
-      <w:pPr>
-        <w:numPr>
-          <w:numId w:val="1010"/>
+    </w:p>
+    <w:p>
+      <w:pPr>
+        <w:numPr>
+          <w:numId w:val="1000"/>
+          <w:ilvl w:val="0"/>
+        </w:numPr>
+      </w:pPr>
+      <w:r>
+        <w:t xml:space="preserve">The electrical time constant is the amount of time it takes the current in the winding to reach 63 percent of its rated value. The time constant found by dividing inductance by resistance.</w:t>
+      </w:r>
+    </w:p>
+    <w:p>
+      <w:pPr>
+        <w:pStyle w:val="BodyText"/>
+      </w:pPr>
+      <m:oMathPara>
+        <m:oMathParaPr>
+          <m:jc m:val="center"/>
+        </m:oMathParaPr>
+        <m:oMath>
+          <m:sSub>
+            <m:e>
+              <m:r>
+                <m:t>τ</m:t>
+              </m:r>
+            </m:e>
+            <m:sub>
+              <m:r>
+                <m:t>e</m:t>
+              </m:r>
+            </m:sub>
+          </m:sSub>
+          <m:r>
+            <m:t>=</m:t>
+          </m:r>
+          <m:f>
+            <m:fPr>
+              <m:type m:val="bar"/>
+            </m:fPr>
+            <m:num>
+              <m:r>
+                <m:t>L</m:t>
+              </m:r>
+            </m:num>
+            <m:den>
+              <m:r>
+                <m:t>R</m:t>
+              </m:r>
+            </m:den>
+          </m:f>
+        </m:oMath>
+      </m:oMathPara>
+    </w:p>
+    <w:p>
+      <w:pPr>
+        <w:numPr>
+          <w:numId w:val="1002"/>
           <w:ilvl w:val="0"/>
         </w:numPr>
       </w:pPr>
@@ -2287,93 +3020,23 @@
         <w:rPr>
           <w:b/>
         </w:rPr>
-        <w:t xml:space="preserve">[Direct-drive robots: theory and practice]</w:t>
-      </w:r>
-      <w:r>
-        <w:t xml:space="preserve"> </w:t>
-      </w:r>
-      <w:r>
-        <w:t xml:space="preserve">Direct Drive has no damping.</w:t>
+        <w:t xml:space="preserve">Mechanical Time Constant</w:t>
+      </w:r>
+    </w:p>
+    <w:p>
+      <w:pPr>
+        <w:numPr>
+          <w:numId w:val="1000"/>
+          <w:ilvl w:val="0"/>
+        </w:numPr>
+      </w:pPr>
+      <w:r>
+        <w:t xml:space="preserve">It is the time required for a given motor to reach 63.2% of its maximum rated speed in a no-load condition. The mechanical time constant is basically a measure of a motor’s responsiveness. Direct Drive has no damping, thus is</w:t>
       </w:r>
       <w:r>
         <w:t xml:space="preserve"> </w:t>
       </w:r>
       <m:oMath>
-        <m:r>
-          <m:t>M</m:t>
-        </m:r>
-        <m:r>
-          <m:t>e</m:t>
-        </m:r>
-        <m:r>
-          <m:t>c</m:t>
-        </m:r>
-        <m:r>
-          <m:t>h</m:t>
-        </m:r>
-        <m:r>
-          <m:t>a</m:t>
-        </m:r>
-        <m:r>
-          <m:t>n</m:t>
-        </m:r>
-        <m:r>
-          <m:t>i</m:t>
-        </m:r>
-        <m:r>
-          <m:t>c</m:t>
-        </m:r>
-        <m:r>
-          <m:t>a</m:t>
-        </m:r>
-        <m:r>
-          <m:t>l</m:t>
-        </m:r>
-        <m:r>
-          <m:t> </m:t>
-        </m:r>
-        <m:r>
-          <m:t>T</m:t>
-        </m:r>
-        <m:r>
-          <m:t>i</m:t>
-        </m:r>
-        <m:r>
-          <m:t>m</m:t>
-        </m:r>
-        <m:r>
-          <m:t>e</m:t>
-        </m:r>
-        <m:r>
-          <m:t> </m:t>
-        </m:r>
-        <m:r>
-          <m:t>C</m:t>
-        </m:r>
-        <m:r>
-          <m:t>o</m:t>
-        </m:r>
-        <m:r>
-          <m:t>n</m:t>
-        </m:r>
-        <m:r>
-          <m:t>s</m:t>
-        </m:r>
-        <m:r>
-          <m:t>t</m:t>
-        </m:r>
-        <m:r>
-          <m:t>a</m:t>
-        </m:r>
-        <m:r>
-          <m:t>n</m:t>
-        </m:r>
-        <m:r>
-          <m:t>t</m:t>
-        </m:r>
-        <m:r>
-          <m:t> </m:t>
-        </m:r>
         <m:sSub>
           <m:e>
             <m:r>
@@ -2395,156 +3058,252 @@
             </m:r>
           </m:sub>
         </m:sSub>
-        <m:r>
-          <m:t>=</m:t>
-        </m:r>
-        <m:f>
-          <m:fPr>
-            <m:type m:val="bar"/>
-          </m:fPr>
-          <m:num>
-            <m:r>
-              <m:t>i</m:t>
-            </m:r>
-            <m:r>
-              <m:t>n</m:t>
-            </m:r>
-            <m:r>
-              <m:t>e</m:t>
-            </m:r>
-            <m:r>
-              <m:t>r</m:t>
-            </m:r>
-            <m:r>
-              <m:t>t</m:t>
-            </m:r>
-            <m:r>
-              <m:t>i</m:t>
-            </m:r>
-            <m:r>
-              <m:t>a</m:t>
-            </m:r>
-            <m:r>
-              <m:t> </m:t>
-            </m:r>
-            <m:r>
-              <m:t>l</m:t>
-            </m:r>
-            <m:r>
-              <m:t>o</m:t>
-            </m:r>
-            <m:r>
-              <m:t>a</m:t>
-            </m:r>
-            <m:r>
-              <m:t>d</m:t>
-            </m:r>
-          </m:num>
-          <m:den>
-            <m:r>
-              <m:t>m</m:t>
-            </m:r>
-            <m:r>
-              <m:t>e</m:t>
-            </m:r>
-            <m:r>
-              <m:t>c</m:t>
-            </m:r>
-            <m:r>
-              <m:t>h</m:t>
-            </m:r>
-            <m:r>
-              <m:t>a</m:t>
-            </m:r>
-            <m:r>
-              <m:t>n</m:t>
-            </m:r>
-            <m:r>
-              <m:t>i</m:t>
-            </m:r>
-            <m:r>
-              <m:t>c</m:t>
-            </m:r>
-            <m:r>
-              <m:t>a</m:t>
-            </m:r>
-            <m:r>
-              <m:t>l</m:t>
-            </m:r>
-            <m:r>
-              <m:t> </m:t>
-            </m:r>
-            <m:r>
-              <m:t>d</m:t>
-            </m:r>
-            <m:r>
-              <m:t>a</m:t>
-            </m:r>
-            <m:r>
-              <m:t>m</m:t>
-            </m:r>
-            <m:r>
-              <m:t>p</m:t>
-            </m:r>
-            <m:r>
-              <m:t>i</m:t>
-            </m:r>
-            <m:r>
-              <m:t>n</m:t>
-            </m:r>
-            <m:r>
-              <m:t>g</m:t>
-            </m:r>
-            <m:r>
-              <m:t> </m:t>
-            </m:r>
-            <m:r>
-              <m:t>c</m:t>
-            </m:r>
-            <m:r>
-              <m:t>o</m:t>
-            </m:r>
-            <m:r>
-              <m:t>e</m:t>
-            </m:r>
-            <m:r>
-              <m:t>f</m:t>
-            </m:r>
-            <m:r>
-              <m:t>f</m:t>
-            </m:r>
-            <m:r>
-              <m:t>i</m:t>
-            </m:r>
-            <m:r>
-              <m:t>c</m:t>
-            </m:r>
-            <m:r>
-              <m:t>i</m:t>
-            </m:r>
-            <m:r>
-              <m:t>e</m:t>
-            </m:r>
-            <m:r>
-              <m:t>n</m:t>
-            </m:r>
-            <m:r>
-              <m:t>t</m:t>
-            </m:r>
-          </m:den>
-        </m:f>
       </m:oMath>
       <w:r>
         <w:t xml:space="preserve"> </w:t>
       </w:r>
       <w:r>
-        <w:t xml:space="preserve">is large comapred to geared drive.</w:t>
-      </w:r>
-    </w:p>
-    <w:p>
-      <w:pPr>
-        <w:numPr>
-          <w:numId w:val="1010"/>
+        <w:t xml:space="preserve">large comapred to geared drive.</w:t>
+      </w:r>
+    </w:p>
+    <w:p>
+      <w:pPr>
+        <w:pStyle w:val="FirstParagraph"/>
+      </w:pPr>
+      <m:oMathPara>
+        <m:oMathParaPr>
+          <m:jc m:val="center"/>
+        </m:oMathParaPr>
+        <m:oMath>
+          <m:sSub>
+            <m:e>
+              <m:r>
+                <m:t>τ</m:t>
+              </m:r>
+            </m:e>
+            <m:sub>
+              <m:r>
+                <m:t>m</m:t>
+              </m:r>
+              <m:r>
+                <m:t>e</m:t>
+              </m:r>
+              <m:r>
+                <m:t>c</m:t>
+              </m:r>
+              <m:r>
+                <m:t>h</m:t>
+              </m:r>
+            </m:sub>
+          </m:sSub>
+          <m:r>
+            <m:t>=</m:t>
+          </m:r>
+          <m:f>
+            <m:fPr>
+              <m:type m:val="bar"/>
+            </m:fPr>
+            <m:num>
+              <m:r>
+                <m:t>i</m:t>
+              </m:r>
+              <m:r>
+                <m:t>n</m:t>
+              </m:r>
+              <m:r>
+                <m:t>e</m:t>
+              </m:r>
+              <m:r>
+                <m:t>r</m:t>
+              </m:r>
+              <m:r>
+                <m:t>t</m:t>
+              </m:r>
+              <m:r>
+                <m:t>i</m:t>
+              </m:r>
+              <m:r>
+                <m:t>a</m:t>
+              </m:r>
+              <m:r>
+                <m:t> </m:t>
+              </m:r>
+              <m:r>
+                <m:t>l</m:t>
+              </m:r>
+              <m:r>
+                <m:t>o</m:t>
+              </m:r>
+              <m:r>
+                <m:t>a</m:t>
+              </m:r>
+              <m:r>
+                <m:t>d</m:t>
+              </m:r>
+            </m:num>
+            <m:den>
+              <m:r>
+                <m:t>m</m:t>
+              </m:r>
+              <m:r>
+                <m:t>e</m:t>
+              </m:r>
+              <m:r>
+                <m:t>c</m:t>
+              </m:r>
+              <m:r>
+                <m:t>h</m:t>
+              </m:r>
+              <m:r>
+                <m:t>a</m:t>
+              </m:r>
+              <m:r>
+                <m:t>n</m:t>
+              </m:r>
+              <m:r>
+                <m:t>i</m:t>
+              </m:r>
+              <m:r>
+                <m:t>c</m:t>
+              </m:r>
+              <m:r>
+                <m:t>a</m:t>
+              </m:r>
+              <m:r>
+                <m:t>l</m:t>
+              </m:r>
+              <m:r>
+                <m:t> </m:t>
+              </m:r>
+              <m:r>
+                <m:t>d</m:t>
+              </m:r>
+              <m:r>
+                <m:t>a</m:t>
+              </m:r>
+              <m:r>
+                <m:t>m</m:t>
+              </m:r>
+              <m:r>
+                <m:t>p</m:t>
+              </m:r>
+              <m:r>
+                <m:t>i</m:t>
+              </m:r>
+              <m:r>
+                <m:t>n</m:t>
+              </m:r>
+              <m:r>
+                <m:t>g</m:t>
+              </m:r>
+              <m:r>
+                <m:t> </m:t>
+              </m:r>
+              <m:r>
+                <m:t>c</m:t>
+              </m:r>
+              <m:r>
+                <m:t>o</m:t>
+              </m:r>
+              <m:r>
+                <m:t>e</m:t>
+              </m:r>
+              <m:r>
+                <m:t>f</m:t>
+              </m:r>
+              <m:r>
+                <m:t>f</m:t>
+              </m:r>
+              <m:r>
+                <m:t>i</m:t>
+              </m:r>
+              <m:r>
+                <m:t>c</m:t>
+              </m:r>
+              <m:r>
+                <m:t>i</m:t>
+              </m:r>
+              <m:r>
+                <m:t>e</m:t>
+              </m:r>
+              <m:r>
+                <m:t>n</m:t>
+              </m:r>
+              <m:r>
+                <m:t>t</m:t>
+              </m:r>
+            </m:den>
+          </m:f>
+          <m:r>
+            <m:t>=</m:t>
+          </m:r>
+          <m:f>
+            <m:fPr>
+              <m:type m:val="bar"/>
+            </m:fPr>
+            <m:num>
+              <m:r>
+                <m:t>∑</m:t>
+              </m:r>
+              <m:sSub>
+                <m:e>
+                  <m:r>
+                    <m:t>R</m:t>
+                  </m:r>
+                </m:e>
+                <m:sub>
+                  <m:r>
+                    <m:t>a</m:t>
+                  </m:r>
+                </m:sub>
+              </m:sSub>
+              <m:sSub>
+                <m:e>
+                  <m:r>
+                    <m:t>J</m:t>
+                  </m:r>
+                </m:e>
+                <m:sub>
+                  <m:r>
+                    <m:t>t</m:t>
+                  </m:r>
+                </m:sub>
+              </m:sSub>
+            </m:num>
+            <m:den>
+              <m:sSub>
+                <m:e>
+                  <m:r>
+                    <m:t>K</m:t>
+                  </m:r>
+                </m:e>
+                <m:sub>
+                  <m:r>
+                    <m:t>e</m:t>
+                  </m:r>
+                </m:sub>
+              </m:sSub>
+              <m:sSub>
+                <m:e>
+                  <m:r>
+                    <m:t>K</m:t>
+                  </m:r>
+                </m:e>
+                <m:sub>
+                  <m:r>
+                    <m:t>t</m:t>
+                  </m:r>
+                </m:sub>
+              </m:sSub>
+            </m:den>
+          </m:f>
+        </m:oMath>
+      </m:oMathPara>
+    </w:p>
+    <w:p>
+      <w:pPr>
+        <w:numPr>
+          <w:numId w:val="1004"/>
           <w:ilvl w:val="0"/>
         </w:numPr>
       </w:pPr>
@@ -2580,7 +3339,10 @@
     </w:p>
     <w:p>
       <w:pPr>
-        <w:pStyle w:val="FirstParagraph"/>
+        <w:numPr>
+          <w:numId w:val="1000"/>
+          <w:ilvl w:val="0"/>
+        </w:numPr>
       </w:pPr>
       <w:r>
         <w:t xml:space="preserve">Form, [Design Principles for a Family of Direct-Drive Legged Robots], we have</w:t>
@@ -2687,9 +3449,8 @@
     </w:p>
     <w:p>
       <w:pPr>
-        <w:pStyle w:val="Compact"/>
-        <w:numPr>
-          <w:numId w:val="1011"/>
+        <w:numPr>
+          <w:numId w:val="1004"/>
           <w:ilvl w:val="0"/>
         </w:numPr>
       </w:pPr>
@@ -2726,7 +3487,10 @@
     </w:p>
     <w:p>
       <w:pPr>
-        <w:pStyle w:val="FirstParagraph"/>
+        <w:numPr>
+          <w:numId w:val="1000"/>
+          <w:ilvl w:val="0"/>
+        </w:numPr>
       </w:pPr>
       <w:r>
         <w:t xml:space="preserve">Avergae</w:t>
@@ -2749,7 +3513,10 @@
     </w:p>
     <w:p>
       <w:pPr>
-        <w:pStyle w:val="BodyText"/>
+        <w:numPr>
+          <w:numId w:val="1000"/>
+          <w:ilvl w:val="0"/>
+        </w:numPr>
       </w:pPr>
       <w:r>
         <w:t xml:space="preserve">[Design of Brushless Permanent-Magnet Machines, p. 68]</w:t>
@@ -2757,9 +3524,8 @@
     </w:p>
     <w:p>
       <w:pPr>
-        <w:pStyle w:val="Compact"/>
-        <w:numPr>
-          <w:numId w:val="1012"/>
+        <w:numPr>
+          <w:numId w:val="1004"/>
           <w:ilvl w:val="0"/>
         </w:numPr>
       </w:pPr>
@@ -2796,7 +3562,10 @@
     </w:p>
     <w:p>
       <w:pPr>
-        <w:pStyle w:val="FirstParagraph"/>
+        <w:numPr>
+          <w:numId w:val="1000"/>
+          <w:ilvl w:val="0"/>
+        </w:numPr>
       </w:pPr>
       <w:r>
         <w:t xml:space="preserve">Average magnitude of</w:t>
@@ -2819,7 +3588,10 @@
     </w:p>
     <w:p>
       <w:pPr>
-        <w:pStyle w:val="BodyText"/>
+        <w:numPr>
+          <w:numId w:val="1000"/>
+          <w:ilvl w:val="0"/>
+        </w:numPr>
       </w:pPr>
       <m:oMath>
         <m:r>
@@ -2878,7 +3650,10 @@
     </w:p>
     <w:p>
       <w:pPr>
-        <w:pStyle w:val="BodyText"/>
+        <w:numPr>
+          <w:numId w:val="1000"/>
+          <w:ilvl w:val="0"/>
+        </w:numPr>
       </w:pPr>
       <w:r>
         <w:t xml:space="preserve">In case we widen our slots to accomodate more copper</w:t>
@@ -2940,7 +3715,10 @@
     </w:p>
     <w:p>
       <w:pPr>
-        <w:pStyle w:val="BodyText"/>
+        <w:numPr>
+          <w:numId w:val="1000"/>
+          <w:ilvl w:val="0"/>
+        </w:numPr>
       </w:pPr>
       <w:r>
         <w:t xml:space="preserve">[Design of Brushless Permanent-Magnet Machines, p. 68]</w:t>
@@ -2948,9 +3726,8 @@
     </w:p>
     <w:p>
       <w:pPr>
-        <w:pStyle w:val="Compact"/>
-        <w:numPr>
-          <w:numId w:val="1013"/>
+        <w:numPr>
+          <w:numId w:val="1004"/>
           <w:ilvl w:val="0"/>
         </w:numPr>
       </w:pPr>
@@ -2963,7 +3740,10 @@
     </w:p>
     <w:p>
       <w:pPr>
-        <w:pStyle w:val="FirstParagraph"/>
+        <w:numPr>
+          <w:numId w:val="1000"/>
+          <w:ilvl w:val="0"/>
+        </w:numPr>
       </w:pPr>
       <w:r>
         <w:t xml:space="preserve">As intuitive and as basic the better the cooling the better will be the perfomance of our motor.</w:t>
@@ -2982,7 +3762,7 @@
     <w:p>
       <w:pPr>
         <w:numPr>
-          <w:numId w:val="1014"/>
+          <w:numId w:val="1005"/>
           <w:ilvl w:val="0"/>
         </w:numPr>
       </w:pPr>
@@ -3007,7 +3787,7 @@
     <w:p>
       <w:pPr>
         <w:numPr>
-          <w:numId w:val="1014"/>
+          <w:numId w:val="1005"/>
           <w:ilvl w:val="0"/>
         </w:numPr>
       </w:pPr>
@@ -3223,7 +4003,7 @@
     <w:p>
       <w:pPr>
         <w:numPr>
-          <w:numId w:val="1014"/>
+          <w:numId w:val="1005"/>
           <w:ilvl w:val="0"/>
         </w:numPr>
       </w:pPr>
@@ -3284,7 +4064,7 @@
     <w:p>
       <w:pPr>
         <w:numPr>
-          <w:numId w:val="1014"/>
+          <w:numId w:val="1005"/>
           <w:ilvl w:val="0"/>
         </w:numPr>
       </w:pPr>
@@ -3432,213 +4212,71 @@
             <m:t>ρ</m:t>
           </m:r>
           <m:r>
-            <m:t>∝</m:t>
+            <m:t>=</m:t>
           </m:r>
           <m:r>
             <m:t>[</m:t>
           </m:r>
-          <m:sSubSup>
+          <m:sSub>
             <m:e>
               <m:r>
-                <m:t>r</m:t>
+                <m:t>V</m:t>
               </m:r>
             </m:e>
             <m:sub>
               <m:r>
-                <m:t>g</m:t>
-              </m:r>
-              <m:r>
-                <m:t>a</m:t>
-              </m:r>
-              <m:r>
-                <m:t>p</m:t>
+                <m:t>r</m:t>
+              </m:r>
+              <m:r>
+                <m:t>o</m:t>
+              </m:r>
+              <m:r>
+                <m:t>t</m:t>
+              </m:r>
+              <m:r>
+                <m:t>o</m:t>
+              </m:r>
+              <m:r>
+                <m:t>r</m:t>
               </m:r>
             </m:sub>
-            <m:sup>
-              <m:r>
-                <m:t>2</m:t>
-              </m:r>
-            </m:sup>
-          </m:sSubSup>
-          <m:r>
-            <m:t>−</m:t>
-          </m:r>
-          <m:r>
-            <m:t>(</m:t>
+          </m:sSub>
+          <m:r>
+            <m:t>+</m:t>
           </m:r>
           <m:sSub>
             <m:e>
               <m:r>
-                <m:t>r</m:t>
+                <m:t>V</m:t>
               </m:r>
             </m:e>
             <m:sub>
               <m:r>
-                <m:t>g</m:t>
+                <m:t>s</m:t>
+              </m:r>
+              <m:r>
+                <m:t>t</m:t>
               </m:r>
               <m:r>
                 <m:t>a</m:t>
               </m:r>
               <m:r>
-                <m:t>p</m:t>
+                <m:t>t</m:t>
+              </m:r>
+              <m:r>
+                <m:t>o</m:t>
+              </m:r>
+              <m:r>
+                <m:t>r</m:t>
               </m:r>
             </m:sub>
           </m:sSub>
           <m:r>
-            <m:t>−</m:t>
-          </m:r>
-          <m:sSub>
-            <m:e>
-              <m:r>
-                <m:t>t</m:t>
-              </m:r>
-            </m:e>
-            <m:sub>
-              <m:r>
-                <m:t>r</m:t>
-              </m:r>
-              <m:r>
-                <m:t>o</m:t>
-              </m:r>
-              <m:r>
-                <m:t>t</m:t>
-              </m:r>
-              <m:r>
-                <m:t>o</m:t>
-              </m:r>
-              <m:r>
-                <m:t>r</m:t>
-              </m:r>
-            </m:sub>
-          </m:sSub>
-          <m:sSup>
-            <m:e>
-              <m:r>
-                <m:t>)</m:t>
-              </m:r>
-            </m:e>
-            <m:sup>
-              <m:r>
-                <m:t>2</m:t>
-              </m:r>
-            </m:sup>
-          </m:sSup>
-          <m:r>
-            <m:t>+</m:t>
-          </m:r>
-          <m:r>
-            <m:t>(</m:t>
-          </m:r>
-          <m:sSub>
-            <m:e>
-              <m:r>
-                <m:t>r</m:t>
-              </m:r>
-            </m:e>
-            <m:sub>
-              <m:r>
-                <m:t>g</m:t>
-              </m:r>
-              <m:r>
-                <m:t>a</m:t>
-              </m:r>
-              <m:r>
-                <m:t>p</m:t>
-              </m:r>
-            </m:sub>
-          </m:sSub>
-          <m:r>
-            <m:t>+</m:t>
-          </m:r>
-          <m:sSub>
-            <m:e>
-              <m:r>
-                <m:t>t</m:t>
-              </m:r>
-            </m:e>
-            <m:sub>
-              <m:r>
-                <m:t>s</m:t>
-              </m:r>
-              <m:r>
-                <m:t>t</m:t>
-              </m:r>
-              <m:r>
-                <m:t>a</m:t>
-              </m:r>
-              <m:r>
-                <m:t>t</m:t>
-              </m:r>
-              <m:r>
-                <m:t>o</m:t>
-              </m:r>
-              <m:r>
-                <m:t>r</m:t>
-              </m:r>
-            </m:sub>
-          </m:sSub>
-          <m:sSup>
-            <m:e>
-              <m:r>
-                <m:t>)</m:t>
-              </m:r>
-            </m:e>
-            <m:sup>
-              <m:r>
-                <m:t>2</m:t>
-              </m:r>
-            </m:sup>
-          </m:sSup>
-          <m:r>
-            <m:t>−</m:t>
-          </m:r>
-          <m:sSubSup>
-            <m:e>
-              <m:r>
-                <m:t>r</m:t>
-              </m:r>
-            </m:e>
-            <m:sub>
-              <m:r>
-                <m:t>g</m:t>
-              </m:r>
-              <m:r>
-                <m:t>a</m:t>
-              </m:r>
-              <m:r>
-                <m:t>p</m:t>
-              </m:r>
-            </m:sub>
-            <m:sup>
-              <m:r>
-                <m:t>2</m:t>
-              </m:r>
-            </m:sup>
-          </m:sSubSup>
-          <m:r>
             <m:t>]</m:t>
           </m:r>
           <m:r>
-            <m:t>∝</m:t>
-          </m:r>
-          <m:sSub>
-            <m:e>
-              <m:r>
-                <m:t>r</m:t>
-              </m:r>
-            </m:e>
-            <m:sub>
-              <m:r>
-                <m:t>g</m:t>
-              </m:r>
-              <m:r>
-                <m:t>a</m:t>
-              </m:r>
-              <m:r>
-                <m:t>p</m:t>
-              </m:r>
-            </m:sub>
-          </m:sSub>
+            <m:t>ρ</m:t>
+          </m:r>
         </m:oMath>
       </m:oMathPara>
     </w:p>
@@ -3655,10 +4293,39 @@
             <m:t>M</m:t>
           </m:r>
           <m:r>
-            <m:t>∝</m:t>
+            <m:t>=</m:t>
+          </m:r>
+          <m:r>
+            <m:t>π</m:t>
           </m:r>
           <m:r>
             <m:t>[</m:t>
+          </m:r>
+          <m:sSubSup>
+            <m:e>
+              <m:r>
+                <m:t>r</m:t>
+              </m:r>
+            </m:e>
+            <m:sub>
+              <m:r>
+                <m:t>g</m:t>
+              </m:r>
+              <m:r>
+                <m:t>a</m:t>
+              </m:r>
+              <m:r>
+                <m:t>p</m:t>
+              </m:r>
+            </m:sub>
+            <m:sup>
+              <m:r>
+                <m:t>2</m:t>
+              </m:r>
+            </m:sup>
+          </m:sSubSup>
+          <m:r>
+            <m:t>−</m:t>
           </m:r>
           <m:r>
             <m:t>(</m:t>
@@ -3682,7 +4349,7 @@
             </m:sub>
           </m:sSub>
           <m:r>
-            <m:t>+</m:t>
+            <m:t>−</m:t>
           </m:r>
           <m:sSub>
             <m:e>
@@ -3692,13 +4359,10 @@
             </m:e>
             <m:sub>
               <m:r>
-                <m:t>s</m:t>
-              </m:r>
-              <m:r>
-                <m:t>t</m:t>
-              </m:r>
-              <m:r>
-                <m:t>a</m:t>
+                <m:t>r</m:t>
+              </m:r>
+              <m:r>
+                <m:t>o</m:t>
               </m:r>
               <m:r>
                 <m:t>t</m:t>
@@ -3724,7 +4388,7 @@
             </m:sup>
           </m:sSup>
           <m:r>
-            <m:t>−</m:t>
+            <m:t>+</m:t>
           </m:r>
           <m:r>
             <m:t>(</m:t>
@@ -3748,7 +4412,7 @@
             </m:sub>
           </m:sSub>
           <m:r>
-            <m:t>−</m:t>
+            <m:t>+</m:t>
           </m:r>
           <m:sSub>
             <m:e>
@@ -3758,10 +4422,13 @@
             </m:e>
             <m:sub>
               <m:r>
-                <m:t>r</m:t>
-              </m:r>
-              <m:r>
-                <m:t>o</m:t>
+                <m:t>s</m:t>
+              </m:r>
+              <m:r>
+                <m:t>t</m:t>
+              </m:r>
+              <m:r>
+                <m:t>a</m:t>
               </m:r>
               <m:r>
                 <m:t>t</m:t>
@@ -3787,14 +4454,57 @@
             </m:sup>
           </m:sSup>
           <m:r>
+            <m:t>−</m:t>
+          </m:r>
+          <m:sSubSup>
+            <m:e>
+              <m:r>
+                <m:t>r</m:t>
+              </m:r>
+            </m:e>
+            <m:sub>
+              <m:r>
+                <m:t>g</m:t>
+              </m:r>
+              <m:r>
+                <m:t>a</m:t>
+              </m:r>
+              <m:r>
+                <m:t>p</m:t>
+              </m:r>
+            </m:sub>
+            <m:sup>
+              <m:r>
+                <m:t>2</m:t>
+              </m:r>
+            </m:sup>
+          </m:sSubSup>
+          <m:r>
             <m:t>]</m:t>
+          </m:r>
+          <m:r>
+            <m:t>l</m:t>
+          </m:r>
+          <m:r>
+            <m:t>ρ</m:t>
           </m:r>
         </m:oMath>
       </m:oMathPara>
     </w:p>
     <w:p>
       <w:pPr>
-        <w:pStyle w:val="FirstParagraph"/>
+        <w:numPr>
+          <w:numId w:val="1000"/>
+          <w:ilvl w:val="0"/>
+        </w:numPr>
+      </w:pPr>
+      <w:r>
+        <w:t xml:space="preserve">Approximating to First Order thin walls (Neglecting higher order terms)[Proprioceptive Actuator Design in the MIT Cheetah: Impact Mitigation and High-Bandwidth Physical Interaction for Dynamic Legged Robots]</w:t>
+      </w:r>
+    </w:p>
+    <w:p>
+      <w:pPr>
+        <w:pStyle w:val="BodyText"/>
       </w:pPr>
       <m:oMathPara>
         <m:oMathParaPr>
@@ -3802,12 +4512,18 @@
         </m:oMathParaPr>
         <m:oMath>
           <m:r>
-            <m:t>τ</m:t>
-          </m:r>
-          <m:r>
-            <m:t>∝</m:t>
-          </m:r>
-          <m:sSubSup>
+            <m:t>M</m:t>
+          </m:r>
+          <m:r>
+            <m:t>≈</m:t>
+          </m:r>
+          <m:r>
+            <m:t>2</m:t>
+          </m:r>
+          <m:r>
+            <m:t>π</m:t>
+          </m:r>
+          <m:sSub>
             <m:e>
               <m:r>
                 <m:t>r</m:t>
@@ -3824,12 +4540,67 @@
                 <m:t>p</m:t>
               </m:r>
             </m:sub>
-            <m:sup>
-              <m:r>
-                <m:t>2</m:t>
-              </m:r>
-            </m:sup>
-          </m:sSubSup>
+          </m:sSub>
+          <m:r>
+            <m:t>l</m:t>
+          </m:r>
+          <m:r>
+            <m:t>(</m:t>
+          </m:r>
+          <m:sSub>
+            <m:e>
+              <m:r>
+                <m:t>t</m:t>
+              </m:r>
+            </m:e>
+            <m:sub>
+              <m:r>
+                <m:t>s</m:t>
+              </m:r>
+            </m:sub>
+          </m:sSub>
+          <m:sSub>
+            <m:e>
+              <m:r>
+                <m:t>ρ</m:t>
+              </m:r>
+            </m:e>
+            <m:sub>
+              <m:r>
+                <m:t>s</m:t>
+              </m:r>
+            </m:sub>
+          </m:sSub>
+          <m:r>
+            <m:t>+</m:t>
+          </m:r>
+          <m:sSub>
+            <m:e>
+              <m:r>
+                <m:t>t</m:t>
+              </m:r>
+            </m:e>
+            <m:sub>
+              <m:r>
+                <m:t>r</m:t>
+              </m:r>
+            </m:sub>
+          </m:sSub>
+          <m:sSub>
+            <m:e>
+              <m:r>
+                <m:t>ρ</m:t>
+              </m:r>
+            </m:e>
+            <m:sub>
+              <m:r>
+                <m:t>r</m:t>
+              </m:r>
+            </m:sub>
+          </m:sSub>
+          <m:r>
+            <m:t>)</m:t>
+          </m:r>
         </m:oMath>
       </m:oMathPara>
     </w:p>
@@ -3842,35 +4613,472 @@
           <m:jc m:val="center"/>
         </m:oMathParaPr>
         <m:oMath>
-          <m:r>
-            <m:t>J</m:t>
-          </m:r>
-          <m:r>
-            <m:t>∝</m:t>
+          <m:sSub>
+            <m:e>
+              <m:r>
+                <m:t>J</m:t>
+              </m:r>
+            </m:e>
+            <m:sub>
+              <m:r>
+                <m:t>h</m:t>
+              </m:r>
+              <m:r>
+                <m:t>o</m:t>
+              </m:r>
+              <m:r>
+                <m:t>l</m:t>
+              </m:r>
+              <m:r>
+                <m:t>l</m:t>
+              </m:r>
+              <m:r>
+                <m:t>o</m:t>
+              </m:r>
+              <m:r>
+                <m:t>w</m:t>
+              </m:r>
+              <m:r>
+                <m:t>c</m:t>
+              </m:r>
+              <m:r>
+                <m:t>y</m:t>
+              </m:r>
+              <m:r>
+                <m:t>l</m:t>
+              </m:r>
+              <m:r>
+                <m:t>i</m:t>
+              </m:r>
+              <m:r>
+                <m:t>n</m:t>
+              </m:r>
+              <m:r>
+                <m:t>d</m:t>
+              </m:r>
+              <m:r>
+                <m:t>e</m:t>
+              </m:r>
+              <m:r>
+                <m:t>r</m:t>
+              </m:r>
+            </m:sub>
+          </m:sSub>
+          <m:r>
+            <m:t>=</m:t>
+          </m:r>
+          <m:f>
+            <m:fPr>
+              <m:type m:val="bar"/>
+            </m:fPr>
+            <m:num>
+              <m:r>
+                <m:t>1</m:t>
+              </m:r>
+            </m:num>
+            <m:den>
+              <m:r>
+                <m:t>2</m:t>
+              </m:r>
+            </m:den>
+          </m:f>
+          <m:r>
+            <m:t>M</m:t>
+          </m:r>
+          <m:r>
+            <m:t>(</m:t>
           </m:r>
           <m:sSubSup>
             <m:e>
               <m:r>
-                <m:t>r</m:t>
+                <m:t>R</m:t>
               </m:r>
             </m:e>
             <m:sub>
               <m:r>
-                <m:t>g</m:t>
-              </m:r>
-              <m:r>
-                <m:t>a</m:t>
-              </m:r>
-              <m:r>
-                <m:t>p</m:t>
+                <m:t>i</m:t>
+              </m:r>
+              <m:r>
+                <m:t>n</m:t>
+              </m:r>
+              <m:r>
+                <m:t>n</m:t>
+              </m:r>
+              <m:r>
+                <m:t>e</m:t>
+              </m:r>
+              <m:r>
+                <m:t>r</m:t>
               </m:r>
             </m:sub>
             <m:sup>
               <m:r>
-                <m:t>3</m:t>
+                <m:t>2</m:t>
               </m:r>
             </m:sup>
           </m:sSubSup>
+          <m:r>
+            <m:t>+</m:t>
+          </m:r>
+          <m:sSubSup>
+            <m:e>
+              <m:r>
+                <m:t>R</m:t>
+              </m:r>
+            </m:e>
+            <m:sub>
+              <m:r>
+                <m:t>o</m:t>
+              </m:r>
+              <m:r>
+                <m:t>u</m:t>
+              </m:r>
+              <m:r>
+                <m:t>t</m:t>
+              </m:r>
+              <m:r>
+                <m:t>e</m:t>
+              </m:r>
+              <m:r>
+                <m:t>r</m:t>
+              </m:r>
+            </m:sub>
+            <m:sup>
+              <m:r>
+                <m:t>2</m:t>
+              </m:r>
+            </m:sup>
+          </m:sSubSup>
+          <m:r>
+            <m:t>)</m:t>
+          </m:r>
+        </m:oMath>
+      </m:oMathPara>
+    </w:p>
+    <w:p>
+      <w:pPr>
+        <w:pStyle w:val="FirstParagraph"/>
+      </w:pPr>
+      <m:oMathPara>
+        <m:oMathParaPr>
+          <m:jc m:val="center"/>
+        </m:oMathParaPr>
+        <m:oMath>
+          <m:sSub>
+            <m:e>
+              <m:r>
+                <m:t>J</m:t>
+              </m:r>
+            </m:e>
+            <m:sub>
+              <m:r>
+                <m:t>r</m:t>
+              </m:r>
+              <m:r>
+                <m:t>o</m:t>
+              </m:r>
+              <m:r>
+                <m:t>t</m:t>
+              </m:r>
+              <m:r>
+                <m:t>o</m:t>
+              </m:r>
+              <m:r>
+                <m:t>r</m:t>
+              </m:r>
+            </m:sub>
+          </m:sSub>
+          <m:r>
+            <m:t>≈</m:t>
+          </m:r>
+          <m:r>
+            <m:t>M</m:t>
+          </m:r>
+          <m:sSubSup>
+            <m:e>
+              <m:r>
+                <m:t>r</m:t>
+              </m:r>
+            </m:e>
+            <m:sub>
+              <m:r>
+                <m:t>g</m:t>
+              </m:r>
+              <m:r>
+                <m:t>a</m:t>
+              </m:r>
+              <m:r>
+                <m:t>p</m:t>
+              </m:r>
+            </m:sub>
+            <m:sup>
+              <m:r>
+                <m:t>2</m:t>
+              </m:r>
+            </m:sup>
+          </m:sSubSup>
+        </m:oMath>
+      </m:oMathPara>
+    </w:p>
+    <w:p>
+      <w:pPr>
+        <w:pStyle w:val="FirstParagraph"/>
+      </w:pPr>
+      <m:oMathPara>
+        <m:oMathParaPr>
+          <m:jc m:val="center"/>
+        </m:oMathParaPr>
+        <m:oMath>
+          <m:sSub>
+            <m:e>
+              <m:r>
+                <m:t>J</m:t>
+              </m:r>
+            </m:e>
+            <m:sub>
+              <m:r>
+                <m:t>r</m:t>
+              </m:r>
+              <m:r>
+                <m:t>o</m:t>
+              </m:r>
+              <m:r>
+                <m:t>t</m:t>
+              </m:r>
+              <m:r>
+                <m:t>o</m:t>
+              </m:r>
+              <m:r>
+                <m:t>r</m:t>
+              </m:r>
+            </m:sub>
+          </m:sSub>
+          <m:r>
+            <m:t>≈</m:t>
+          </m:r>
+          <m:r>
+            <m:t>2</m:t>
+          </m:r>
+          <m:r>
+            <m:t>π</m:t>
+          </m:r>
+          <m:r>
+            <m:t>l</m:t>
+          </m:r>
+          <m:sSub>
+            <m:e>
+              <m:r>
+                <m:t>t</m:t>
+              </m:r>
+            </m:e>
+            <m:sub>
+              <m:r>
+                <m:t>r</m:t>
+              </m:r>
+            </m:sub>
+          </m:sSub>
+          <m:sSub>
+            <m:e>
+              <m:r>
+                <m:t>ρ</m:t>
+              </m:r>
+            </m:e>
+            <m:sub>
+              <m:r>
+                <m:t>r</m:t>
+              </m:r>
+            </m:sub>
+          </m:sSub>
+          <m:sSubSup>
+            <m:e>
+              <m:r>
+                <m:t>r</m:t>
+              </m:r>
+            </m:e>
+            <m:sub>
+              <m:r>
+                <m:t>g</m:t>
+              </m:r>
+              <m:r>
+                <m:t>a</m:t>
+              </m:r>
+              <m:r>
+                <m:t>p</m:t>
+              </m:r>
+            </m:sub>
+            <m:sup>
+              <m:r>
+                <m:t>3</m:t>
+              </m:r>
+            </m:sup>
+          </m:sSubSup>
+        </m:oMath>
+      </m:oMathPara>
+    </w:p>
+    <w:p>
+      <w:pPr>
+        <w:pStyle w:val="FirstParagraph"/>
+      </w:pPr>
+      <m:oMathPara>
+        <m:oMathParaPr>
+          <m:jc m:val="center"/>
+        </m:oMathParaPr>
+        <m:oMath>
+          <m:r>
+            <m:t>τ</m:t>
+          </m:r>
+          <m:r>
+            <m:t>=</m:t>
+          </m:r>
+          <m:r>
+            <m:t>F</m:t>
+          </m:r>
+          <m:sSub>
+            <m:e>
+              <m:r>
+                <m:t>r</m:t>
+              </m:r>
+            </m:e>
+            <m:sub>
+              <m:r>
+                <m:t>g</m:t>
+              </m:r>
+              <m:r>
+                <m:t>a</m:t>
+              </m:r>
+              <m:r>
+                <m:t>p</m:t>
+              </m:r>
+            </m:sub>
+          </m:sSub>
+          <m:r>
+            <m:t>=</m:t>
+          </m:r>
+          <m:r>
+            <m:t>(</m:t>
+          </m:r>
+          <m:r>
+            <m:t>σ</m:t>
+          </m:r>
+          <m:r>
+            <m:t>A</m:t>
+          </m:r>
+          <m:r>
+            <m:t>)</m:t>
+          </m:r>
+          <m:sSub>
+            <m:e>
+              <m:r>
+                <m:t>r</m:t>
+              </m:r>
+            </m:e>
+            <m:sub>
+              <m:r>
+                <m:t>g</m:t>
+              </m:r>
+              <m:r>
+                <m:t>a</m:t>
+              </m:r>
+              <m:r>
+                <m:t>p</m:t>
+              </m:r>
+            </m:sub>
+          </m:sSub>
+          <m:r>
+            <m:t>=</m:t>
+          </m:r>
+          <m:r>
+            <m:t>(</m:t>
+          </m:r>
+          <m:r>
+            <m:t>σ</m:t>
+          </m:r>
+          <m:r>
+            <m:t>2</m:t>
+          </m:r>
+          <m:r>
+            <m:t>π</m:t>
+          </m:r>
+          <m:sSub>
+            <m:e>
+              <m:r>
+                <m:t>r</m:t>
+              </m:r>
+            </m:e>
+            <m:sub>
+              <m:r>
+                <m:t>g</m:t>
+              </m:r>
+              <m:r>
+                <m:t>a</m:t>
+              </m:r>
+              <m:r>
+                <m:t>p</m:t>
+              </m:r>
+            </m:sub>
+          </m:sSub>
+          <m:r>
+            <m:t>l</m:t>
+          </m:r>
+          <m:r>
+            <m:t>)</m:t>
+          </m:r>
+          <m:sSub>
+            <m:e>
+              <m:r>
+                <m:t>r</m:t>
+              </m:r>
+            </m:e>
+            <m:sub>
+              <m:r>
+                <m:t>g</m:t>
+              </m:r>
+              <m:r>
+                <m:t>a</m:t>
+              </m:r>
+              <m:r>
+                <m:t>p</m:t>
+              </m:r>
+            </m:sub>
+          </m:sSub>
+          <m:r>
+            <m:t>=</m:t>
+          </m:r>
+          <m:r>
+            <m:t>2</m:t>
+          </m:r>
+          <m:r>
+            <m:t>π</m:t>
+          </m:r>
+          <m:sSubSup>
+            <m:e>
+              <m:r>
+                <m:t>r</m:t>
+              </m:r>
+            </m:e>
+            <m:sub>
+              <m:r>
+                <m:t>g</m:t>
+              </m:r>
+              <m:r>
+                <m:t>a</m:t>
+              </m:r>
+              <m:r>
+                <m:t>p</m:t>
+              </m:r>
+            </m:sub>
+            <m:sup>
+              <m:r>
+                <m:t>3</m:t>
+              </m:r>
+            </m:sup>
+          </m:sSubSup>
+          <m:r>
+            <m:t>l</m:t>
+          </m:r>
+          <m:r>
+            <m:t>σ</m:t>
+          </m:r>
         </m:oMath>
       </m:oMathPara>
     </w:p>
@@ -3990,688 +5198,6 @@
         </w:numPr>
       </w:pPr>
       <w:r>
-        <w:t xml:space="preserve">Motor Constant</w:t>
-      </w:r>
-      <w:r>
-        <w:t xml:space="preserve"> </w:t>
-      </w:r>
-      <m:oMath>
-        <m:sSub>
-          <m:e>
-            <m:r>
-              <m:t>K</m:t>
-            </m:r>
-          </m:e>
-          <m:sub>
-            <m:r>
-              <m:t>m</m:t>
-            </m:r>
-          </m:sub>
-        </m:sSub>
-      </m:oMath>
-      <w:r>
-        <w:t xml:space="preserve"> </w:t>
-      </w:r>
-      <w:r>
-        <w:t xml:space="preserve">is the ability to produce Toqrue for a given heating power loss. It is winding invariant (as long as same conductimg wires used) but why? (Leanr about turns and wires thickness) (a)[https://ipfs.io/ipfs/QmXoypizjW3WknFiJnKLwHCnL72vedxjQkDDP1mXWo6uco/wiki/M otor_constants.html]</w:t>
-      </w:r>
-    </w:p>
-    <w:p>
-      <w:pPr>
-        <w:pStyle w:val="BodyText"/>
-      </w:pPr>
-      <m:oMathPara>
-        <m:oMathParaPr>
-          <m:jc m:val="center"/>
-        </m:oMathParaPr>
-        <m:oMath>
-          <m:sSub>
-            <m:e>
-              <m:r>
-                <m:t>K</m:t>
-              </m:r>
-            </m:e>
-            <m:sub>
-              <m:r>
-                <m:t>m</m:t>
-              </m:r>
-            </m:sub>
-          </m:sSub>
-          <m:r>
-            <m:t>=</m:t>
-          </m:r>
-          <m:f>
-            <m:fPr>
-              <m:type m:val="bar"/>
-            </m:fPr>
-            <m:num>
-              <m:r>
-                <m:t>τ</m:t>
-              </m:r>
-            </m:num>
-            <m:den>
-              <m:rad>
-                <m:radPr>
-                  <m:degHide m:val="1"/>
-                </m:radPr>
-                <m:deg/>
-                <m:e>
-                  <m:sSub>
-                    <m:e>
-                      <m:r>
-                        <m:t>P</m:t>
-                      </m:r>
-                    </m:e>
-                    <m:sub>
-                      <m:r>
-                        <m:t>l</m:t>
-                      </m:r>
-                      <m:r>
-                        <m:t>o</m:t>
-                      </m:r>
-                      <m:r>
-                        <m:t>s</m:t>
-                      </m:r>
-                      <m:r>
-                        <m:t>s</m:t>
-                      </m:r>
-                    </m:sub>
-                  </m:sSub>
-                </m:e>
-              </m:rad>
-            </m:den>
-          </m:f>
-          <m:r>
-            <m:t>=</m:t>
-          </m:r>
-          <m:f>
-            <m:fPr>
-              <m:type m:val="bar"/>
-            </m:fPr>
-            <m:num>
-              <m:r>
-                <m:t>I</m:t>
-              </m:r>
-              <m:sSub>
-                <m:e>
-                  <m:r>
-                    <m:t>K</m:t>
-                  </m:r>
-                </m:e>
-                <m:sub>
-                  <m:r>
-                    <m:t>T</m:t>
-                  </m:r>
-                </m:sub>
-              </m:sSub>
-            </m:num>
-            <m:den>
-              <m:rad>
-                <m:radPr>
-                  <m:degHide m:val="1"/>
-                </m:radPr>
-                <m:deg/>
-                <m:e>
-                  <m:sSup>
-                    <m:e>
-                      <m:r>
-                        <m:t>I</m:t>
-                      </m:r>
-                    </m:e>
-                    <m:sup>
-                      <m:r>
-                        <m:t>2</m:t>
-                      </m:r>
-                    </m:sup>
-                  </m:sSup>
-                  <m:r>
-                    <m:t>R</m:t>
-                  </m:r>
-                </m:e>
-              </m:rad>
-            </m:den>
-          </m:f>
-          <m:r>
-            <m:t>=</m:t>
-          </m:r>
-          <m:f>
-            <m:fPr>
-              <m:type m:val="bar"/>
-            </m:fPr>
-            <m:num>
-              <m:sSub>
-                <m:e>
-                  <m:r>
-                    <m:t>K</m:t>
-                  </m:r>
-                </m:e>
-                <m:sub>
-                  <m:r>
-                    <m:t>T</m:t>
-                  </m:r>
-                </m:sub>
-              </m:sSub>
-            </m:num>
-            <m:den>
-              <m:rad>
-                <m:radPr>
-                  <m:degHide m:val="1"/>
-                </m:radPr>
-                <m:deg/>
-                <m:e>
-                  <m:r>
-                    <m:t>R</m:t>
-                  </m:r>
-                </m:e>
-              </m:rad>
-            </m:den>
-          </m:f>
-        </m:oMath>
-      </m:oMathPara>
-    </w:p>
-    <w:p>
-      <w:pPr>
-        <w:pStyle w:val="FirstParagraph"/>
-      </w:pPr>
-      <m:oMathPara>
-        <m:oMathParaPr>
-          <m:jc m:val="center"/>
-        </m:oMathParaPr>
-        <m:oMath>
-          <m:sSubSup>
-            <m:e>
-              <m:r>
-                <m:t>K</m:t>
-              </m:r>
-            </m:e>
-            <m:sub>
-              <m:r>
-                <m:t>m</m:t>
-              </m:r>
-            </m:sub>
-            <m:sup>
-              <m:r>
-                <m:t>2</m:t>
-              </m:r>
-            </m:sup>
-          </m:sSubSup>
-          <m:r>
-            <m:t>∝</m:t>
-          </m:r>
-          <m:sSubSup>
-            <m:e>
-              <m:r>
-                <m:t>r</m:t>
-              </m:r>
-            </m:e>
-            <m:sub>
-              <m:r>
-                <m:t>g</m:t>
-              </m:r>
-              <m:r>
-                <m:t>a</m:t>
-              </m:r>
-              <m:r>
-                <m:t>p</m:t>
-              </m:r>
-            </m:sub>
-            <m:sup>
-              <m:r>
-                <m:t>3</m:t>
-              </m:r>
-            </m:sup>
-          </m:sSubSup>
-        </m:oMath>
-      </m:oMathPara>
-    </w:p>
-    <w:p>
-      <w:pPr>
-        <w:numPr>
-          <w:numId w:val="1000"/>
-          <w:ilvl w:val="0"/>
-        </w:numPr>
-      </w:pPr>
-      <w:r>
-        <w:t xml:space="preserve">[Actuator design for high force proprioceptive control in fast legged locomotion]</w:t>
-      </w:r>
-    </w:p>
-    <w:p>
-      <w:pPr>
-        <w:numPr>
-          <w:numId w:val="1000"/>
-          <w:ilvl w:val="0"/>
-        </w:numPr>
-      </w:pPr>
-      <w:r>
-        <w:rPr>
-          <w:b/>
-        </w:rPr>
-        <w:t xml:space="preserve">winding Invarainat?</w:t>
-      </w:r>
-      <w:r>
-        <w:t xml:space="preserve"> </w:t>
-      </w:r>
-      <w:r>
-        <w:t xml:space="preserve">[Leg Design for Energy Management in an Electromechanical Robot]</w:t>
-      </w:r>
-    </w:p>
-    <w:p>
-      <w:pPr>
-        <w:numPr>
-          <w:numId w:val="1000"/>
-          <w:ilvl w:val="0"/>
-        </w:numPr>
-      </w:pPr>
-      <w:r>
-        <w:t xml:space="preserve">Winding volume,</w:t>
-      </w:r>
-      <w:r>
-        <w:t xml:space="preserve"> </w:t>
-      </w:r>
-      <m:oMath>
-        <m:r>
-          <m:t>V</m:t>
-        </m:r>
-        <m:r>
-          <m:t>=</m:t>
-        </m:r>
-        <m:r>
-          <m:t>π</m:t>
-        </m:r>
-        <m:sSup>
-          <m:e>
-            <m:r>
-              <m:t>ρ</m:t>
-            </m:r>
-          </m:e>
-          <m:sup>
-            <m:r>
-              <m:t>2</m:t>
-            </m:r>
-          </m:sup>
-        </m:sSup>
-        <m:r>
-          <m:t>L</m:t>
-        </m:r>
-      </m:oMath>
-      <w:r>
-        <w:t xml:space="preserve">.</w:t>
-      </w:r>
-    </w:p>
-    <w:p>
-      <w:pPr>
-        <w:pStyle w:val="FirstParagraph"/>
-      </w:pPr>
-      <w:r>
-        <w:t xml:space="preserve">The resistance of the winding,</w:t>
-      </w:r>
-    </w:p>
-    <w:p>
-      <w:pPr>
-        <w:pStyle w:val="BodyText"/>
-      </w:pPr>
-      <m:oMathPara>
-        <m:oMathParaPr>
-          <m:jc m:val="center"/>
-        </m:oMathParaPr>
-        <m:oMath>
-          <m:r>
-            <m:t>R</m:t>
-          </m:r>
-          <m:r>
-            <m:t>∝</m:t>
-          </m:r>
-          <m:f>
-            <m:fPr>
-              <m:type m:val="bar"/>
-            </m:fPr>
-            <m:num>
-              <m:r>
-                <m:t>L</m:t>
-              </m:r>
-            </m:num>
-            <m:den>
-              <m:r>
-                <m:t>A</m:t>
-              </m:r>
-            </m:den>
-          </m:f>
-          <m:r>
-            <m:t>∝</m:t>
-          </m:r>
-          <m:f>
-            <m:fPr>
-              <m:type m:val="bar"/>
-            </m:fPr>
-            <m:num>
-              <m:r>
-                <m:t>1</m:t>
-              </m:r>
-            </m:num>
-            <m:den>
-              <m:sSup>
-                <m:e>
-                  <m:r>
-                    <m:t>ρ</m:t>
-                  </m:r>
-                </m:e>
-                <m:sup>
-                  <m:r>
-                    <m:t>4</m:t>
-                  </m:r>
-                </m:sup>
-              </m:sSup>
-            </m:den>
-          </m:f>
-        </m:oMath>
-      </m:oMathPara>
-    </w:p>
-    <w:p>
-      <w:pPr>
-        <w:pStyle w:val="FirstParagraph"/>
-      </w:pPr>
-      <m:oMathPara>
-        <m:oMathParaPr>
-          <m:jc m:val="center"/>
-        </m:oMathParaPr>
-        <m:oMath>
-          <m:sSub>
-            <m:e>
-              <m:r>
-                <m:t>K</m:t>
-              </m:r>
-            </m:e>
-            <m:sub>
-              <m:r>
-                <m:t>t</m:t>
-              </m:r>
-            </m:sub>
-          </m:sSub>
-          <m:r>
-            <m:t>∝</m:t>
-          </m:r>
-          <m:r>
-            <m:t>L</m:t>
-          </m:r>
-          <m:r>
-            <m:t>∝</m:t>
-          </m:r>
-          <m:f>
-            <m:fPr>
-              <m:type m:val="bar"/>
-            </m:fPr>
-            <m:num>
-              <m:r>
-                <m:t>1</m:t>
-              </m:r>
-            </m:num>
-            <m:den>
-              <m:sSup>
-                <m:e>
-                  <m:r>
-                    <m:t>ρ</m:t>
-                  </m:r>
-                </m:e>
-                <m:sup>
-                  <m:r>
-                    <m:t>2</m:t>
-                  </m:r>
-                </m:sup>
-              </m:sSup>
-            </m:den>
-          </m:f>
-        </m:oMath>
-      </m:oMathPara>
-    </w:p>
-    <w:p>
-      <w:pPr>
-        <w:pStyle w:val="FirstParagraph"/>
-      </w:pPr>
-      <m:oMathPara>
-        <m:oMathParaPr>
-          <m:jc m:val="center"/>
-        </m:oMathParaPr>
-        <m:oMath>
-          <m:r>
-            <m:t>τ</m:t>
-          </m:r>
-          <m:r>
-            <m:t>=</m:t>
-          </m:r>
-          <m:sSub>
-            <m:e>
-              <m:r>
-                <m:t>K</m:t>
-              </m:r>
-            </m:e>
-            <m:sub>
-              <m:r>
-                <m:t>t</m:t>
-              </m:r>
-            </m:sub>
-          </m:sSub>
-          <m:r>
-            <m:t>i</m:t>
-          </m:r>
-          <m:r>
-            <m:t>⟹</m:t>
-          </m:r>
-          <m:r>
-            <m:t>τ</m:t>
-          </m:r>
-          <m:r>
-            <m:t>∝</m:t>
-          </m:r>
-          <m:f>
-            <m:fPr>
-              <m:type m:val="bar"/>
-            </m:fPr>
-            <m:num>
-              <m:r>
-                <m:t>i</m:t>
-              </m:r>
-            </m:num>
-            <m:den>
-              <m:sSup>
-                <m:e>
-                  <m:r>
-                    <m:t>ρ</m:t>
-                  </m:r>
-                </m:e>
-                <m:sup>
-                  <m:r>
-                    <m:t>2</m:t>
-                  </m:r>
-                </m:sup>
-              </m:sSup>
-            </m:den>
-          </m:f>
-        </m:oMath>
-      </m:oMathPara>
-    </w:p>
-    <w:p>
-      <w:pPr>
-        <w:pStyle w:val="FirstParagraph"/>
-      </w:pPr>
-      <m:oMathPara>
-        <m:oMathParaPr>
-          <m:jc m:val="center"/>
-        </m:oMathParaPr>
-        <m:oMath>
-          <m:sSub>
-            <m:e>
-              <m:r>
-                <m:t>P</m:t>
-              </m:r>
-            </m:e>
-            <m:sub>
-              <m:r>
-                <m:t>l</m:t>
-              </m:r>
-              <m:r>
-                <m:t>o</m:t>
-              </m:r>
-              <m:r>
-                <m:t>s</m:t>
-              </m:r>
-              <m:r>
-                <m:t>s</m:t>
-              </m:r>
-            </m:sub>
-          </m:sSub>
-          <m:r>
-            <m:t>=</m:t>
-          </m:r>
-          <m:sSup>
-            <m:e>
-              <m:r>
-                <m:t>i</m:t>
-              </m:r>
-            </m:e>
-            <m:sup>
-              <m:r>
-                <m:t>2</m:t>
-              </m:r>
-            </m:sup>
-          </m:sSup>
-          <m:r>
-            <m:t>R</m:t>
-          </m:r>
-          <m:r>
-            <m:t>∝</m:t>
-          </m:r>
-          <m:f>
-            <m:fPr>
-              <m:type m:val="bar"/>
-            </m:fPr>
-            <m:num>
-              <m:sSup>
-                <m:e>
-                  <m:r>
-                    <m:t>i</m:t>
-                  </m:r>
-                </m:e>
-                <m:sup>
-                  <m:r>
-                    <m:t>2</m:t>
-                  </m:r>
-                </m:sup>
-              </m:sSup>
-            </m:num>
-            <m:den>
-              <m:sSup>
-                <m:e>
-                  <m:r>
-                    <m:t>ρ</m:t>
-                  </m:r>
-                </m:e>
-                <m:sup>
-                  <m:r>
-                    <m:t>4</m:t>
-                  </m:r>
-                </m:sup>
-              </m:sSup>
-            </m:den>
-          </m:f>
-        </m:oMath>
-      </m:oMathPara>
-    </w:p>
-    <w:p>
-      <w:pPr>
-        <w:pStyle w:val="FirstParagraph"/>
-      </w:pPr>
-      <w:r>
-        <w:t xml:space="preserve">thus</w:t>
-      </w:r>
-    </w:p>
-    <w:p>
-      <w:pPr>
-        <w:pStyle w:val="BodyText"/>
-      </w:pPr>
-      <m:oMathPara>
-        <m:oMathParaPr>
-          <m:jc m:val="center"/>
-        </m:oMathParaPr>
-        <m:oMath>
-          <m:sSub>
-            <m:e>
-              <m:r>
-                <m:t>K</m:t>
-              </m:r>
-            </m:e>
-            <m:sub>
-              <m:r>
-                <m:t>m</m:t>
-              </m:r>
-            </m:sub>
-          </m:sSub>
-          <m:r>
-            <m:t>=</m:t>
-          </m:r>
-          <m:f>
-            <m:fPr>
-              <m:type m:val="bar"/>
-            </m:fPr>
-            <m:num>
-              <m:r>
-                <m:t>T</m:t>
-              </m:r>
-            </m:num>
-            <m:den>
-              <m:rad>
-                <m:radPr>
-                  <m:degHide m:val="1"/>
-                </m:radPr>
-                <m:deg/>
-                <m:e>
-                  <m:sSub>
-                    <m:e>
-                      <m:r>
-                        <m:t>P</m:t>
-                      </m:r>
-                    </m:e>
-                    <m:sub>
-                      <m:r>
-                        <m:t>l</m:t>
-                      </m:r>
-                      <m:r>
-                        <m:t>o</m:t>
-                      </m:r>
-                      <m:r>
-                        <m:t>s</m:t>
-                      </m:r>
-                      <m:r>
-                        <m:t>s</m:t>
-                      </m:r>
-                    </m:sub>
-                  </m:sSub>
-                </m:e>
-              </m:rad>
-            </m:den>
-          </m:f>
-          <m:r>
-            <m:t>∝</m:t>
-          </m:r>
-          <m:sSup>
-            <m:e>
-              <m:r>
-                <m:t>ρ</m:t>
-              </m:r>
-            </m:e>
-            <m:sup>
-              <m:r>
-                <m:t>0</m:t>
-              </m:r>
-            </m:sup>
-          </m:sSup>
-        </m:oMath>
-      </m:oMathPara>
-    </w:p>
-    <w:p>
-      <w:pPr>
-        <w:pStyle w:val="FirstParagraph"/>
-      </w:pPr>
-      <w:r>
         <w:rPr>
           <w:b/>
         </w:rPr>
@@ -4698,7 +5224,10 @@
     </w:p>
     <w:p>
       <w:pPr>
-        <w:pStyle w:val="BodyText"/>
+        <w:numPr>
+          <w:numId w:val="1000"/>
+          <w:ilvl w:val="0"/>
+        </w:numPr>
       </w:pPr>
       <w:r>
         <w:t xml:space="preserve">Thus for a real world we need a hybrid approach</w:t>
@@ -4726,7 +5255,7 @@
       <w:pPr>
         <w:pStyle w:val="Compact"/>
         <w:numPr>
-          <w:numId w:val="1015"/>
+          <w:numId w:val="1006"/>
           <w:ilvl w:val="0"/>
         </w:numPr>
       </w:pPr>
@@ -4758,7 +5287,7 @@
       <w:pPr>
         <w:pStyle w:val="Compact"/>
         <w:numPr>
-          <w:numId w:val="1015"/>
+          <w:numId w:val="1006"/>
           <w:ilvl w:val="0"/>
         </w:numPr>
       </w:pPr>
@@ -5360,344 +5889,8 @@
       </w:pPr>
     </w:lvl>
   </w:abstractNum>
-  <w:abstractNum w:abstractNumId="99412">
+  <w:abstractNum w:abstractNumId="99415">
     <w:nsid w:val="71315dca"/>
-    <w:multiLevelType w:val="multilevel"/>
-    <w:lvl w:ilvl="0">
-      <w:start w:val="2"/>
-      <w:numFmt w:val="decimal"/>
-      <w:lvlText w:val="%1."/>
-      <w:lvlJc w:val="left"/>
-      <w:pPr>
-        <w:tabs>
-          <w:tab w:val="num" w:pos="0"/>
-        </w:tabs>
-        <w:ind w:left="480" w:hanging="480"/>
-      </w:pPr>
-    </w:lvl>
-    <w:lvl w:ilvl="1">
-      <w:start w:val="2"/>
-      <w:numFmt w:val="decimal"/>
-      <w:lvlText w:val="%2."/>
-      <w:lvlJc w:val="left"/>
-      <w:pPr>
-        <w:tabs>
-          <w:tab w:val="num" w:pos="720"/>
-        </w:tabs>
-        <w:ind w:left="1200" w:hanging="480"/>
-      </w:pPr>
-    </w:lvl>
-    <w:lvl w:ilvl="2">
-      <w:start w:val="2"/>
-      <w:numFmt w:val="decimal"/>
-      <w:lvlText w:val="%3."/>
-      <w:lvlJc w:val="left"/>
-      <w:pPr>
-        <w:tabs>
-          <w:tab w:val="num" w:pos="1440"/>
-        </w:tabs>
-        <w:ind w:left="1920" w:hanging="480"/>
-      </w:pPr>
-    </w:lvl>
-    <w:lvl w:ilvl="3">
-      <w:start w:val="2"/>
-      <w:numFmt w:val="decimal"/>
-      <w:lvlText w:val="%4."/>
-      <w:lvlJc w:val="left"/>
-      <w:pPr>
-        <w:tabs>
-          <w:tab w:val="num" w:pos="2160"/>
-        </w:tabs>
-        <w:ind w:left="2640" w:hanging="480"/>
-      </w:pPr>
-    </w:lvl>
-    <w:lvl w:ilvl="4">
-      <w:start w:val="2"/>
-      <w:numFmt w:val="decimal"/>
-      <w:lvlText w:val="%5."/>
-      <w:lvlJc w:val="left"/>
-      <w:pPr>
-        <w:tabs>
-          <w:tab w:val="num" w:pos="2880"/>
-        </w:tabs>
-        <w:ind w:left="3360" w:hanging="480"/>
-      </w:pPr>
-    </w:lvl>
-    <w:lvl w:ilvl="5">
-      <w:start w:val="2"/>
-      <w:numFmt w:val="decimal"/>
-      <w:lvlText w:val="%6."/>
-      <w:lvlJc w:val="left"/>
-      <w:pPr>
-        <w:tabs>
-          <w:tab w:val="num" w:pos="3600"/>
-        </w:tabs>
-        <w:ind w:left="4080" w:hanging="480"/>
-      </w:pPr>
-    </w:lvl>
-    <w:lvl w:ilvl="6">
-      <w:start w:val="2"/>
-      <w:numFmt w:val="decimal"/>
-      <w:lvlText w:val="%7."/>
-      <w:lvlJc w:val="left"/>
-      <w:pPr>
-        <w:tabs>
-          <w:tab w:val="num" w:pos="4320"/>
-        </w:tabs>
-        <w:ind w:left="4800" w:hanging="480"/>
-      </w:pPr>
-    </w:lvl>
-    <w:lvl w:ilvl="7">
-      <w:start w:val="2"/>
-      <w:numFmt w:val="decimal"/>
-      <w:lvlText w:val="%8."/>
-      <w:lvlJc w:val="left"/>
-      <w:pPr>
-        <w:tabs>
-          <w:tab w:val="num" w:pos="5040"/>
-        </w:tabs>
-        <w:ind w:left="5520" w:hanging="480"/>
-      </w:pPr>
-    </w:lvl>
-    <w:lvl w:ilvl="8">
-      <w:start w:val="2"/>
-      <w:numFmt w:val="decimal"/>
-      <w:lvlText w:val="%9."/>
-      <w:lvlJc w:val="left"/>
-      <w:pPr>
-        <w:tabs>
-          <w:tab w:val="num" w:pos="5760"/>
-        </w:tabs>
-        <w:ind w:left="6240" w:hanging="480"/>
-      </w:pPr>
-    </w:lvl>
-  </w:abstractNum>
-  <w:abstractNum w:abstractNumId="99413">
-    <w:nsid w:val="47261bad"/>
-    <w:multiLevelType w:val="multilevel"/>
-    <w:lvl w:ilvl="0">
-      <w:start w:val="3"/>
-      <w:numFmt w:val="decimal"/>
-      <w:lvlText w:val="%1."/>
-      <w:lvlJc w:val="left"/>
-      <w:pPr>
-        <w:tabs>
-          <w:tab w:val="num" w:pos="0"/>
-        </w:tabs>
-        <w:ind w:left="480" w:hanging="480"/>
-      </w:pPr>
-    </w:lvl>
-    <w:lvl w:ilvl="1">
-      <w:start w:val="3"/>
-      <w:numFmt w:val="decimal"/>
-      <w:lvlText w:val="%2."/>
-      <w:lvlJc w:val="left"/>
-      <w:pPr>
-        <w:tabs>
-          <w:tab w:val="num" w:pos="720"/>
-        </w:tabs>
-        <w:ind w:left="1200" w:hanging="480"/>
-      </w:pPr>
-    </w:lvl>
-    <w:lvl w:ilvl="2">
-      <w:start w:val="3"/>
-      <w:numFmt w:val="decimal"/>
-      <w:lvlText w:val="%3."/>
-      <w:lvlJc w:val="left"/>
-      <w:pPr>
-        <w:tabs>
-          <w:tab w:val="num" w:pos="1440"/>
-        </w:tabs>
-        <w:ind w:left="1920" w:hanging="480"/>
-      </w:pPr>
-    </w:lvl>
-    <w:lvl w:ilvl="3">
-      <w:start w:val="3"/>
-      <w:numFmt w:val="decimal"/>
-      <w:lvlText w:val="%4."/>
-      <w:lvlJc w:val="left"/>
-      <w:pPr>
-        <w:tabs>
-          <w:tab w:val="num" w:pos="2160"/>
-        </w:tabs>
-        <w:ind w:left="2640" w:hanging="480"/>
-      </w:pPr>
-    </w:lvl>
-    <w:lvl w:ilvl="4">
-      <w:start w:val="3"/>
-      <w:numFmt w:val="decimal"/>
-      <w:lvlText w:val="%5."/>
-      <w:lvlJc w:val="left"/>
-      <w:pPr>
-        <w:tabs>
-          <w:tab w:val="num" w:pos="2880"/>
-        </w:tabs>
-        <w:ind w:left="3360" w:hanging="480"/>
-      </w:pPr>
-    </w:lvl>
-    <w:lvl w:ilvl="5">
-      <w:start w:val="3"/>
-      <w:numFmt w:val="decimal"/>
-      <w:lvlText w:val="%6."/>
-      <w:lvlJc w:val="left"/>
-      <w:pPr>
-        <w:tabs>
-          <w:tab w:val="num" w:pos="3600"/>
-        </w:tabs>
-        <w:ind w:left="4080" w:hanging="480"/>
-      </w:pPr>
-    </w:lvl>
-    <w:lvl w:ilvl="6">
-      <w:start w:val="3"/>
-      <w:numFmt w:val="decimal"/>
-      <w:lvlText w:val="%7."/>
-      <w:lvlJc w:val="left"/>
-      <w:pPr>
-        <w:tabs>
-          <w:tab w:val="num" w:pos="4320"/>
-        </w:tabs>
-        <w:ind w:left="4800" w:hanging="480"/>
-      </w:pPr>
-    </w:lvl>
-    <w:lvl w:ilvl="7">
-      <w:start w:val="3"/>
-      <w:numFmt w:val="decimal"/>
-      <w:lvlText w:val="%8."/>
-      <w:lvlJc w:val="left"/>
-      <w:pPr>
-        <w:tabs>
-          <w:tab w:val="num" w:pos="5040"/>
-        </w:tabs>
-        <w:ind w:left="5520" w:hanging="480"/>
-      </w:pPr>
-    </w:lvl>
-    <w:lvl w:ilvl="8">
-      <w:start w:val="3"/>
-      <w:numFmt w:val="decimal"/>
-      <w:lvlText w:val="%9."/>
-      <w:lvlJc w:val="left"/>
-      <w:pPr>
-        <w:tabs>
-          <w:tab w:val="num" w:pos="5760"/>
-        </w:tabs>
-        <w:ind w:left="6240" w:hanging="480"/>
-      </w:pPr>
-    </w:lvl>
-  </w:abstractNum>
-  <w:abstractNum w:abstractNumId="99414">
-    <w:nsid w:val="b3cbbdee"/>
-    <w:multiLevelType w:val="multilevel"/>
-    <w:lvl w:ilvl="0">
-      <w:start w:val="4"/>
-      <w:numFmt w:val="decimal"/>
-      <w:lvlText w:val="%1."/>
-      <w:lvlJc w:val="left"/>
-      <w:pPr>
-        <w:tabs>
-          <w:tab w:val="num" w:pos="0"/>
-        </w:tabs>
-        <w:ind w:left="480" w:hanging="480"/>
-      </w:pPr>
-    </w:lvl>
-    <w:lvl w:ilvl="1">
-      <w:start w:val="4"/>
-      <w:numFmt w:val="decimal"/>
-      <w:lvlText w:val="%2."/>
-      <w:lvlJc w:val="left"/>
-      <w:pPr>
-        <w:tabs>
-          <w:tab w:val="num" w:pos="720"/>
-        </w:tabs>
-        <w:ind w:left="1200" w:hanging="480"/>
-      </w:pPr>
-    </w:lvl>
-    <w:lvl w:ilvl="2">
-      <w:start w:val="4"/>
-      <w:numFmt w:val="decimal"/>
-      <w:lvlText w:val="%3."/>
-      <w:lvlJc w:val="left"/>
-      <w:pPr>
-        <w:tabs>
-          <w:tab w:val="num" w:pos="1440"/>
-        </w:tabs>
-        <w:ind w:left="1920" w:hanging="480"/>
-      </w:pPr>
-    </w:lvl>
-    <w:lvl w:ilvl="3">
-      <w:start w:val="4"/>
-      <w:numFmt w:val="decimal"/>
-      <w:lvlText w:val="%4."/>
-      <w:lvlJc w:val="left"/>
-      <w:pPr>
-        <w:tabs>
-          <w:tab w:val="num" w:pos="2160"/>
-        </w:tabs>
-        <w:ind w:left="2640" w:hanging="480"/>
-      </w:pPr>
-    </w:lvl>
-    <w:lvl w:ilvl="4">
-      <w:start w:val="4"/>
-      <w:numFmt w:val="decimal"/>
-      <w:lvlText w:val="%5."/>
-      <w:lvlJc w:val="left"/>
-      <w:pPr>
-        <w:tabs>
-          <w:tab w:val="num" w:pos="2880"/>
-        </w:tabs>
-        <w:ind w:left="3360" w:hanging="480"/>
-      </w:pPr>
-    </w:lvl>
-    <w:lvl w:ilvl="5">
-      <w:start w:val="4"/>
-      <w:numFmt w:val="decimal"/>
-      <w:lvlText w:val="%6."/>
-      <w:lvlJc w:val="left"/>
-      <w:pPr>
-        <w:tabs>
-          <w:tab w:val="num" w:pos="3600"/>
-        </w:tabs>
-        <w:ind w:left="4080" w:hanging="480"/>
-      </w:pPr>
-    </w:lvl>
-    <w:lvl w:ilvl="6">
-      <w:start w:val="4"/>
-      <w:numFmt w:val="decimal"/>
-      <w:lvlText w:val="%7."/>
-      <w:lvlJc w:val="left"/>
-      <w:pPr>
-        <w:tabs>
-          <w:tab w:val="num" w:pos="4320"/>
-        </w:tabs>
-        <w:ind w:left="4800" w:hanging="480"/>
-      </w:pPr>
-    </w:lvl>
-    <w:lvl w:ilvl="7">
-      <w:start w:val="4"/>
-      <w:numFmt w:val="decimal"/>
-      <w:lvlText w:val="%8."/>
-      <w:lvlJc w:val="left"/>
-      <w:pPr>
-        <w:tabs>
-          <w:tab w:val="num" w:pos="5040"/>
-        </w:tabs>
-        <w:ind w:left="5520" w:hanging="480"/>
-      </w:pPr>
-    </w:lvl>
-    <w:lvl w:ilvl="8">
-      <w:start w:val="4"/>
-      <w:numFmt w:val="decimal"/>
-      <w:lvlText w:val="%9."/>
-      <w:lvlJc w:val="left"/>
-      <w:pPr>
-        <w:tabs>
-          <w:tab w:val="num" w:pos="5760"/>
-        </w:tabs>
-        <w:ind w:left="6240" w:hanging="480"/>
-      </w:pPr>
-    </w:lvl>
-  </w:abstractNum>
-  <w:abstractNum w:abstractNumId="99415">
-    <w:nsid w:val="4fbe019a"/>
     <w:multiLevelType w:val="multilevel"/>
     <w:lvl w:ilvl="0">
       <w:start w:val="5"/>
@@ -5797,342 +5990,6 @@
     </w:lvl>
     <w:lvl w:ilvl="8">
       <w:start w:val="5"/>
-      <w:numFmt w:val="decimal"/>
-      <w:lvlText w:val="%9."/>
-      <w:lvlJc w:val="left"/>
-      <w:pPr>
-        <w:tabs>
-          <w:tab w:val="num" w:pos="5760"/>
-        </w:tabs>
-        <w:ind w:left="6240" w:hanging="480"/>
-      </w:pPr>
-    </w:lvl>
-  </w:abstractNum>
-  <w:abstractNum w:abstractNumId="99417">
-    <w:nsid w:val="91a27d85"/>
-    <w:multiLevelType w:val="multilevel"/>
-    <w:lvl w:ilvl="0">
-      <w:start w:val="7"/>
-      <w:numFmt w:val="decimal"/>
-      <w:lvlText w:val="%1."/>
-      <w:lvlJc w:val="left"/>
-      <w:pPr>
-        <w:tabs>
-          <w:tab w:val="num" w:pos="0"/>
-        </w:tabs>
-        <w:ind w:left="480" w:hanging="480"/>
-      </w:pPr>
-    </w:lvl>
-    <w:lvl w:ilvl="1">
-      <w:start w:val="7"/>
-      <w:numFmt w:val="decimal"/>
-      <w:lvlText w:val="%2."/>
-      <w:lvlJc w:val="left"/>
-      <w:pPr>
-        <w:tabs>
-          <w:tab w:val="num" w:pos="720"/>
-        </w:tabs>
-        <w:ind w:left="1200" w:hanging="480"/>
-      </w:pPr>
-    </w:lvl>
-    <w:lvl w:ilvl="2">
-      <w:start w:val="7"/>
-      <w:numFmt w:val="decimal"/>
-      <w:lvlText w:val="%3."/>
-      <w:lvlJc w:val="left"/>
-      <w:pPr>
-        <w:tabs>
-          <w:tab w:val="num" w:pos="1440"/>
-        </w:tabs>
-        <w:ind w:left="1920" w:hanging="480"/>
-      </w:pPr>
-    </w:lvl>
-    <w:lvl w:ilvl="3">
-      <w:start w:val="7"/>
-      <w:numFmt w:val="decimal"/>
-      <w:lvlText w:val="%4."/>
-      <w:lvlJc w:val="left"/>
-      <w:pPr>
-        <w:tabs>
-          <w:tab w:val="num" w:pos="2160"/>
-        </w:tabs>
-        <w:ind w:left="2640" w:hanging="480"/>
-      </w:pPr>
-    </w:lvl>
-    <w:lvl w:ilvl="4">
-      <w:start w:val="7"/>
-      <w:numFmt w:val="decimal"/>
-      <w:lvlText w:val="%5."/>
-      <w:lvlJc w:val="left"/>
-      <w:pPr>
-        <w:tabs>
-          <w:tab w:val="num" w:pos="2880"/>
-        </w:tabs>
-        <w:ind w:left="3360" w:hanging="480"/>
-      </w:pPr>
-    </w:lvl>
-    <w:lvl w:ilvl="5">
-      <w:start w:val="7"/>
-      <w:numFmt w:val="decimal"/>
-      <w:lvlText w:val="%6."/>
-      <w:lvlJc w:val="left"/>
-      <w:pPr>
-        <w:tabs>
-          <w:tab w:val="num" w:pos="3600"/>
-        </w:tabs>
-        <w:ind w:left="4080" w:hanging="480"/>
-      </w:pPr>
-    </w:lvl>
-    <w:lvl w:ilvl="6">
-      <w:start w:val="7"/>
-      <w:numFmt w:val="decimal"/>
-      <w:lvlText w:val="%7."/>
-      <w:lvlJc w:val="left"/>
-      <w:pPr>
-        <w:tabs>
-          <w:tab w:val="num" w:pos="4320"/>
-        </w:tabs>
-        <w:ind w:left="4800" w:hanging="480"/>
-      </w:pPr>
-    </w:lvl>
-    <w:lvl w:ilvl="7">
-      <w:start w:val="7"/>
-      <w:numFmt w:val="decimal"/>
-      <w:lvlText w:val="%8."/>
-      <w:lvlJc w:val="left"/>
-      <w:pPr>
-        <w:tabs>
-          <w:tab w:val="num" w:pos="5040"/>
-        </w:tabs>
-        <w:ind w:left="5520" w:hanging="480"/>
-      </w:pPr>
-    </w:lvl>
-    <w:lvl w:ilvl="8">
-      <w:start w:val="7"/>
-      <w:numFmt w:val="decimal"/>
-      <w:lvlText w:val="%9."/>
-      <w:lvlJc w:val="left"/>
-      <w:pPr>
-        <w:tabs>
-          <w:tab w:val="num" w:pos="5760"/>
-        </w:tabs>
-        <w:ind w:left="6240" w:hanging="480"/>
-      </w:pPr>
-    </w:lvl>
-  </w:abstractNum>
-  <w:abstractNum w:abstractNumId="99416">
-    <w:nsid w:val="615f1ed2"/>
-    <w:multiLevelType w:val="multilevel"/>
-    <w:lvl w:ilvl="0">
-      <w:start w:val="6"/>
-      <w:numFmt w:val="decimal"/>
-      <w:lvlText w:val="%1."/>
-      <w:lvlJc w:val="left"/>
-      <w:pPr>
-        <w:tabs>
-          <w:tab w:val="num" w:pos="0"/>
-        </w:tabs>
-        <w:ind w:left="480" w:hanging="480"/>
-      </w:pPr>
-    </w:lvl>
-    <w:lvl w:ilvl="1">
-      <w:start w:val="6"/>
-      <w:numFmt w:val="decimal"/>
-      <w:lvlText w:val="%2."/>
-      <w:lvlJc w:val="left"/>
-      <w:pPr>
-        <w:tabs>
-          <w:tab w:val="num" w:pos="720"/>
-        </w:tabs>
-        <w:ind w:left="1200" w:hanging="480"/>
-      </w:pPr>
-    </w:lvl>
-    <w:lvl w:ilvl="2">
-      <w:start w:val="6"/>
-      <w:numFmt w:val="decimal"/>
-      <w:lvlText w:val="%3."/>
-      <w:lvlJc w:val="left"/>
-      <w:pPr>
-        <w:tabs>
-          <w:tab w:val="num" w:pos="1440"/>
-        </w:tabs>
-        <w:ind w:left="1920" w:hanging="480"/>
-      </w:pPr>
-    </w:lvl>
-    <w:lvl w:ilvl="3">
-      <w:start w:val="6"/>
-      <w:numFmt w:val="decimal"/>
-      <w:lvlText w:val="%4."/>
-      <w:lvlJc w:val="left"/>
-      <w:pPr>
-        <w:tabs>
-          <w:tab w:val="num" w:pos="2160"/>
-        </w:tabs>
-        <w:ind w:left="2640" w:hanging="480"/>
-      </w:pPr>
-    </w:lvl>
-    <w:lvl w:ilvl="4">
-      <w:start w:val="6"/>
-      <w:numFmt w:val="decimal"/>
-      <w:lvlText w:val="%5."/>
-      <w:lvlJc w:val="left"/>
-      <w:pPr>
-        <w:tabs>
-          <w:tab w:val="num" w:pos="2880"/>
-        </w:tabs>
-        <w:ind w:left="3360" w:hanging="480"/>
-      </w:pPr>
-    </w:lvl>
-    <w:lvl w:ilvl="5">
-      <w:start w:val="6"/>
-      <w:numFmt w:val="decimal"/>
-      <w:lvlText w:val="%6."/>
-      <w:lvlJc w:val="left"/>
-      <w:pPr>
-        <w:tabs>
-          <w:tab w:val="num" w:pos="3600"/>
-        </w:tabs>
-        <w:ind w:left="4080" w:hanging="480"/>
-      </w:pPr>
-    </w:lvl>
-    <w:lvl w:ilvl="6">
-      <w:start w:val="6"/>
-      <w:numFmt w:val="decimal"/>
-      <w:lvlText w:val="%7."/>
-      <w:lvlJc w:val="left"/>
-      <w:pPr>
-        <w:tabs>
-          <w:tab w:val="num" w:pos="4320"/>
-        </w:tabs>
-        <w:ind w:left="4800" w:hanging="480"/>
-      </w:pPr>
-    </w:lvl>
-    <w:lvl w:ilvl="7">
-      <w:start w:val="6"/>
-      <w:numFmt w:val="decimal"/>
-      <w:lvlText w:val="%8."/>
-      <w:lvlJc w:val="left"/>
-      <w:pPr>
-        <w:tabs>
-          <w:tab w:val="num" w:pos="5040"/>
-        </w:tabs>
-        <w:ind w:left="5520" w:hanging="480"/>
-      </w:pPr>
-    </w:lvl>
-    <w:lvl w:ilvl="8">
-      <w:start w:val="6"/>
-      <w:numFmt w:val="decimal"/>
-      <w:lvlText w:val="%9."/>
-      <w:lvlJc w:val="left"/>
-      <w:pPr>
-        <w:tabs>
-          <w:tab w:val="num" w:pos="5760"/>
-        </w:tabs>
-        <w:ind w:left="6240" w:hanging="480"/>
-      </w:pPr>
-    </w:lvl>
-  </w:abstractNum>
-  <w:abstractNum w:abstractNumId="99418">
-    <w:nsid w:val="238d8174"/>
-    <w:multiLevelType w:val="multilevel"/>
-    <w:lvl w:ilvl="0">
-      <w:start w:val="8"/>
-      <w:numFmt w:val="decimal"/>
-      <w:lvlText w:val="%1."/>
-      <w:lvlJc w:val="left"/>
-      <w:pPr>
-        <w:tabs>
-          <w:tab w:val="num" w:pos="0"/>
-        </w:tabs>
-        <w:ind w:left="480" w:hanging="480"/>
-      </w:pPr>
-    </w:lvl>
-    <w:lvl w:ilvl="1">
-      <w:start w:val="8"/>
-      <w:numFmt w:val="decimal"/>
-      <w:lvlText w:val="%2."/>
-      <w:lvlJc w:val="left"/>
-      <w:pPr>
-        <w:tabs>
-          <w:tab w:val="num" w:pos="720"/>
-        </w:tabs>
-        <w:ind w:left="1200" w:hanging="480"/>
-      </w:pPr>
-    </w:lvl>
-    <w:lvl w:ilvl="2">
-      <w:start w:val="8"/>
-      <w:numFmt w:val="decimal"/>
-      <w:lvlText w:val="%3."/>
-      <w:lvlJc w:val="left"/>
-      <w:pPr>
-        <w:tabs>
-          <w:tab w:val="num" w:pos="1440"/>
-        </w:tabs>
-        <w:ind w:left="1920" w:hanging="480"/>
-      </w:pPr>
-    </w:lvl>
-    <w:lvl w:ilvl="3">
-      <w:start w:val="8"/>
-      <w:numFmt w:val="decimal"/>
-      <w:lvlText w:val="%4."/>
-      <w:lvlJc w:val="left"/>
-      <w:pPr>
-        <w:tabs>
-          <w:tab w:val="num" w:pos="2160"/>
-        </w:tabs>
-        <w:ind w:left="2640" w:hanging="480"/>
-      </w:pPr>
-    </w:lvl>
-    <w:lvl w:ilvl="4">
-      <w:start w:val="8"/>
-      <w:numFmt w:val="decimal"/>
-      <w:lvlText w:val="%5."/>
-      <w:lvlJc w:val="left"/>
-      <w:pPr>
-        <w:tabs>
-          <w:tab w:val="num" w:pos="2880"/>
-        </w:tabs>
-        <w:ind w:left="3360" w:hanging="480"/>
-      </w:pPr>
-    </w:lvl>
-    <w:lvl w:ilvl="5">
-      <w:start w:val="8"/>
-      <w:numFmt w:val="decimal"/>
-      <w:lvlText w:val="%6."/>
-      <w:lvlJc w:val="left"/>
-      <w:pPr>
-        <w:tabs>
-          <w:tab w:val="num" w:pos="3600"/>
-        </w:tabs>
-        <w:ind w:left="4080" w:hanging="480"/>
-      </w:pPr>
-    </w:lvl>
-    <w:lvl w:ilvl="6">
-      <w:start w:val="8"/>
-      <w:numFmt w:val="decimal"/>
-      <w:lvlText w:val="%7."/>
-      <w:lvlJc w:val="left"/>
-      <w:pPr>
-        <w:tabs>
-          <w:tab w:val="num" w:pos="4320"/>
-        </w:tabs>
-        <w:ind w:left="4800" w:hanging="480"/>
-      </w:pPr>
-    </w:lvl>
-    <w:lvl w:ilvl="7">
-      <w:start w:val="8"/>
-      <w:numFmt w:val="decimal"/>
-      <w:lvlText w:val="%8."/>
-      <w:lvlJc w:val="left"/>
-      <w:pPr>
-        <w:tabs>
-          <w:tab w:val="num" w:pos="5040"/>
-        </w:tabs>
-        <w:ind w:left="5520" w:hanging="480"/>
-      </w:pPr>
-    </w:lvl>
-    <w:lvl w:ilvl="8">
-      <w:start w:val="8"/>
       <w:numFmt w:val="decimal"/>
       <w:lvlText w:val="%9."/>
       <w:lvlJc w:val="left"/>
@@ -6181,96 +6038,66 @@
     </w:lvlOverride>
   </w:num>
   <w:num w:numId="1002">
-    <w:abstractNumId w:val="99412"/>
+    <w:abstractNumId w:val="99411"/>
     <w:lvlOverride w:ilvl="0">
-      <w:startOverride w:val="2"/>
+      <w:startOverride w:val="1"/>
     </w:lvlOverride>
     <w:lvlOverride w:ilvl="1">
-      <w:startOverride w:val="2"/>
+      <w:startOverride w:val="1"/>
     </w:lvlOverride>
     <w:lvlOverride w:ilvl="2">
-      <w:startOverride w:val="2"/>
+      <w:startOverride w:val="1"/>
     </w:lvlOverride>
     <w:lvlOverride w:ilvl="3">
-      <w:startOverride w:val="2"/>
+      <w:startOverride w:val="1"/>
     </w:lvlOverride>
     <w:lvlOverride w:ilvl="4">
-      <w:startOverride w:val="2"/>
+      <w:startOverride w:val="1"/>
     </w:lvlOverride>
     <w:lvlOverride w:ilvl="5">
-      <w:startOverride w:val="2"/>
+      <w:startOverride w:val="1"/>
     </w:lvlOverride>
     <w:lvlOverride w:ilvl="6">
-      <w:startOverride w:val="2"/>
+      <w:startOverride w:val="1"/>
     </w:lvlOverride>
     <w:lvlOverride w:ilvl="7">
-      <w:startOverride w:val="2"/>
+      <w:startOverride w:val="1"/>
     </w:lvlOverride>
     <w:lvlOverride w:ilvl="8">
-      <w:startOverride w:val="2"/>
+      <w:startOverride w:val="1"/>
     </w:lvlOverride>
   </w:num>
   <w:num w:numId="1003">
-    <w:abstractNumId w:val="99413"/>
+    <w:abstractNumId w:val="99411"/>
     <w:lvlOverride w:ilvl="0">
-      <w:startOverride w:val="3"/>
+      <w:startOverride w:val="1"/>
     </w:lvlOverride>
     <w:lvlOverride w:ilvl="1">
-      <w:startOverride w:val="3"/>
+      <w:startOverride w:val="1"/>
     </w:lvlOverride>
     <w:lvlOverride w:ilvl="2">
-      <w:startOverride w:val="3"/>
+      <w:startOverride w:val="1"/>
     </w:lvlOverride>
     <w:lvlOverride w:ilvl="3">
-      <w:startOverride w:val="3"/>
+      <w:startOverride w:val="1"/>
     </w:lvlOverride>
     <w:lvlOverride w:ilvl="4">
-      <w:startOverride w:val="3"/>
+      <w:startOverride w:val="1"/>
     </w:lvlOverride>
     <w:lvlOverride w:ilvl="5">
-      <w:startOverride w:val="3"/>
+      <w:startOverride w:val="1"/>
     </w:lvlOverride>
     <w:lvlOverride w:ilvl="6">
-      <w:startOverride w:val="3"/>
+      <w:startOverride w:val="1"/>
     </w:lvlOverride>
     <w:lvlOverride w:ilvl="7">
-      <w:startOverride w:val="3"/>
+      <w:startOverride w:val="1"/>
     </w:lvlOverride>
     <w:lvlOverride w:ilvl="8">
-      <w:startOverride w:val="3"/>
+      <w:startOverride w:val="1"/>
     </w:lvlOverride>
   </w:num>
   <w:num w:numId="1004">
-    <w:abstractNumId w:val="99414"/>
-    <w:lvlOverride w:ilvl="0">
-      <w:startOverride w:val="4"/>
-    </w:lvlOverride>
-    <w:lvlOverride w:ilvl="1">
-      <w:startOverride w:val="4"/>
-    </w:lvlOverride>
-    <w:lvlOverride w:ilvl="2">
-      <w:startOverride w:val="4"/>
-    </w:lvlOverride>
-    <w:lvlOverride w:ilvl="3">
-      <w:startOverride w:val="4"/>
-    </w:lvlOverride>
-    <w:lvlOverride w:ilvl="4">
-      <w:startOverride w:val="4"/>
-    </w:lvlOverride>
-    <w:lvlOverride w:ilvl="5">
-      <w:startOverride w:val="4"/>
-    </w:lvlOverride>
-    <w:lvlOverride w:ilvl="6">
-      <w:startOverride w:val="4"/>
-    </w:lvlOverride>
-    <w:lvlOverride w:ilvl="7">
-      <w:startOverride w:val="4"/>
-    </w:lvlOverride>
-    <w:lvlOverride w:ilvl="8">
-      <w:startOverride w:val="4"/>
-    </w:lvlOverride>
-  </w:num>
-  <w:num w:numId="1005">
     <w:abstractNumId w:val="99415"/>
     <w:lvlOverride w:ilvl="0">
       <w:startOverride w:val="5"/>
@@ -6300,37 +6127,7 @@
       <w:startOverride w:val="5"/>
     </w:lvlOverride>
   </w:num>
-  <w:num w:numId="1006">
-    <w:abstractNumId w:val="99417"/>
-    <w:lvlOverride w:ilvl="0">
-      <w:startOverride w:val="7"/>
-    </w:lvlOverride>
-    <w:lvlOverride w:ilvl="1">
-      <w:startOverride w:val="7"/>
-    </w:lvlOverride>
-    <w:lvlOverride w:ilvl="2">
-      <w:startOverride w:val="7"/>
-    </w:lvlOverride>
-    <w:lvlOverride w:ilvl="3">
-      <w:startOverride w:val="7"/>
-    </w:lvlOverride>
-    <w:lvlOverride w:ilvl="4">
-      <w:startOverride w:val="7"/>
-    </w:lvlOverride>
-    <w:lvlOverride w:ilvl="5">
-      <w:startOverride w:val="7"/>
-    </w:lvlOverride>
-    <w:lvlOverride w:ilvl="6">
-      <w:startOverride w:val="7"/>
-    </w:lvlOverride>
-    <w:lvlOverride w:ilvl="7">
-      <w:startOverride w:val="7"/>
-    </w:lvlOverride>
-    <w:lvlOverride w:ilvl="8">
-      <w:startOverride w:val="7"/>
-    </w:lvlOverride>
-  </w:num>
-  <w:num w:numId="1007">
+  <w:num w:numId="1005">
     <w:abstractNumId w:val="99411"/>
     <w:lvlOverride w:ilvl="0">
       <w:startOverride w:val="1"/>
@@ -6360,217 +6157,7 @@
       <w:startOverride w:val="1"/>
     </w:lvlOverride>
   </w:num>
-  <w:num w:numId="1008">
-    <w:abstractNumId w:val="99411"/>
-    <w:lvlOverride w:ilvl="0">
-      <w:startOverride w:val="1"/>
-    </w:lvlOverride>
-    <w:lvlOverride w:ilvl="1">
-      <w:startOverride w:val="1"/>
-    </w:lvlOverride>
-    <w:lvlOverride w:ilvl="2">
-      <w:startOverride w:val="1"/>
-    </w:lvlOverride>
-    <w:lvlOverride w:ilvl="3">
-      <w:startOverride w:val="1"/>
-    </w:lvlOverride>
-    <w:lvlOverride w:ilvl="4">
-      <w:startOverride w:val="1"/>
-    </w:lvlOverride>
-    <w:lvlOverride w:ilvl="5">
-      <w:startOverride w:val="1"/>
-    </w:lvlOverride>
-    <w:lvlOverride w:ilvl="6">
-      <w:startOverride w:val="1"/>
-    </w:lvlOverride>
-    <w:lvlOverride w:ilvl="7">
-      <w:startOverride w:val="1"/>
-    </w:lvlOverride>
-    <w:lvlOverride w:ilvl="8">
-      <w:startOverride w:val="1"/>
-    </w:lvlOverride>
-  </w:num>
-  <w:num w:numId="1009">
-    <w:abstractNumId w:val="99412"/>
-    <w:lvlOverride w:ilvl="0">
-      <w:startOverride w:val="2"/>
-    </w:lvlOverride>
-    <w:lvlOverride w:ilvl="1">
-      <w:startOverride w:val="2"/>
-    </w:lvlOverride>
-    <w:lvlOverride w:ilvl="2">
-      <w:startOverride w:val="2"/>
-    </w:lvlOverride>
-    <w:lvlOverride w:ilvl="3">
-      <w:startOverride w:val="2"/>
-    </w:lvlOverride>
-    <w:lvlOverride w:ilvl="4">
-      <w:startOverride w:val="2"/>
-    </w:lvlOverride>
-    <w:lvlOverride w:ilvl="5">
-      <w:startOverride w:val="2"/>
-    </w:lvlOverride>
-    <w:lvlOverride w:ilvl="6">
-      <w:startOverride w:val="2"/>
-    </w:lvlOverride>
-    <w:lvlOverride w:ilvl="7">
-      <w:startOverride w:val="2"/>
-    </w:lvlOverride>
-    <w:lvlOverride w:ilvl="8">
-      <w:startOverride w:val="2"/>
-    </w:lvlOverride>
-  </w:num>
-  <w:num w:numId="1010">
-    <w:abstractNumId w:val="99413"/>
-    <w:lvlOverride w:ilvl="0">
-      <w:startOverride w:val="3"/>
-    </w:lvlOverride>
-    <w:lvlOverride w:ilvl="1">
-      <w:startOverride w:val="3"/>
-    </w:lvlOverride>
-    <w:lvlOverride w:ilvl="2">
-      <w:startOverride w:val="3"/>
-    </w:lvlOverride>
-    <w:lvlOverride w:ilvl="3">
-      <w:startOverride w:val="3"/>
-    </w:lvlOverride>
-    <w:lvlOverride w:ilvl="4">
-      <w:startOverride w:val="3"/>
-    </w:lvlOverride>
-    <w:lvlOverride w:ilvl="5">
-      <w:startOverride w:val="3"/>
-    </w:lvlOverride>
-    <w:lvlOverride w:ilvl="6">
-      <w:startOverride w:val="3"/>
-    </w:lvlOverride>
-    <w:lvlOverride w:ilvl="7">
-      <w:startOverride w:val="3"/>
-    </w:lvlOverride>
-    <w:lvlOverride w:ilvl="8">
-      <w:startOverride w:val="3"/>
-    </w:lvlOverride>
-  </w:num>
-  <w:num w:numId="1011">
-    <w:abstractNumId w:val="99416"/>
-    <w:lvlOverride w:ilvl="0">
-      <w:startOverride w:val="6"/>
-    </w:lvlOverride>
-    <w:lvlOverride w:ilvl="1">
-      <w:startOverride w:val="6"/>
-    </w:lvlOverride>
-    <w:lvlOverride w:ilvl="2">
-      <w:startOverride w:val="6"/>
-    </w:lvlOverride>
-    <w:lvlOverride w:ilvl="3">
-      <w:startOverride w:val="6"/>
-    </w:lvlOverride>
-    <w:lvlOverride w:ilvl="4">
-      <w:startOverride w:val="6"/>
-    </w:lvlOverride>
-    <w:lvlOverride w:ilvl="5">
-      <w:startOverride w:val="6"/>
-    </w:lvlOverride>
-    <w:lvlOverride w:ilvl="6">
-      <w:startOverride w:val="6"/>
-    </w:lvlOverride>
-    <w:lvlOverride w:ilvl="7">
-      <w:startOverride w:val="6"/>
-    </w:lvlOverride>
-    <w:lvlOverride w:ilvl="8">
-      <w:startOverride w:val="6"/>
-    </w:lvlOverride>
-  </w:num>
-  <w:num w:numId="1012">
-    <w:abstractNumId w:val="99417"/>
-    <w:lvlOverride w:ilvl="0">
-      <w:startOverride w:val="7"/>
-    </w:lvlOverride>
-    <w:lvlOverride w:ilvl="1">
-      <w:startOverride w:val="7"/>
-    </w:lvlOverride>
-    <w:lvlOverride w:ilvl="2">
-      <w:startOverride w:val="7"/>
-    </w:lvlOverride>
-    <w:lvlOverride w:ilvl="3">
-      <w:startOverride w:val="7"/>
-    </w:lvlOverride>
-    <w:lvlOverride w:ilvl="4">
-      <w:startOverride w:val="7"/>
-    </w:lvlOverride>
-    <w:lvlOverride w:ilvl="5">
-      <w:startOverride w:val="7"/>
-    </w:lvlOverride>
-    <w:lvlOverride w:ilvl="6">
-      <w:startOverride w:val="7"/>
-    </w:lvlOverride>
-    <w:lvlOverride w:ilvl="7">
-      <w:startOverride w:val="7"/>
-    </w:lvlOverride>
-    <w:lvlOverride w:ilvl="8">
-      <w:startOverride w:val="7"/>
-    </w:lvlOverride>
-  </w:num>
-  <w:num w:numId="1013">
-    <w:abstractNumId w:val="99418"/>
-    <w:lvlOverride w:ilvl="0">
-      <w:startOverride w:val="8"/>
-    </w:lvlOverride>
-    <w:lvlOverride w:ilvl="1">
-      <w:startOverride w:val="8"/>
-    </w:lvlOverride>
-    <w:lvlOverride w:ilvl="2">
-      <w:startOverride w:val="8"/>
-    </w:lvlOverride>
-    <w:lvlOverride w:ilvl="3">
-      <w:startOverride w:val="8"/>
-    </w:lvlOverride>
-    <w:lvlOverride w:ilvl="4">
-      <w:startOverride w:val="8"/>
-    </w:lvlOverride>
-    <w:lvlOverride w:ilvl="5">
-      <w:startOverride w:val="8"/>
-    </w:lvlOverride>
-    <w:lvlOverride w:ilvl="6">
-      <w:startOverride w:val="8"/>
-    </w:lvlOverride>
-    <w:lvlOverride w:ilvl="7">
-      <w:startOverride w:val="8"/>
-    </w:lvlOverride>
-    <w:lvlOverride w:ilvl="8">
-      <w:startOverride w:val="8"/>
-    </w:lvlOverride>
-  </w:num>
-  <w:num w:numId="1014">
-    <w:abstractNumId w:val="99411"/>
-    <w:lvlOverride w:ilvl="0">
-      <w:startOverride w:val="1"/>
-    </w:lvlOverride>
-    <w:lvlOverride w:ilvl="1">
-      <w:startOverride w:val="1"/>
-    </w:lvlOverride>
-    <w:lvlOverride w:ilvl="2">
-      <w:startOverride w:val="1"/>
-    </w:lvlOverride>
-    <w:lvlOverride w:ilvl="3">
-      <w:startOverride w:val="1"/>
-    </w:lvlOverride>
-    <w:lvlOverride w:ilvl="4">
-      <w:startOverride w:val="1"/>
-    </w:lvlOverride>
-    <w:lvlOverride w:ilvl="5">
-      <w:startOverride w:val="1"/>
-    </w:lvlOverride>
-    <w:lvlOverride w:ilvl="6">
-      <w:startOverride w:val="1"/>
-    </w:lvlOverride>
-    <w:lvlOverride w:ilvl="7">
-      <w:startOverride w:val="1"/>
-    </w:lvlOverride>
-    <w:lvlOverride w:ilvl="8">
-      <w:startOverride w:val="1"/>
-    </w:lvlOverride>
-  </w:num>
-  <w:num w:numId="1015">
+  <w:num w:numId="1006">
     <w:abstractNumId w:val="99411"/>
     <w:lvlOverride w:ilvl="0">
       <w:startOverride w:val="1"/>

</xml_diff>

<commit_message>
Testing my alignment of rought drfat
</commit_message>
<xml_diff>
--- a/_includes/projects/motor/output/motor.docx
+++ b/_includes/projects/motor/output/motor.docx
@@ -7,7 +7,43 @@
         <w:pStyle w:val="Title"/>
       </w:pPr>
       <w:r>
-        <w:t xml:space="preserve">BLDC</w:t>
+        <w:t xml:space="preserve">Study</w:t>
+      </w:r>
+      <w:r>
+        <w:t xml:space="preserve"> </w:t>
+      </w:r>
+      <w:r>
+        <w:t xml:space="preserve">of</w:t>
+      </w:r>
+      <w:r>
+        <w:t xml:space="preserve"> </w:t>
+      </w:r>
+      <w:r>
+        <w:t xml:space="preserve">PMSM/BLDC</w:t>
+      </w:r>
+      <w:r>
+        <w:t xml:space="preserve"> </w:t>
+      </w:r>
+      <w:r>
+        <w:t xml:space="preserve">Motor:</w:t>
+      </w:r>
+      <w:r>
+        <w:t xml:space="preserve"> </w:t>
+      </w:r>
+      <w:r>
+        <w:t xml:space="preserve">Design,</w:t>
+      </w:r>
+      <w:r>
+        <w:t xml:space="preserve"> </w:t>
+      </w:r>
+      <w:r>
+        <w:t xml:space="preserve">Dynamics,</w:t>
+      </w:r>
+      <w:r>
+        <w:t xml:space="preserve"> </w:t>
+      </w:r>
+      <w:r>
+        <w:t xml:space="preserve">Drive</w:t>
       </w:r>
     </w:p>
     <w:p>
@@ -23,20 +59,14 @@
       <w:r>
         <w:t xml:space="preserve">G</w:t>
       </w:r>
-      <w:r>
-        <w:t xml:space="preserve"> </w:t>
-      </w:r>
-      <w:r>
-        <w:t xml:space="preserve">%</w:t>
-      </w:r>
     </w:p>
     <w:p>
       <w:pPr>
         <w:pStyle w:val="Heading3"/>
       </w:pPr>
-      <w:bookmarkStart w:id="20" w:name="why-bldc"/>
-      <w:r>
-        <w:t xml:space="preserve">Why BLDC ?</w:t>
+      <w:bookmarkStart w:id="20" w:name="introduction"/>
+      <w:r>
+        <w:t xml:space="preserve">Introduction</w:t>
       </w:r>
       <w:bookmarkEnd w:id="20"/>
     </w:p>
@@ -45,7 +75,54 @@
         <w:pStyle w:val="FirstParagraph"/>
       </w:pPr>
       <w:r>
-        <w:t xml:space="preserve">Reduced noise, wear, and friction caused by brushes and Torque-Speed characteristics is linear.[Direct-drive robots: theory and practice]</w:t>
+        <w:t xml:space="preserve">What is a robot?</w:t>
+      </w:r>
+    </w:p>
+    <w:p>
+      <w:pPr>
+        <w:pStyle w:val="BodyText"/>
+      </w:pPr>
+      <w:r>
+        <w:t xml:space="preserve">A robot is a bunch of actuator connected by a link(a structure). Actuators, being one of the fundamental element of a robot, will determine the core capabilities and limitation of a robot. Thus a thorough understanding of the actuator will help us to optimise it based upon our requirment.</w:t>
+      </w:r>
+    </w:p>
+    <w:p>
+      <w:pPr>
+        <w:pStyle w:val="BodyText"/>
+      </w:pPr>
+      <w:r>
+        <w:t xml:space="preserve">In this article we restrict ourself to Electromagnetic Actuator (Motors), since it is the most widely used one and has a higher energy efficiency compared to other like hydraulic, pneumatic, etc..</w:t>
+      </w:r>
+    </w:p>
+    <w:p>
+      <w:pPr>
+        <w:pStyle w:val="BodyText"/>
+      </w:pPr>
+      <w:r>
+        <w:t xml:space="preserve">Out of all the various type of motor like Induction, Reluctance, PMSM/BLDC, DC, Stepper, etc… I’ll be focusing on only BLDC/PMSM Motors due to its superior perfomance compared to others. However most of the concepts you learn here, will be helpful for understanding other motors too.</w:t>
+      </w:r>
+    </w:p>
+    <w:p>
+      <w:pPr>
+        <w:pStyle w:val="BodyText"/>
+      </w:pPr>
+      <w:r>
+        <w:t xml:space="preserve">Our goal is to understand various factors of EM actuator which influences the perfomance and hopefully to justify why</w:t>
+      </w:r>
+      <w:r>
+        <w:t xml:space="preserve"> </w:t>
+      </w:r>
+      <w:r>
+        <w:rPr>
+          <w:b/>
+        </w:rPr>
+        <w:t xml:space="preserve">pancake shaped, Quasi Direct-Drive PMSM/BLDC motor, with 4Q control drivers &amp; SEA</w:t>
+      </w:r>
+      <w:r>
+        <w:t xml:space="preserve"> </w:t>
+      </w:r>
+      <w:r>
+        <w:t xml:space="preserve">will be the norm of the robotics in future.</w:t>
       </w:r>
     </w:p>
     <w:p>
@@ -769,7 +846,7 @@
     </w:p>
     <w:p>
       <w:pPr>
-        <w:pStyle w:val="Heading4"/>
+        <w:pStyle w:val="Heading3"/>
       </w:pPr>
       <w:bookmarkStart w:id="24" w:name="motor-parameters"/>
       <w:r>
@@ -3751,7 +3828,7 @@
     </w:p>
     <w:p>
       <w:pPr>
-        <w:pStyle w:val="Heading5"/>
+        <w:pStyle w:val="Heading3"/>
       </w:pPr>
       <w:bookmarkStart w:id="25" w:name="characteristics"/>
       <w:r>
@@ -5193,6 +5270,43 @@
     <w:p>
       <w:pPr>
         <w:numPr>
+          <w:numId w:val="1005"/>
+          <w:ilvl w:val="0"/>
+        </w:numPr>
+      </w:pPr>
+      <w:r>
+        <w:rPr>
+          <w:b/>
+        </w:rPr>
+        <w:t xml:space="preserve">Core vs Coreless</w:t>
+      </w:r>
+      <w:r>
+        <w:t xml:space="preserve">:</w:t>
+      </w:r>
+      <w:r>
+        <w:t xml:space="preserve"> </w:t>
+      </w:r>
+      <w:r>
+        <w:t xml:space="preserve">d</w:t>
+      </w:r>
+    </w:p>
+    <w:p>
+      <w:pPr>
+        <w:numPr>
+          <w:numId w:val="1005"/>
+          <w:ilvl w:val="0"/>
+        </w:numPr>
+      </w:pPr>
+      <w:r>
+        <w:rPr>
+          <w:b/>
+        </w:rPr>
+        <w:t xml:space="preserve">Axial Flux vs Radial Flux</w:t>
+      </w:r>
+    </w:p>
+    <w:p>
+      <w:pPr>
+        <w:numPr>
           <w:numId w:val="1000"/>
           <w:ilvl w:val="0"/>
         </w:numPr>
@@ -5235,7 +5349,7 @@
     </w:p>
     <w:p>
       <w:pPr>
-        <w:pStyle w:val="Heading4"/>
+        <w:pStyle w:val="Heading3"/>
       </w:pPr>
       <w:bookmarkStart w:id="26" w:name="losses"/>
       <w:r>
@@ -5415,89 +5529,101 @@
     </w:p>
     <w:p>
       <w:pPr>
+        <w:pStyle w:val="Heading3"/>
+      </w:pPr>
+      <w:bookmarkStart w:id="27" w:name="selection-criteria"/>
+      <w:r>
+        <w:t xml:space="preserve">Selection Criteria</w:t>
+      </w:r>
+      <w:bookmarkEnd w:id="27"/>
+    </w:p>
+    <w:p>
+      <w:pPr>
+        <w:pStyle w:val="FirstParagraph"/>
+      </w:pPr>
+      <w:r>
+        <w:t xml:space="preserve">[Actuator design for a high performance legged biped robot]</w:t>
+      </w:r>
+    </w:p>
+    <w:p>
+      <w:pPr>
         <w:pStyle w:val="BodyText"/>
       </w:pPr>
       <w:r>
-        <w:t xml:space="preserve">#### To Do ####</w:t>
-      </w:r>
-      <w:r>
-        <w:t xml:space="preserve"> </w:t>
-      </w:r>
-      <w:r>
-        <w:t xml:space="preserve">1. [Design of brushless permanent-magnet machines] finish 1.3.3 and 1.4.2</w:t>
-      </w:r>
-    </w:p>
-    <w:p>
-      <w:pPr>
-        <w:pStyle w:val="Heading2"/>
-      </w:pPr>
-      <w:bookmarkStart w:id="27" w:name="selection-criteria"/>
-      <w:r>
-        <w:t xml:space="preserve">Selection Criteria</w:t>
-      </w:r>
-      <w:bookmarkEnd w:id="27"/>
+        <w:t xml:space="preserve">A smaller motor will have lower iron losses at a given speed (less iron to create drag), and a larger motor will have lower copper losses for a given torque.</w:t>
+      </w:r>
+    </w:p>
+    <w:p>
+      <w:pPr>
+        <w:pStyle w:val="BodyText"/>
+      </w:pPr>
+      <w:r>
+        <w:t xml:space="preserve">One interesting approach to motor sizing for a robot is to choose a small motor sized for walking, and then to overload it heavily during more strenuous activities.</w:t>
+      </w:r>
+    </w:p>
+    <w:p>
+      <w:pPr>
+        <w:pStyle w:val="BodyText"/>
+      </w:pPr>
+      <w:r>
+        <w:t xml:space="preserve">This might result in huge copper losses due to squaring the high winding current, but for brief periods the effect on overall efficiency is minimal.</w:t>
+      </w:r>
+    </w:p>
+    <w:p>
+      <w:pPr>
+        <w:pStyle w:val="BodyText"/>
+      </w:pPr>
+      <w:r>
+        <w:t xml:space="preserve">The thermal mass of the motor windings is high enough that it might not burn up for several seconds, and if it is cooled well enough the power level may be sustainable for longer activities.</w:t>
+      </w:r>
+    </w:p>
+    <w:p>
+      <w:pPr>
+        <w:pStyle w:val="BodyText"/>
+      </w:pPr>
+      <w:r>
+        <w:t xml:space="preserve">This is particularly true for permanent magnet brushless motors, in which the stator coils are stationary and in contact with the case, well-positioned for heat sinks or water cooling jackets. (For brushed motors the magnets are on the outside and the windings are in the rotor, leaving few options for cooling.</w:t>
+      </w:r>
+    </w:p>
+    <w:p>
+      <w:pPr>
+        <w:pStyle w:val="Heading3"/>
+      </w:pPr>
+      <w:bookmarkStart w:id="28" w:name="perfomance"/>
+      <w:r>
+        <w:t xml:space="preserve">Perfomance</w:t>
+      </w:r>
+      <w:bookmarkEnd w:id="28"/>
     </w:p>
     <w:p>
       <w:pPr>
         <w:pStyle w:val="FirstParagraph"/>
       </w:pPr>
       <w:r>
-        <w:t xml:space="preserve">[Actuator design for a high performance legged biped robot]</w:t>
-      </w:r>
-    </w:p>
-    <w:p>
-      <w:pPr>
-        <w:pStyle w:val="BodyText"/>
-      </w:pPr>
-      <w:r>
-        <w:t xml:space="preserve">A smaller motor will have lower iron losses at a given speed (less iron to create drag), and a larger motor will have lower copper losses for a given torque.</w:t>
-      </w:r>
-    </w:p>
-    <w:p>
-      <w:pPr>
-        <w:pStyle w:val="BodyText"/>
-      </w:pPr>
-      <w:r>
-        <w:t xml:space="preserve">One interesting approach to motor sizing for a robot is to choose a small motor sized for walking, and then to overload it heavily during more strenuous activities.</w:t>
-      </w:r>
-    </w:p>
-    <w:p>
-      <w:pPr>
-        <w:pStyle w:val="BodyText"/>
-      </w:pPr>
-      <w:r>
-        <w:t xml:space="preserve">This might result in huge copper losses due to squaring the high winding current, but for brief periods the effect on overall efficiency is minimal.</w:t>
-      </w:r>
-    </w:p>
-    <w:p>
-      <w:pPr>
-        <w:pStyle w:val="BodyText"/>
-      </w:pPr>
-      <w:r>
-        <w:t xml:space="preserve">The thermal mass of the motor windings is high enough that it might not burn up for several seconds, and if it is cooled well enough the power level may be sustainable for longer activities.</w:t>
-      </w:r>
-    </w:p>
-    <w:p>
-      <w:pPr>
-        <w:pStyle w:val="BodyText"/>
-      </w:pPr>
-      <w:r>
-        <w:t xml:space="preserve">This is particularly true for permanent magnet brushless motors, in which the stator coils are stationary and in contact with the case, well-positioned for heat sinks or water cooling jackets. (For brushed motors the magnets are on the outside and the windings are in the rotor, leaving few options for cooling.</w:t>
-      </w:r>
-    </w:p>
-    <w:p>
-      <w:pPr>
-        <w:pStyle w:val="Heading2"/>
-      </w:pPr>
-      <w:bookmarkStart w:id="28" w:name="drive"/>
-      <w:r>
-        <w:t xml:space="preserve">Drive</w:t>
-      </w:r>
-      <w:bookmarkEnd w:id="28"/>
-    </w:p>
-    <w:p>
-      <w:pPr>
-        <w:pStyle w:val="Heading2"/>
+        <w:t xml:space="preserve">Reduced noise, wear, and friction caused by brushes and Torque-Speed characteristics is linear.[Direct-drive robots: theory and practice]</w:t>
+      </w:r>
+      <w:r>
+        <w:t xml:space="preserve"> </w:t>
+      </w:r>
+      <w:r>
+        <w:t xml:space="preserve">### To Do ###</w:t>
+      </w:r>
+    </w:p>
+    <w:p>
+      <w:pPr>
+        <w:pStyle w:val="Compact"/>
+        <w:numPr>
+          <w:numId w:val="1007"/>
+          <w:ilvl w:val="0"/>
+        </w:numPr>
+      </w:pPr>
+      <w:r>
+        <w:t xml:space="preserve">[Design of brushless permanent-magnet machines] finish 1.3.3 and 1.4.2</w:t>
+      </w:r>
+    </w:p>
+    <w:p>
+      <w:pPr>
+        <w:pStyle w:val="Heading3"/>
       </w:pPr>
       <w:bookmarkStart w:id="29" w:name="references"/>
       <w:r>
@@ -6158,6 +6284,36 @@
     </w:lvlOverride>
   </w:num>
   <w:num w:numId="1006">
+    <w:abstractNumId w:val="99411"/>
+    <w:lvlOverride w:ilvl="0">
+      <w:startOverride w:val="1"/>
+    </w:lvlOverride>
+    <w:lvlOverride w:ilvl="1">
+      <w:startOverride w:val="1"/>
+    </w:lvlOverride>
+    <w:lvlOverride w:ilvl="2">
+      <w:startOverride w:val="1"/>
+    </w:lvlOverride>
+    <w:lvlOverride w:ilvl="3">
+      <w:startOverride w:val="1"/>
+    </w:lvlOverride>
+    <w:lvlOverride w:ilvl="4">
+      <w:startOverride w:val="1"/>
+    </w:lvlOverride>
+    <w:lvlOverride w:ilvl="5">
+      <w:startOverride w:val="1"/>
+    </w:lvlOverride>
+    <w:lvlOverride w:ilvl="6">
+      <w:startOverride w:val="1"/>
+    </w:lvlOverride>
+    <w:lvlOverride w:ilvl="7">
+      <w:startOverride w:val="1"/>
+    </w:lvlOverride>
+    <w:lvlOverride w:ilvl="8">
+      <w:startOverride w:val="1"/>
+    </w:lvlOverride>
+  </w:num>
+  <w:num w:numId="1007">
     <w:abstractNumId w:val="99411"/>
     <w:lvlOverride w:ilvl="0">
       <w:startOverride w:val="1"/>

</xml_diff>

<commit_message>
Testing alignment of motor.hmtl's rought draft
</commit_message>
<xml_diff>
--- a/_includes/projects/motor/output/motor.docx
+++ b/_includes/projects/motor/output/motor.docx
@@ -5630,6 +5630,32 @@
         <w:t xml:space="preserve">References</w:t>
       </w:r>
       <w:bookmarkEnd w:id="29"/>
+    </w:p>
+    <w:p>
+      <w:pPr>
+        <w:pStyle w:val="FirstParagraph"/>
+      </w:pPr>
+      <w:r>
+        <w:t xml:space="preserve">h3</w:t>
+      </w:r>
+      <w:r>
+        <w:t xml:space="preserve"> </w:t>
+      </w:r>
+      <w:r>
+        <w:t xml:space="preserve">{</w:t>
+      </w:r>
+      <w:r>
+        <w:t xml:space="preserve"> </w:t>
+      </w:r>
+      <w:r>
+        <w:t xml:space="preserve">text-align: left;</w:t>
+      </w:r>
+      <w:r>
+        <w:t xml:space="preserve"> </w:t>
+      </w:r>
+      <w:r>
+        <w:t xml:space="preserve">}</w:t>
+      </w:r>
     </w:p>
     <w:bookmarkStart w:id="33" w:name="refs"/>
     <w:bookmarkStart w:id="31" w:name="ref-colton_design_2010"/>

</xml_diff>